<commit_message>
Update Theory and Operations Primer to v1.2 (docx + pdf)
</commit_message>
<xml_diff>
--- a/docs/APRS_Theory_and_Operations_Primer.docx
+++ b/docs/APRS_Theory_and_Operations_Primer.docx
@@ -467,7 +467,7 @@
                 <w:sz w:val="22"/>
                 <w:szCs w:val="22"/>
               </w:rPr>
-              <w:t xml:space="preserve">1.0  ·  July 2026</w:t>
+              <w:t xml:space="preserve">1.2  ·  Updated July 27, 2026  ·  Applies to v0.5.0-alpha</w:t>
             </w:r>
           </w:p>
         </w:tc>
@@ -5443,7 +5443,7 @@
                 <w:sz w:val="21"/>
                 <w:szCs w:val="21"/>
               </w:rPr>
-              <w:t xml:space="preserve">Australia / New Zealand</w:t>
+              <w:t xml:space="preserve">Australia</w:t>
             </w:r>
           </w:p>
         </w:tc>
@@ -12919,7 +12919,7 @@
           <w:sz w:val="22"/>
           <w:szCs w:val="22"/>
         </w:rPr>
-        <w:t xml:space="preserve">The theoretical channel capacity of the 1200 baud APRS channel is approximately 18,000 bits per second. Each average APRS position packet (including AX.25 overhead and preamble) occupies approximately 0.3–0.5 seconds of channel time. This limits the practical sustainable throughput to roughly 60–120 unique station beacons per minute across the entire coverage area of a digipeater.</w:t>
+        <w:t xml:space="preserve">The theoretical channel capacity of the 1200 baud APRS channel is, by definition, approximately 1200 bits per second. Each average APRS position packet (including AX.25 overhead and preamble) occupies approximately 0.3–0.5 seconds of channel time. This limits the practical sustainable throughput to roughly 60–120 unique station beacons per minute across the entire coverage area of a digipeater.</w:t>
       </w:r>
     </w:p>
     <w:p>
@@ -16249,31 +16249,32 @@
               <w:bottom w:val="single" w:color="D0D8E0" w:sz="2"/>
               <w:right w:val="none"/>
             </w:tcBorders>
-            <w:tcMar>
-              <w:top w:type="dxa" w:w="100"/>
-              <w:left w:type="dxa" w:w="160"/>
-              <w:bottom w:type="dxa" w:w="100"/>
-              <w:right w:type="dxa" w:w="160"/>
-            </w:tcMar>
-          </w:tcPr>
-          <w:p>
-            <w:pPr>
-              <w:keepNext w:val="false"/>
-              <w:spacing w:after="0" w:before="0" w:line="276" w:lineRule="auto"/>
-              <w:jc w:val="left"/>
-            </w:pPr>
-            <w:r>
-              <w:rPr>
-                <w:rFonts w:ascii="Calibri" w:cs="Calibri" w:eastAsia="Calibri" w:hAnsi="Calibri"/>
-                <w:b w:val="false"/>
-                <w:bCs w:val="false"/>
-                <w:i w:val="false"/>
-                <w:iCs w:val="false"/>
-                <w:color w:val="1A1A1A"/>
-                <w:sz w:val="21"/>
-                <w:szCs w:val="21"/>
-              </w:rPr>
-              <w:t xml:space="preserve">80 meters</w:t>
+            <w:shd w:fill="F4F6F8" w:color="auto" w:val="clear"/>
+            <w:tcMar>
+              <w:top w:type="dxa" w:w="100"/>
+              <w:left w:type="dxa" w:w="160"/>
+              <w:bottom w:type="dxa" w:w="100"/>
+              <w:right w:type="dxa" w:w="160"/>
+            </w:tcMar>
+          </w:tcPr>
+          <w:p>
+            <w:pPr>
+              <w:keepNext w:val="false"/>
+              <w:spacing w:after="0" w:before="0" w:line="276" w:lineRule="auto"/>
+              <w:jc w:val="left"/>
+            </w:pPr>
+            <w:r>
+              <w:rPr>
+                <w:rFonts w:ascii="Calibri" w:cs="Calibri" w:eastAsia="Calibri" w:hAnsi="Calibri"/>
+                <w:b w:val="false"/>
+                <w:bCs w:val="false"/>
+                <w:i w:val="false"/>
+                <w:iCs w:val="false"/>
+                <w:color w:val="1A1A1A"/>
+                <w:sz w:val="21"/>
+                <w:szCs w:val="21"/>
+              </w:rPr>
+              <w:t xml:space="preserve">40 meters</w:t>
             </w:r>
           </w:p>
         </w:tc>
@@ -16286,31 +16287,32 @@
               <w:bottom w:val="single" w:color="D0D8E0" w:sz="2"/>
               <w:right w:val="none"/>
             </w:tcBorders>
-            <w:tcMar>
-              <w:top w:type="dxa" w:w="100"/>
-              <w:left w:type="dxa" w:w="160"/>
-              <w:bottom w:type="dxa" w:w="100"/>
-              <w:right w:type="dxa" w:w="160"/>
-            </w:tcMar>
-          </w:tcPr>
-          <w:p>
-            <w:pPr>
-              <w:keepNext w:val="false"/>
-              <w:spacing w:after="0" w:before="0" w:line="276" w:lineRule="auto"/>
-              <w:jc w:val="left"/>
-            </w:pPr>
-            <w:r>
-              <w:rPr>
-                <w:rFonts w:ascii="Calibri" w:cs="Calibri" w:eastAsia="Calibri" w:hAnsi="Calibri"/>
-                <w:b w:val="false"/>
-                <w:bCs w:val="false"/>
-                <w:i w:val="false"/>
-                <w:iCs w:val="false"/>
-                <w:color w:val="1A1A1A"/>
-                <w:sz w:val="21"/>
-                <w:szCs w:val="21"/>
-              </w:rPr>
-              <w:t xml:space="preserve">3.632.5 MHz (USB)</w:t>
+            <w:shd w:fill="F4F6F8" w:color="auto" w:val="clear"/>
+            <w:tcMar>
+              <w:top w:type="dxa" w:w="100"/>
+              <w:left w:type="dxa" w:w="160"/>
+              <w:bottom w:type="dxa" w:w="100"/>
+              <w:right w:type="dxa" w:w="160"/>
+            </w:tcMar>
+          </w:tcPr>
+          <w:p>
+            <w:pPr>
+              <w:keepNext w:val="false"/>
+              <w:spacing w:after="0" w:before="0" w:line="276" w:lineRule="auto"/>
+              <w:jc w:val="left"/>
+            </w:pPr>
+            <w:r>
+              <w:rPr>
+                <w:rFonts w:ascii="Calibri" w:cs="Calibri" w:eastAsia="Calibri" w:hAnsi="Calibri"/>
+                <w:b w:val="false"/>
+                <w:bCs w:val="false"/>
+                <w:i w:val="false"/>
+                <w:iCs w:val="false"/>
+                <w:color w:val="1A1A1A"/>
+                <w:sz w:val="21"/>
+                <w:szCs w:val="21"/>
+              </w:rPr>
+              <w:t xml:space="preserve">7.083.5 MHz (USB)</w:t>
             </w:r>
           </w:p>
         </w:tc>
@@ -16323,31 +16325,32 @@
               <w:bottom w:val="single" w:color="D0D8E0" w:sz="2"/>
               <w:right w:val="none"/>
             </w:tcBorders>
-            <w:tcMar>
-              <w:top w:type="dxa" w:w="100"/>
-              <w:left w:type="dxa" w:w="160"/>
-              <w:bottom w:type="dxa" w:w="100"/>
-              <w:right w:type="dxa" w:w="160"/>
-            </w:tcMar>
-          </w:tcPr>
-          <w:p>
-            <w:pPr>
-              <w:keepNext w:val="false"/>
-              <w:spacing w:after="0" w:before="0" w:line="276" w:lineRule="auto"/>
-              <w:jc w:val="left"/>
-            </w:pPr>
-            <w:r>
-              <w:rPr>
-                <w:rFonts w:ascii="Calibri" w:cs="Calibri" w:eastAsia="Calibri" w:hAnsi="Calibri"/>
-                <w:b w:val="false"/>
-                <w:bCs w:val="false"/>
-                <w:i w:val="false"/>
-                <w:iCs w:val="false"/>
-                <w:color w:val="1A1A1A"/>
-                <w:sz w:val="21"/>
-                <w:szCs w:val="21"/>
-              </w:rPr>
-              <w:t xml:space="preserve">Regional; useful for Eastern US night coverage</w:t>
+            <w:shd w:fill="F4F6F8" w:color="auto" w:val="clear"/>
+            <w:tcMar>
+              <w:top w:type="dxa" w:w="100"/>
+              <w:left w:type="dxa" w:w="160"/>
+              <w:bottom w:type="dxa" w:w="100"/>
+              <w:right w:type="dxa" w:w="160"/>
+            </w:tcMar>
+          </w:tcPr>
+          <w:p>
+            <w:pPr>
+              <w:keepNext w:val="false"/>
+              <w:spacing w:after="0" w:before="0" w:line="276" w:lineRule="auto"/>
+              <w:jc w:val="left"/>
+            </w:pPr>
+            <w:r>
+              <w:rPr>
+                <w:rFonts w:ascii="Calibri" w:cs="Calibri" w:eastAsia="Calibri" w:hAnsi="Calibri"/>
+                <w:b w:val="false"/>
+                <w:bCs w:val="false"/>
+                <w:i w:val="false"/>
+                <w:iCs w:val="false"/>
+                <w:color w:val="1A1A1A"/>
+                <w:sz w:val="21"/>
+                <w:szCs w:val="21"/>
+              </w:rPr>
+              <w:t xml:space="preserve">Most commonly used HF APRS frequency. Good continental coverage.</w:t>
             </w:r>
           </w:p>
         </w:tc>
@@ -16362,32 +16365,31 @@
               <w:bottom w:val="single" w:color="D0D8E0" w:sz="2"/>
               <w:right w:val="none"/>
             </w:tcBorders>
-            <w:shd w:fill="F4F6F8" w:color="auto" w:val="clear"/>
-            <w:tcMar>
-              <w:top w:type="dxa" w:w="100"/>
-              <w:left w:type="dxa" w:w="160"/>
-              <w:bottom w:type="dxa" w:w="100"/>
-              <w:right w:type="dxa" w:w="160"/>
-            </w:tcMar>
-          </w:tcPr>
-          <w:p>
-            <w:pPr>
-              <w:keepNext w:val="false"/>
-              <w:spacing w:after="0" w:before="0" w:line="276" w:lineRule="auto"/>
-              <w:jc w:val="left"/>
-            </w:pPr>
-            <w:r>
-              <w:rPr>
-                <w:rFonts w:ascii="Calibri" w:cs="Calibri" w:eastAsia="Calibri" w:hAnsi="Calibri"/>
-                <w:b w:val="false"/>
-                <w:bCs w:val="false"/>
-                <w:i w:val="false"/>
-                <w:iCs w:val="false"/>
-                <w:color w:val="1A1A1A"/>
-                <w:sz w:val="21"/>
-                <w:szCs w:val="21"/>
-              </w:rPr>
-              <w:t xml:space="preserve">40 meters</w:t>
+            <w:tcMar>
+              <w:top w:type="dxa" w:w="100"/>
+              <w:left w:type="dxa" w:w="160"/>
+              <w:bottom w:type="dxa" w:w="100"/>
+              <w:right w:type="dxa" w:w="160"/>
+            </w:tcMar>
+          </w:tcPr>
+          <w:p>
+            <w:pPr>
+              <w:keepNext w:val="false"/>
+              <w:spacing w:after="0" w:before="0" w:line="276" w:lineRule="auto"/>
+              <w:jc w:val="left"/>
+            </w:pPr>
+            <w:r>
+              <w:rPr>
+                <w:rFonts w:ascii="Calibri" w:cs="Calibri" w:eastAsia="Calibri" w:hAnsi="Calibri"/>
+                <w:b w:val="false"/>
+                <w:bCs w:val="false"/>
+                <w:i w:val="false"/>
+                <w:iCs w:val="false"/>
+                <w:color w:val="1A1A1A"/>
+                <w:sz w:val="21"/>
+                <w:szCs w:val="21"/>
+              </w:rPr>
+              <w:t xml:space="preserve">30 meters</w:t>
             </w:r>
           </w:p>
         </w:tc>
@@ -16400,32 +16402,31 @@
               <w:bottom w:val="single" w:color="D0D8E0" w:sz="2"/>
               <w:right w:val="none"/>
             </w:tcBorders>
-            <w:shd w:fill="F4F6F8" w:color="auto" w:val="clear"/>
-            <w:tcMar>
-              <w:top w:type="dxa" w:w="100"/>
-              <w:left w:type="dxa" w:w="160"/>
-              <w:bottom w:type="dxa" w:w="100"/>
-              <w:right w:type="dxa" w:w="160"/>
-            </w:tcMar>
-          </w:tcPr>
-          <w:p>
-            <w:pPr>
-              <w:keepNext w:val="false"/>
-              <w:spacing w:after="0" w:before="0" w:line="276" w:lineRule="auto"/>
-              <w:jc w:val="left"/>
-            </w:pPr>
-            <w:r>
-              <w:rPr>
-                <w:rFonts w:ascii="Calibri" w:cs="Calibri" w:eastAsia="Calibri" w:hAnsi="Calibri"/>
-                <w:b w:val="false"/>
-                <w:bCs w:val="false"/>
-                <w:i w:val="false"/>
-                <w:iCs w:val="false"/>
-                <w:color w:val="1A1A1A"/>
-                <w:sz w:val="21"/>
-                <w:szCs w:val="21"/>
-              </w:rPr>
-              <w:t xml:space="preserve">10.151.5 MHz (USB)</w:t>
+            <w:tcMar>
+              <w:top w:type="dxa" w:w="100"/>
+              <w:left w:type="dxa" w:w="160"/>
+              <w:bottom w:type="dxa" w:w="100"/>
+              <w:right w:type="dxa" w:w="160"/>
+            </w:tcMar>
+          </w:tcPr>
+          <w:p>
+            <w:pPr>
+              <w:keepNext w:val="false"/>
+              <w:spacing w:after="0" w:before="0" w:line="276" w:lineRule="auto"/>
+              <w:jc w:val="left"/>
+            </w:pPr>
+            <w:r>
+              <w:rPr>
+                <w:rFonts w:ascii="Calibri" w:cs="Calibri" w:eastAsia="Calibri" w:hAnsi="Calibri"/>
+                <w:b w:val="false"/>
+                <w:bCs w:val="false"/>
+                <w:i w:val="false"/>
+                <w:iCs w:val="false"/>
+                <w:color w:val="1A1A1A"/>
+                <w:sz w:val="21"/>
+                <w:szCs w:val="21"/>
+              </w:rPr>
+              <w:t xml:space="preserve">10.1476 MHz (USB)</w:t>
             </w:r>
           </w:p>
         </w:tc>
@@ -16438,32 +16439,31 @@
               <w:bottom w:val="single" w:color="D0D8E0" w:sz="2"/>
               <w:right w:val="none"/>
             </w:tcBorders>
-            <w:shd w:fill="F4F6F8" w:color="auto" w:val="clear"/>
-            <w:tcMar>
-              <w:top w:type="dxa" w:w="100"/>
-              <w:left w:type="dxa" w:w="160"/>
-              <w:bottom w:type="dxa" w:w="100"/>
-              <w:right w:type="dxa" w:w="160"/>
-            </w:tcMar>
-          </w:tcPr>
-          <w:p>
-            <w:pPr>
-              <w:keepNext w:val="false"/>
-              <w:spacing w:after="0" w:before="0" w:line="276" w:lineRule="auto"/>
-              <w:jc w:val="left"/>
-            </w:pPr>
-            <w:r>
-              <w:rPr>
-                <w:rFonts w:ascii="Calibri" w:cs="Calibri" w:eastAsia="Calibri" w:hAnsi="Calibri"/>
-                <w:b w:val="false"/>
-                <w:bCs w:val="false"/>
-                <w:i w:val="false"/>
-                <w:iCs w:val="false"/>
-                <w:color w:val="1A1A1A"/>
-                <w:sz w:val="21"/>
-                <w:szCs w:val="21"/>
-              </w:rPr>
-              <w:t xml:space="preserve">Most commonly used HF APRS frequency. Good continental coverage.</w:t>
+            <w:tcMar>
+              <w:top w:type="dxa" w:w="100"/>
+              <w:left w:type="dxa" w:w="160"/>
+              <w:bottom w:type="dxa" w:w="100"/>
+              <w:right w:type="dxa" w:w="160"/>
+            </w:tcMar>
+          </w:tcPr>
+          <w:p>
+            <w:pPr>
+              <w:keepNext w:val="false"/>
+              <w:spacing w:after="0" w:before="0" w:line="276" w:lineRule="auto"/>
+              <w:jc w:val="left"/>
+            </w:pPr>
+            <w:r>
+              <w:rPr>
+                <w:rFonts w:ascii="Calibri" w:cs="Calibri" w:eastAsia="Calibri" w:hAnsi="Calibri"/>
+                <w:b w:val="false"/>
+                <w:bCs w:val="false"/>
+                <w:i w:val="false"/>
+                <w:iCs w:val="false"/>
+                <w:color w:val="1A1A1A"/>
+                <w:sz w:val="21"/>
+                <w:szCs w:val="21"/>
+              </w:rPr>
+              <w:t xml:space="preserve">Shared with 40m in some regions; check local band plans</w:t>
             </w:r>
           </w:p>
         </w:tc>
@@ -16478,31 +16478,32 @@
               <w:bottom w:val="single" w:color="D0D8E0" w:sz="2"/>
               <w:right w:val="none"/>
             </w:tcBorders>
-            <w:tcMar>
-              <w:top w:type="dxa" w:w="100"/>
-              <w:left w:type="dxa" w:w="160"/>
-              <w:bottom w:type="dxa" w:w="100"/>
-              <w:right w:type="dxa" w:w="160"/>
-            </w:tcMar>
-          </w:tcPr>
-          <w:p>
-            <w:pPr>
-              <w:keepNext w:val="false"/>
-              <w:spacing w:after="0" w:before="0" w:line="276" w:lineRule="auto"/>
-              <w:jc w:val="left"/>
-            </w:pPr>
-            <w:r>
-              <w:rPr>
-                <w:rFonts w:ascii="Calibri" w:cs="Calibri" w:eastAsia="Calibri" w:hAnsi="Calibri"/>
-                <w:b w:val="false"/>
-                <w:bCs w:val="false"/>
-                <w:i w:val="false"/>
-                <w:iCs w:val="false"/>
-                <w:color w:val="1A1A1A"/>
-                <w:sz w:val="21"/>
-                <w:szCs w:val="21"/>
-              </w:rPr>
-              <w:t xml:space="preserve">30 meters</w:t>
+            <w:shd w:fill="F4F6F8" w:color="auto" w:val="clear"/>
+            <w:tcMar>
+              <w:top w:type="dxa" w:w="100"/>
+              <w:left w:type="dxa" w:w="160"/>
+              <w:bottom w:type="dxa" w:w="100"/>
+              <w:right w:type="dxa" w:w="160"/>
+            </w:tcMar>
+          </w:tcPr>
+          <w:p>
+            <w:pPr>
+              <w:keepNext w:val="false"/>
+              <w:spacing w:after="0" w:before="0" w:line="276" w:lineRule="auto"/>
+              <w:jc w:val="left"/>
+            </w:pPr>
+            <w:r>
+              <w:rPr>
+                <w:rFonts w:ascii="Calibri" w:cs="Calibri" w:eastAsia="Calibri" w:hAnsi="Calibri"/>
+                <w:b w:val="false"/>
+                <w:bCs w:val="false"/>
+                <w:i w:val="false"/>
+                <w:iCs w:val="false"/>
+                <w:color w:val="1A1A1A"/>
+                <w:sz w:val="21"/>
+                <w:szCs w:val="21"/>
+              </w:rPr>
+              <w:t xml:space="preserve">20 meters</w:t>
             </w:r>
           </w:p>
         </w:tc>
@@ -16515,31 +16516,32 @@
               <w:bottom w:val="single" w:color="D0D8E0" w:sz="2"/>
               <w:right w:val="none"/>
             </w:tcBorders>
-            <w:tcMar>
-              <w:top w:type="dxa" w:w="100"/>
-              <w:left w:type="dxa" w:w="160"/>
-              <w:bottom w:type="dxa" w:w="100"/>
-              <w:right w:type="dxa" w:w="160"/>
-            </w:tcMar>
-          </w:tcPr>
-          <w:p>
-            <w:pPr>
-              <w:keepNext w:val="false"/>
-              <w:spacing w:after="0" w:before="0" w:line="276" w:lineRule="auto"/>
-              <w:jc w:val="left"/>
-            </w:pPr>
-            <w:r>
-              <w:rPr>
-                <w:rFonts w:ascii="Calibri" w:cs="Calibri" w:eastAsia="Calibri" w:hAnsi="Calibri"/>
-                <w:b w:val="false"/>
-                <w:bCs w:val="false"/>
-                <w:i w:val="false"/>
-                <w:iCs w:val="false"/>
-                <w:color w:val="1A1A1A"/>
-                <w:sz w:val="21"/>
-                <w:szCs w:val="21"/>
-              </w:rPr>
-              <w:t xml:space="preserve">10.151.5 MHz (USB)</w:t>
+            <w:shd w:fill="F4F6F8" w:color="auto" w:val="clear"/>
+            <w:tcMar>
+              <w:top w:type="dxa" w:w="100"/>
+              <w:left w:type="dxa" w:w="160"/>
+              <w:bottom w:type="dxa" w:w="100"/>
+              <w:right w:type="dxa" w:w="160"/>
+            </w:tcMar>
+          </w:tcPr>
+          <w:p>
+            <w:pPr>
+              <w:keepNext w:val="false"/>
+              <w:spacing w:after="0" w:before="0" w:line="276" w:lineRule="auto"/>
+              <w:jc w:val="left"/>
+            </w:pPr>
+            <w:r>
+              <w:rPr>
+                <w:rFonts w:ascii="Calibri" w:cs="Calibri" w:eastAsia="Calibri" w:hAnsi="Calibri"/>
+                <w:b w:val="false"/>
+                <w:bCs w:val="false"/>
+                <w:i w:val="false"/>
+                <w:iCs w:val="false"/>
+                <w:color w:val="1A1A1A"/>
+                <w:sz w:val="21"/>
+                <w:szCs w:val="21"/>
+              </w:rPr>
+              <w:t xml:space="preserve">14.103.0 MHz (USB)</w:t>
             </w:r>
           </w:p>
         </w:tc>
@@ -16552,45 +16554,6 @@
               <w:bottom w:val="single" w:color="D0D8E0" w:sz="2"/>
               <w:right w:val="none"/>
             </w:tcBorders>
-            <w:tcMar>
-              <w:top w:type="dxa" w:w="100"/>
-              <w:left w:type="dxa" w:w="160"/>
-              <w:bottom w:type="dxa" w:w="100"/>
-              <w:right w:type="dxa" w:w="160"/>
-            </w:tcMar>
-          </w:tcPr>
-          <w:p>
-            <w:pPr>
-              <w:keepNext w:val="false"/>
-              <w:spacing w:after="0" w:before="0" w:line="276" w:lineRule="auto"/>
-              <w:jc w:val="left"/>
-            </w:pPr>
-            <w:r>
-              <w:rPr>
-                <w:rFonts w:ascii="Calibri" w:cs="Calibri" w:eastAsia="Calibri" w:hAnsi="Calibri"/>
-                <w:b w:val="false"/>
-                <w:bCs w:val="false"/>
-                <w:i w:val="false"/>
-                <w:iCs w:val="false"/>
-                <w:color w:val="1A1A1A"/>
-                <w:sz w:val="21"/>
-                <w:szCs w:val="21"/>
-              </w:rPr>
-              <w:t xml:space="preserve">Shared with 40m in some regions; check local band plans</w:t>
-            </w:r>
-          </w:p>
-        </w:tc>
-      </w:tr>
-      <w:tr>
-        <w:tc>
-          <w:tcPr>
-            <w:tcW w:type="dxa" w:w="1814"/>
-            <w:tcBorders>
-              <w:top w:val="none"/>
-              <w:left w:val="none"/>
-              <w:bottom w:val="single" w:color="D0D8E0" w:sz="2"/>
-              <w:right w:val="none"/>
-            </w:tcBorders>
             <w:shd w:fill="F4F6F8" w:color="auto" w:val="clear"/>
             <w:tcMar>
               <w:top w:type="dxa" w:w="100"/>
@@ -16616,430 +16579,31 @@
                 <w:sz w:val="21"/>
                 <w:szCs w:val="21"/>
               </w:rPr>
-              <w:t xml:space="preserve">20 meters</w:t>
-            </w:r>
-          </w:p>
-        </w:tc>
-        <w:tc>
-          <w:tcPr>
-            <w:tcW w:type="dxa" w:w="2822"/>
-            <w:tcBorders>
-              <w:top w:val="none"/>
-              <w:left w:val="none"/>
-              <w:bottom w:val="single" w:color="D0D8E0" w:sz="2"/>
-              <w:right w:val="none"/>
-            </w:tcBorders>
-            <w:shd w:fill="F4F6F8" w:color="auto" w:val="clear"/>
-            <w:tcMar>
-              <w:top w:type="dxa" w:w="100"/>
-              <w:left w:type="dxa" w:w="160"/>
-              <w:bottom w:type="dxa" w:w="100"/>
-              <w:right w:type="dxa" w:w="160"/>
-            </w:tcMar>
-          </w:tcPr>
-          <w:p>
-            <w:pPr>
-              <w:keepNext w:val="false"/>
-              <w:spacing w:after="0" w:before="0" w:line="276" w:lineRule="auto"/>
-              <w:jc w:val="left"/>
-            </w:pPr>
-            <w:r>
-              <w:rPr>
-                <w:rFonts w:ascii="Calibri" w:cs="Calibri" w:eastAsia="Calibri" w:hAnsi="Calibri"/>
-                <w:b w:val="false"/>
-                <w:bCs w:val="false"/>
-                <w:i w:val="false"/>
-                <w:iCs w:val="false"/>
-                <w:color w:val="1A1A1A"/>
-                <w:sz w:val="21"/>
-                <w:szCs w:val="21"/>
-              </w:rPr>
-              <w:t xml:space="preserve">14.103.0 MHz (USB)</w:t>
-            </w:r>
-          </w:p>
-        </w:tc>
-        <w:tc>
-          <w:tcPr>
-            <w:tcW w:type="dxa" w:w="5443"/>
-            <w:tcBorders>
-              <w:top w:val="none"/>
-              <w:left w:val="none"/>
-              <w:bottom w:val="single" w:color="D0D8E0" w:sz="2"/>
-              <w:right w:val="none"/>
-            </w:tcBorders>
-            <w:shd w:fill="F4F6F8" w:color="auto" w:val="clear"/>
-            <w:tcMar>
-              <w:top w:type="dxa" w:w="100"/>
-              <w:left w:type="dxa" w:w="160"/>
-              <w:bottom w:type="dxa" w:w="100"/>
-              <w:right w:type="dxa" w:w="160"/>
-            </w:tcMar>
-          </w:tcPr>
-          <w:p>
-            <w:pPr>
-              <w:keepNext w:val="false"/>
-              <w:spacing w:after="0" w:before="0" w:line="276" w:lineRule="auto"/>
-              <w:jc w:val="left"/>
-            </w:pPr>
-            <w:r>
-              <w:rPr>
-                <w:rFonts w:ascii="Calibri" w:cs="Calibri" w:eastAsia="Calibri" w:hAnsi="Calibri"/>
-                <w:b w:val="false"/>
-                <w:bCs w:val="false"/>
-                <w:i w:val="false"/>
-                <w:iCs w:val="false"/>
-                <w:color w:val="1A1A1A"/>
-                <w:sz w:val="21"/>
-                <w:szCs w:val="21"/>
-              </w:rPr>
               <w:t xml:space="preserve">Good worldwide daytime propagation</w:t>
-            </w:r>
-          </w:p>
-        </w:tc>
-      </w:tr>
-      <w:tr>
-        <w:tc>
-          <w:tcPr>
-            <w:tcW w:type="dxa" w:w="1814"/>
-            <w:tcBorders>
-              <w:top w:val="none"/>
-              <w:left w:val="none"/>
-              <w:bottom w:val="single" w:color="D0D8E0" w:sz="2"/>
-              <w:right w:val="none"/>
-            </w:tcBorders>
-            <w:tcMar>
-              <w:top w:type="dxa" w:w="100"/>
-              <w:left w:type="dxa" w:w="160"/>
-              <w:bottom w:type="dxa" w:w="100"/>
-              <w:right w:type="dxa" w:w="160"/>
-            </w:tcMar>
-          </w:tcPr>
-          <w:p>
-            <w:pPr>
-              <w:keepNext w:val="false"/>
-              <w:spacing w:after="0" w:before="0" w:line="276" w:lineRule="auto"/>
-              <w:jc w:val="left"/>
-            </w:pPr>
-            <w:r>
-              <w:rPr>
-                <w:rFonts w:ascii="Calibri" w:cs="Calibri" w:eastAsia="Calibri" w:hAnsi="Calibri"/>
-                <w:b w:val="false"/>
-                <w:bCs w:val="false"/>
-                <w:i w:val="false"/>
-                <w:iCs w:val="false"/>
-                <w:color w:val="1A1A1A"/>
-                <w:sz w:val="21"/>
-                <w:szCs w:val="21"/>
-              </w:rPr>
-              <w:t xml:space="preserve">17 meters</w:t>
-            </w:r>
-          </w:p>
-        </w:tc>
-        <w:tc>
-          <w:tcPr>
-            <w:tcW w:type="dxa" w:w="2822"/>
-            <w:tcBorders>
-              <w:top w:val="none"/>
-              <w:left w:val="none"/>
-              <w:bottom w:val="single" w:color="D0D8E0" w:sz="2"/>
-              <w:right w:val="none"/>
-            </w:tcBorders>
-            <w:tcMar>
-              <w:top w:type="dxa" w:w="100"/>
-              <w:left w:type="dxa" w:w="160"/>
-              <w:bottom w:type="dxa" w:w="100"/>
-              <w:right w:type="dxa" w:w="160"/>
-            </w:tcMar>
-          </w:tcPr>
-          <w:p>
-            <w:pPr>
-              <w:keepNext w:val="false"/>
-              <w:spacing w:after="0" w:before="0" w:line="276" w:lineRule="auto"/>
-              <w:jc w:val="left"/>
-            </w:pPr>
-            <w:r>
-              <w:rPr>
-                <w:rFonts w:ascii="Calibri" w:cs="Calibri" w:eastAsia="Calibri" w:hAnsi="Calibri"/>
-                <w:b w:val="false"/>
-                <w:bCs w:val="false"/>
-                <w:i w:val="false"/>
-                <w:iCs w:val="false"/>
-                <w:color w:val="1A1A1A"/>
-                <w:sz w:val="21"/>
-                <w:szCs w:val="21"/>
-              </w:rPr>
-              <w:t xml:space="preserve">18.103.0 MHz (USB)</w:t>
-            </w:r>
-          </w:p>
-        </w:tc>
-        <w:tc>
-          <w:tcPr>
-            <w:tcW w:type="dxa" w:w="5443"/>
-            <w:tcBorders>
-              <w:top w:val="none"/>
-              <w:left w:val="none"/>
-              <w:bottom w:val="single" w:color="D0D8E0" w:sz="2"/>
-              <w:right w:val="none"/>
-            </w:tcBorders>
-            <w:tcMar>
-              <w:top w:type="dxa" w:w="100"/>
-              <w:left w:type="dxa" w:w="160"/>
-              <w:bottom w:type="dxa" w:w="100"/>
-              <w:right w:type="dxa" w:w="160"/>
-            </w:tcMar>
-          </w:tcPr>
-          <w:p>
-            <w:pPr>
-              <w:keepNext w:val="false"/>
-              <w:spacing w:after="0" w:before="0" w:line="276" w:lineRule="auto"/>
-              <w:jc w:val="left"/>
-            </w:pPr>
-            <w:r>
-              <w:rPr>
-                <w:rFonts w:ascii="Calibri" w:cs="Calibri" w:eastAsia="Calibri" w:hAnsi="Calibri"/>
-                <w:b w:val="false"/>
-                <w:bCs w:val="false"/>
-                <w:i w:val="false"/>
-                <w:iCs w:val="false"/>
-                <w:color w:val="1A1A1A"/>
-                <w:sz w:val="21"/>
-                <w:szCs w:val="21"/>
-              </w:rPr>
-              <w:t xml:space="preserve">Less commonly used</w:t>
-            </w:r>
-          </w:p>
-        </w:tc>
-      </w:tr>
-      <w:tr>
-        <w:tc>
-          <w:tcPr>
-            <w:tcW w:type="dxa" w:w="1814"/>
-            <w:tcBorders>
-              <w:top w:val="none"/>
-              <w:left w:val="none"/>
-              <w:bottom w:val="single" w:color="D0D8E0" w:sz="2"/>
-              <w:right w:val="none"/>
-            </w:tcBorders>
-            <w:shd w:fill="F4F6F8" w:color="auto" w:val="clear"/>
-            <w:tcMar>
-              <w:top w:type="dxa" w:w="100"/>
-              <w:left w:type="dxa" w:w="160"/>
-              <w:bottom w:type="dxa" w:w="100"/>
-              <w:right w:type="dxa" w:w="160"/>
-            </w:tcMar>
-          </w:tcPr>
-          <w:p>
-            <w:pPr>
-              <w:keepNext w:val="false"/>
-              <w:spacing w:after="0" w:before="0" w:line="276" w:lineRule="auto"/>
-              <w:jc w:val="left"/>
-            </w:pPr>
-            <w:r>
-              <w:rPr>
-                <w:rFonts w:ascii="Calibri" w:cs="Calibri" w:eastAsia="Calibri" w:hAnsi="Calibri"/>
-                <w:b w:val="false"/>
-                <w:bCs w:val="false"/>
-                <w:i w:val="false"/>
-                <w:iCs w:val="false"/>
-                <w:color w:val="1A1A1A"/>
-                <w:sz w:val="21"/>
-                <w:szCs w:val="21"/>
-              </w:rPr>
-              <w:t xml:space="preserve">15 meters</w:t>
-            </w:r>
-          </w:p>
-        </w:tc>
-        <w:tc>
-          <w:tcPr>
-            <w:tcW w:type="dxa" w:w="2822"/>
-            <w:tcBorders>
-              <w:top w:val="none"/>
-              <w:left w:val="none"/>
-              <w:bottom w:val="single" w:color="D0D8E0" w:sz="2"/>
-              <w:right w:val="none"/>
-            </w:tcBorders>
-            <w:shd w:fill="F4F6F8" w:color="auto" w:val="clear"/>
-            <w:tcMar>
-              <w:top w:type="dxa" w:w="100"/>
-              <w:left w:type="dxa" w:w="160"/>
-              <w:bottom w:type="dxa" w:w="100"/>
-              <w:right w:type="dxa" w:w="160"/>
-            </w:tcMar>
-          </w:tcPr>
-          <w:p>
-            <w:pPr>
-              <w:keepNext w:val="false"/>
-              <w:spacing w:after="0" w:before="0" w:line="276" w:lineRule="auto"/>
-              <w:jc w:val="left"/>
-            </w:pPr>
-            <w:r>
-              <w:rPr>
-                <w:rFonts w:ascii="Calibri" w:cs="Calibri" w:eastAsia="Calibri" w:hAnsi="Calibri"/>
-                <w:b w:val="false"/>
-                <w:bCs w:val="false"/>
-                <w:i w:val="false"/>
-                <w:iCs w:val="false"/>
-                <w:color w:val="1A1A1A"/>
-                <w:sz w:val="21"/>
-                <w:szCs w:val="21"/>
-              </w:rPr>
-              <w:t xml:space="preserve">21.112.0 MHz (USB)</w:t>
-            </w:r>
-          </w:p>
-        </w:tc>
-        <w:tc>
-          <w:tcPr>
-            <w:tcW w:type="dxa" w:w="5443"/>
-            <w:tcBorders>
-              <w:top w:val="none"/>
-              <w:left w:val="none"/>
-              <w:bottom w:val="single" w:color="D0D8E0" w:sz="2"/>
-              <w:right w:val="none"/>
-            </w:tcBorders>
-            <w:shd w:fill="F4F6F8" w:color="auto" w:val="clear"/>
-            <w:tcMar>
-              <w:top w:type="dxa" w:w="100"/>
-              <w:left w:type="dxa" w:w="160"/>
-              <w:bottom w:type="dxa" w:w="100"/>
-              <w:right w:type="dxa" w:w="160"/>
-            </w:tcMar>
-          </w:tcPr>
-          <w:p>
-            <w:pPr>
-              <w:keepNext w:val="false"/>
-              <w:spacing w:after="0" w:before="0" w:line="276" w:lineRule="auto"/>
-              <w:jc w:val="left"/>
-            </w:pPr>
-            <w:r>
-              <w:rPr>
-                <w:rFonts w:ascii="Calibri" w:cs="Calibri" w:eastAsia="Calibri" w:hAnsi="Calibri"/>
-                <w:b w:val="false"/>
-                <w:bCs w:val="false"/>
-                <w:i w:val="false"/>
-                <w:iCs w:val="false"/>
-                <w:color w:val="1A1A1A"/>
-                <w:sz w:val="21"/>
-                <w:szCs w:val="21"/>
-              </w:rPr>
-              <w:t xml:space="preserve">Good daytime propagation when open</w:t>
-            </w:r>
-          </w:p>
-        </w:tc>
-      </w:tr>
-      <w:tr>
-        <w:tc>
-          <w:tcPr>
-            <w:tcW w:type="dxa" w:w="1814"/>
-            <w:tcBorders>
-              <w:top w:val="none"/>
-              <w:left w:val="none"/>
-              <w:bottom w:val="single" w:color="D0D8E0" w:sz="2"/>
-              <w:right w:val="none"/>
-            </w:tcBorders>
-            <w:tcMar>
-              <w:top w:type="dxa" w:w="100"/>
-              <w:left w:type="dxa" w:w="160"/>
-              <w:bottom w:type="dxa" w:w="100"/>
-              <w:right w:type="dxa" w:w="160"/>
-            </w:tcMar>
-          </w:tcPr>
-          <w:p>
-            <w:pPr>
-              <w:keepNext w:val="false"/>
-              <w:spacing w:after="0" w:before="0" w:line="276" w:lineRule="auto"/>
-              <w:jc w:val="left"/>
-            </w:pPr>
-            <w:r>
-              <w:rPr>
-                <w:rFonts w:ascii="Calibri" w:cs="Calibri" w:eastAsia="Calibri" w:hAnsi="Calibri"/>
-                <w:b w:val="false"/>
-                <w:bCs w:val="false"/>
-                <w:i w:val="false"/>
-                <w:iCs w:val="false"/>
-                <w:color w:val="1A1A1A"/>
-                <w:sz w:val="21"/>
-                <w:szCs w:val="21"/>
-              </w:rPr>
-              <w:t xml:space="preserve">10 meters</w:t>
-            </w:r>
-          </w:p>
-        </w:tc>
-        <w:tc>
-          <w:tcPr>
-            <w:tcW w:type="dxa" w:w="2822"/>
-            <w:tcBorders>
-              <w:top w:val="none"/>
-              <w:left w:val="none"/>
-              <w:bottom w:val="single" w:color="D0D8E0" w:sz="2"/>
-              <w:right w:val="none"/>
-            </w:tcBorders>
-            <w:tcMar>
-              <w:top w:type="dxa" w:w="100"/>
-              <w:left w:type="dxa" w:w="160"/>
-              <w:bottom w:type="dxa" w:w="100"/>
-              <w:right w:type="dxa" w:w="160"/>
-            </w:tcMar>
-          </w:tcPr>
-          <w:p>
-            <w:pPr>
-              <w:keepNext w:val="false"/>
-              <w:spacing w:after="0" w:before="0" w:line="276" w:lineRule="auto"/>
-              <w:jc w:val="left"/>
-            </w:pPr>
-            <w:r>
-              <w:rPr>
-                <w:rFonts w:ascii="Calibri" w:cs="Calibri" w:eastAsia="Calibri" w:hAnsi="Calibri"/>
-                <w:b w:val="false"/>
-                <w:bCs w:val="false"/>
-                <w:i w:val="false"/>
-                <w:iCs w:val="false"/>
-                <w:color w:val="1A1A1A"/>
-                <w:sz w:val="21"/>
-                <w:szCs w:val="21"/>
-              </w:rPr>
-              <w:t xml:space="preserve">28.113.0 MHz (USB)</w:t>
-            </w:r>
-          </w:p>
-        </w:tc>
-        <w:tc>
-          <w:tcPr>
-            <w:tcW w:type="dxa" w:w="5443"/>
-            <w:tcBorders>
-              <w:top w:val="none"/>
-              <w:left w:val="none"/>
-              <w:bottom w:val="single" w:color="D0D8E0" w:sz="2"/>
-              <w:right w:val="none"/>
-            </w:tcBorders>
-            <w:tcMar>
-              <w:top w:type="dxa" w:w="100"/>
-              <w:left w:type="dxa" w:w="160"/>
-              <w:bottom w:type="dxa" w:w="100"/>
-              <w:right w:type="dxa" w:w="160"/>
-            </w:tcMar>
-          </w:tcPr>
-          <w:p>
-            <w:pPr>
-              <w:keepNext w:val="false"/>
-              <w:spacing w:after="0" w:before="0" w:line="276" w:lineRule="auto"/>
-              <w:jc w:val="left"/>
-            </w:pPr>
-            <w:r>
-              <w:rPr>
-                <w:rFonts w:ascii="Calibri" w:cs="Calibri" w:eastAsia="Calibri" w:hAnsi="Calibri"/>
-                <w:b w:val="false"/>
-                <w:bCs w:val="false"/>
-                <w:i w:val="false"/>
-                <w:iCs w:val="false"/>
-                <w:color w:val="1A1A1A"/>
-                <w:sz w:val="21"/>
-                <w:szCs w:val="21"/>
-              </w:rPr>
-              <w:t xml:space="preserve">Excellent range when the band is open; unreliable otherwise</w:t>
             </w:r>
           </w:p>
         </w:tc>
       </w:tr>
     </w:tbl>
+    <w:p>
+      <w:pPr>
+        <w:spacing w:after="120" w:before="80" w:line="276" w:lineRule="auto"/>
+        <w:jc w:val="left"/>
+      </w:pPr>
+      <w:r>
+        <w:rPr>
+          <w:rFonts w:ascii="Calibri" w:cs="Calibri" w:eastAsia="Calibri" w:hAnsi="Calibri"/>
+          <w:b w:val="false"/>
+          <w:bCs w:val="false"/>
+          <w:i/>
+          <w:iCs/>
+          <w:color w:val="4A4A4A"/>
+          <w:sz w:val="20"/>
+          <w:szCs w:val="20"/>
+        </w:rPr>
+        <w:t xml:space="preserve">30 meters is the global standard for HF APRS and where the large majority of activity is found. 40 meters and 20 meters (above) also see regular, established use. HF APRS has occasionally been reported on 80 meters and 10 meters as well, but without a single settled standard frequency for either — check current regional practice before operating there.</w:t>
+      </w:r>
+    </w:p>
     <w:p>
       <w:pPr>
         <w:keepNext w:val="false"/>
@@ -20078,7 +19642,7 @@
           <w:sz w:val="22"/>
           <w:szCs w:val="22"/>
         </w:rPr>
-        <w:t xml:space="preserve">Area objects are a special APRS extension that encodes a geometric shape (circle, rectangle, triangle, or line) in the comment field of an object packet. The shape is rendered as a drawn area on APRS clients that support area objects. They are used to mark geographic zones — incident perimeters, evacuation areas, coverage boundaries, and event zones.</w:t>
+        <w:t xml:space="preserve">Area objects are a special APRS extension that encodes a geometric shape (circle, line, ellipse, triangle, or box) in an object packet, drawn using the lowercase "l" symbol from the Alternate Symbol Table. The shape is rendered as a drawn area on APRS clients that support area objects. They are used to mark geographic zones — incident perimeters, evacuation areas, coverage boundaries, and event zones.</w:t>
       </w:r>
     </w:p>
     <w:p>
@@ -20098,7 +19662,7 @@
           <w:sz w:val="22"/>
           <w:szCs w:val="22"/>
         </w:rPr>
-        <w:t xml:space="preserve">The area object encoding format (per APRS Protocol Reference §11) is:</w:t>
+        <w:t xml:space="preserve">The area object encoding format (per APRS Protocol Reference §11, corrected per the aprs11 errata) is a 7-character extension immediately following the area symbol:</w:t>
       </w:r>
     </w:p>
     <w:p>
@@ -20118,7 +19682,7 @@
           <w:sz w:val="20"/>
           <w:szCs w:val="20"/>
         </w:rPr>
-        <w:t xml:space="preserve">/A{Shape}{Color}{Width}/{Height}</w:t>
+        <w:t xml:space="preserve">Tyy/Cxx</w:t>
       </w:r>
     </w:p>
     <w:p>
@@ -20138,7 +19702,7 @@
           <w:sz w:val="22"/>
           <w:szCs w:val="22"/>
         </w:rPr>
-        <w:t xml:space="preserve">The width and height are in tenths of kilometers, zero-padded to three digits. A circle with radius 5 km would encode as width=050 and height=050.</w:t>
+        <w:t xml:space="preserve">T is the shape type code (for example, an open or color-filled circle, line, ellipse, triangle, or box) and C is the color code. The yy and xx values are not a simple linear width and height — each encodes the corresponding offset in degrees using yy = √(offset_in_degrees ÷ 1500), so the receiving software reverses it with offset_in_degrees = (encoded_value)² × 1500. This square-root scaling lets a two-character field represent sizes ranging from about 60 feet to 100 miles with reasonable precision at both ends. Most modern APRS software builds this encoding automatically — you do not need to compute it by hand — but understanding the format helps when troubleshooting why an area object isn't appearing at the expected size.</w:t>
       </w:r>
     </w:p>
     <w:tbl>
@@ -25125,7 +24689,7 @@
                 <w:sz w:val="21"/>
                 <w:szCs w:val="21"/>
               </w:rPr>
-              <w:t xml:space="preserve">10.151.5 MHz (USB)</w:t>
+              <w:t xml:space="preserve">7.083.5 MHz (USB)</w:t>
             </w:r>
           </w:p>
         </w:tc>
@@ -25277,7 +24841,7 @@
                 <w:sz w:val="21"/>
                 <w:szCs w:val="21"/>
               </w:rPr>
-              <w:t xml:space="preserve">10.151.5 MHz (USB)</w:t>
+              <w:t xml:space="preserve">10.1476 MHz (USB)</w:t>
             </w:r>
           </w:p>
         </w:tc>
@@ -25504,160 +25068,6 @@
                 <w:szCs w:val="21"/>
               </w:rPr>
               <w:t xml:space="preserve">Good daytime propagation worldwide</w:t>
-            </w:r>
-          </w:p>
-        </w:tc>
-      </w:tr>
-      <w:tr>
-        <w:tc>
-          <w:tcPr>
-            <w:tcW w:type="dxa" w:w="2822"/>
-            <w:tcBorders>
-              <w:top w:val="none"/>
-              <w:left w:val="none"/>
-              <w:bottom w:val="single" w:color="D0D8E0" w:sz="2"/>
-              <w:right w:val="none"/>
-            </w:tcBorders>
-            <w:shd w:fill="F4F6F8" w:color="auto" w:val="clear"/>
-            <w:tcMar>
-              <w:top w:type="dxa" w:w="100"/>
-              <w:left w:type="dxa" w:w="160"/>
-              <w:bottom w:type="dxa" w:w="100"/>
-              <w:right w:type="dxa" w:w="160"/>
-            </w:tcMar>
-          </w:tcPr>
-          <w:p>
-            <w:pPr>
-              <w:keepNext w:val="false"/>
-              <w:spacing w:after="0" w:before="0" w:line="276" w:lineRule="auto"/>
-              <w:jc w:val="left"/>
-            </w:pPr>
-            <w:r>
-              <w:rPr>
-                <w:rFonts w:ascii="Calibri" w:cs="Calibri" w:eastAsia="Calibri" w:hAnsi="Calibri"/>
-                <w:b w:val="false"/>
-                <w:bCs w:val="false"/>
-                <w:i w:val="false"/>
-                <w:iCs w:val="false"/>
-                <w:color w:val="1A1A1A"/>
-                <w:sz w:val="21"/>
-                <w:szCs w:val="21"/>
-              </w:rPr>
-              <w:t xml:space="preserve">HF (80m) Regional</w:t>
-            </w:r>
-          </w:p>
-        </w:tc>
-        <w:tc>
-          <w:tcPr>
-            <w:tcW w:type="dxa" w:w="2016"/>
-            <w:tcBorders>
-              <w:top w:val="none"/>
-              <w:left w:val="none"/>
-              <w:bottom w:val="single" w:color="D0D8E0" w:sz="2"/>
-              <w:right w:val="none"/>
-            </w:tcBorders>
-            <w:shd w:fill="F4F6F8" w:color="auto" w:val="clear"/>
-            <w:tcMar>
-              <w:top w:type="dxa" w:w="100"/>
-              <w:left w:type="dxa" w:w="160"/>
-              <w:bottom w:type="dxa" w:w="100"/>
-              <w:right w:type="dxa" w:w="160"/>
-            </w:tcMar>
-          </w:tcPr>
-          <w:p>
-            <w:pPr>
-              <w:keepNext w:val="false"/>
-              <w:spacing w:after="0" w:before="0" w:line="276" w:lineRule="auto"/>
-              <w:jc w:val="left"/>
-            </w:pPr>
-            <w:r>
-              <w:rPr>
-                <w:rFonts w:ascii="Calibri" w:cs="Calibri" w:eastAsia="Calibri" w:hAnsi="Calibri"/>
-                <w:b w:val="false"/>
-                <w:bCs w:val="false"/>
-                <w:i w:val="false"/>
-                <w:iCs w:val="false"/>
-                <w:color w:val="1A1A1A"/>
-                <w:sz w:val="21"/>
-                <w:szCs w:val="21"/>
-              </w:rPr>
-              <w:t xml:space="preserve">3.632.5 MHz (USB)</w:t>
-            </w:r>
-          </w:p>
-        </w:tc>
-        <w:tc>
-          <w:tcPr>
-            <w:tcW w:type="dxa" w:w="2016"/>
-            <w:tcBorders>
-              <w:top w:val="none"/>
-              <w:left w:val="none"/>
-              <w:bottom w:val="single" w:color="D0D8E0" w:sz="2"/>
-              <w:right w:val="none"/>
-            </w:tcBorders>
-            <w:shd w:fill="F4F6F8" w:color="auto" w:val="clear"/>
-            <w:tcMar>
-              <w:top w:type="dxa" w:w="100"/>
-              <w:left w:type="dxa" w:w="160"/>
-              <w:bottom w:type="dxa" w:w="100"/>
-              <w:right w:type="dxa" w:w="160"/>
-            </w:tcMar>
-          </w:tcPr>
-          <w:p>
-            <w:pPr>
-              <w:keepNext w:val="false"/>
-              <w:spacing w:after="0" w:before="0" w:line="276" w:lineRule="auto"/>
-              <w:jc w:val="left"/>
-            </w:pPr>
-            <w:r>
-              <w:rPr>
-                <w:rFonts w:ascii="Calibri" w:cs="Calibri" w:eastAsia="Calibri" w:hAnsi="Calibri"/>
-                <w:b w:val="false"/>
-                <w:bCs w:val="false"/>
-                <w:i w:val="false"/>
-                <w:iCs w:val="false"/>
-                <w:color w:val="1A1A1A"/>
-                <w:sz w:val="21"/>
-                <w:szCs w:val="21"/>
-              </w:rPr>
-              <w:t xml:space="preserve">SSB AFSK 300 baud</w:t>
-            </w:r>
-          </w:p>
-        </w:tc>
-        <w:tc>
-          <w:tcPr>
-            <w:tcW w:type="dxa" w:w="3225"/>
-            <w:tcBorders>
-              <w:top w:val="none"/>
-              <w:left w:val="none"/>
-              <w:bottom w:val="single" w:color="D0D8E0" w:sz="2"/>
-              <w:right w:val="none"/>
-            </w:tcBorders>
-            <w:shd w:fill="F4F6F8" w:color="auto" w:val="clear"/>
-            <w:tcMar>
-              <w:top w:type="dxa" w:w="100"/>
-              <w:left w:type="dxa" w:w="160"/>
-              <w:bottom w:type="dxa" w:w="100"/>
-              <w:right w:type="dxa" w:w="160"/>
-            </w:tcMar>
-          </w:tcPr>
-          <w:p>
-            <w:pPr>
-              <w:keepNext w:val="false"/>
-              <w:spacing w:after="0" w:before="0" w:line="276" w:lineRule="auto"/>
-              <w:jc w:val="left"/>
-            </w:pPr>
-            <w:r>
-              <w:rPr>
-                <w:rFonts w:ascii="Calibri" w:cs="Calibri" w:eastAsia="Calibri" w:hAnsi="Calibri"/>
-                <w:b w:val="false"/>
-                <w:bCs w:val="false"/>
-                <w:i w:val="false"/>
-                <w:iCs w:val="false"/>
-                <w:color w:val="1A1A1A"/>
-                <w:sz w:val="21"/>
-                <w:szCs w:val="21"/>
-              </w:rPr>
-              <w:t xml:space="preserve">Regional; Eastern US night coverage</w:t>
             </w:r>
           </w:p>
         </w:tc>

</xml_diff>

<commit_message>
Codebase hardening: enforce transmit-safety inhibit, fix parser + security issues
- Transmit safety: enforce global inhibit (exercise mode) at the transport
  chokepoint via ITransmitInhibitGate so all TX paths honor it, not just digipeater
- Parser: fix timestamped position-weather symbol offset; case-sensitive ack/rej
- Security: token-gate mobile companion server + drop wildcard CORS; REST API
  fails closed with constant-time token compare
- Transport: fix reconnect stream leak; bound AGWPE frame length
- UI: async command handlers (no UI-thread blocking); surface swallowed errors;
  consolidate duplicate ICommand classes
- Docs: add CLAUDE.md and Decisions Log; ignore Office lock files
Adds 8 tests; full suite 1204 passing, build clean (0 warnings).
Co-Authored-By: Claude Opus 4.8 <noreply@anthropic.com>
</commit_message>
<xml_diff>
--- a/docs/APRS_Theory_and_Operations_Primer.docx
+++ b/docs/APRS_Theory_and_Operations_Primer.docx
@@ -1,6 +1,6 @@
 
 <file path=word/document.xml><?xml version="1.0" encoding="utf-8"?>
-<w:document xmlns:wpc="http://schemas.microsoft.com/office/word/2010/wordprocessingCanvas" xmlns:cx="http://schemas.microsoft.com/office/drawing/2014/chartex" xmlns:cx1="http://schemas.microsoft.com/office/drawing/2015/9/8/chartex" xmlns:cx2="http://schemas.microsoft.com/office/drawing/2015/10/21/chartex" xmlns:cx3="http://schemas.microsoft.com/office/drawing/2016/5/9/chartex" xmlns:cx4="http://schemas.microsoft.com/office/drawing/2016/5/10/chartex" xmlns:cx5="http://schemas.microsoft.com/office/drawing/2016/5/11/chartex" xmlns:cx6="http://schemas.microsoft.com/office/drawing/2016/5/12/chartex" xmlns:cx7="http://schemas.microsoft.com/office/drawing/2016/5/13/chartex" xmlns:cx8="http://schemas.microsoft.com/office/drawing/2016/5/14/chartex" xmlns:mc="http://schemas.openxmlformats.org/markup-compatibility/2006" xmlns:aink="http://schemas.microsoft.com/office/drawing/2016/ink" xmlns:am3d="http://schemas.microsoft.com/office/drawing/2017/model3d" xmlns:o="urn:schemas-microsoft-com:office:office" xmlns:oel="http://schemas.microsoft.com/office/2019/extlst" xmlns:r="http://schemas.openxmlformats.org/officeDocument/2006/relationships" xmlns:m="http://schemas.openxmlformats.org/officeDocument/2006/math" xmlns:v="urn:schemas-microsoft-com:vml" xmlns:wp14="http://schemas.microsoft.com/office/word/2010/wordprocessingDrawing" xmlns:wp="http://schemas.openxmlformats.org/drawingml/2006/wordprocessingDrawing" xmlns:w10="urn:schemas-microsoft-com:office:word" xmlns:w="http://schemas.openxmlformats.org/wordprocessingml/2006/main" xmlns:w14="http://schemas.microsoft.com/office/word/2010/wordml" xmlns:w15="http://schemas.microsoft.com/office/word/2012/wordml" xmlns:w16cex="http://schemas.microsoft.com/office/word/2018/wordml/cex" xmlns:w16cid="http://schemas.microsoft.com/office/word/2016/wordml/cid" xmlns:w16="http://schemas.microsoft.com/office/word/2018/wordml" xmlns:w16du="http://schemas.microsoft.com/office/word/2023/wordml/word16du" xmlns:w16sdtdh="http://schemas.microsoft.com/office/word/2020/wordml/sdtdatahash" xmlns:w16sdtfl="http://schemas.microsoft.com/office/word/2024/wordml/sdtformatlock" xmlns:w16se="http://schemas.microsoft.com/office/word/2015/wordml/symex" xmlns:wpg="http://schemas.microsoft.com/office/word/2010/wordprocessingGroup" xmlns:wpi="http://schemas.microsoft.com/office/word/2010/wordprocessingInk" xmlns:wne="http://schemas.microsoft.com/office/word/2006/wordml" xmlns:wps="http://schemas.microsoft.com/office/word/2010/wordprocessingShape" mc:Ignorable="w14 w15 w16se w16cid w16 w16cex w16sdtdh w16sdtfl w16du wp14">
+<w:document xmlns:wpc="http://schemas.microsoft.com/office/word/2010/wordprocessingCanvas" xmlns:cx="http://schemas.microsoft.com/office/drawing/2014/chartex" xmlns:cx1="http://schemas.microsoft.com/office/drawing/2015/9/8/chartex" xmlns:cx2="http://schemas.microsoft.com/office/drawing/2015/10/21/chartex" xmlns:cx3="http://schemas.microsoft.com/office/drawing/2016/5/9/chartex" xmlns:cx4="http://schemas.microsoft.com/office/drawing/2016/5/10/chartex" xmlns:cx5="http://schemas.microsoft.com/office/drawing/2016/5/11/chartex" xmlns:cx6="http://schemas.microsoft.com/office/drawing/2016/5/12/chartex" xmlns:cx7="http://schemas.microsoft.com/office/drawing/2016/5/13/chartex" xmlns:cx8="http://schemas.microsoft.com/office/drawing/2016/5/14/chartex" xmlns:mc="http://schemas.openxmlformats.org/markup-compatibility/2006" xmlns:aink="http://schemas.microsoft.com/office/drawing/2016/ink" xmlns:am3d="http://schemas.microsoft.com/office/drawing/2017/model3d" xmlns:o="urn:schemas-microsoft-com:office:office" xmlns:oel="http://schemas.microsoft.com/office/2019/extlst" xmlns:r="http://schemas.openxmlformats.org/officeDocument/2006/relationships" xmlns:m="http://schemas.openxmlformats.org/officeDocument/2006/math" xmlns:v="urn:schemas-microsoft-com:vml" xmlns:wp14="http://schemas.microsoft.com/office/word/2010/wordprocessingDrawing" xmlns:wp="http://schemas.openxmlformats.org/drawingml/2006/wordprocessingDrawing" xmlns:w10="urn:schemas-microsoft-com:office:word" xmlns:w="http://schemas.openxmlformats.org/wordprocessingml/2006/main" xmlns:w14="http://schemas.microsoft.com/office/word/2010/wordml" xmlns:w15="http://schemas.microsoft.com/office/word/2012/wordml" xmlns:w16cei="http://schemas.microsoft.com/office/word/2026/wordml/cei" xmlns:w16cex="http://schemas.microsoft.com/office/word/2018/wordml/cex" xmlns:w16cid="http://schemas.microsoft.com/office/word/2016/wordml/cid" xmlns:w16="http://schemas.microsoft.com/office/word/2018/wordml" xmlns:w16du="http://schemas.microsoft.com/office/word/2023/wordml/word16du" xmlns:w16sdtdh="http://schemas.microsoft.com/office/word/2020/wordml/sdtdatahash" xmlns:w16sdtfl="http://schemas.microsoft.com/office/word/2024/wordml/sdtformatlock" xmlns:w16se="http://schemas.microsoft.com/office/word/2015/wordml/symex" xmlns:wpg="http://schemas.microsoft.com/office/word/2010/wordprocessingGroup" xmlns:wpi="http://schemas.microsoft.com/office/word/2010/wordprocessingInk" xmlns:wne="http://schemas.microsoft.com/office/word/2006/wordml" xmlns:wps="http://schemas.microsoft.com/office/word/2010/wordprocessingShape" mc:Ignorable="w14 w15 w16se w16cid w16 w16cex w16sdtdh w16sdtfl w16du wp14">
   <w:body>
     <w:p>
       <w:pPr>
@@ -75,7 +75,7 @@
           <w:left w:w="10" w:type="dxa"/>
           <w:right w:w="10" w:type="dxa"/>
         </w:tblCellMar>
-        <w:tblLook w:val="04A0" w:firstRow="1" w:lastRow="0" w:firstColumn="1" w:lastColumn="0" w:noHBand="0" w:noVBand="1"/>
+        <w:tblLook w:val="0000" w:firstRow="0" w:lastRow="0" w:firstColumn="0" w:lastColumn="0" w:noHBand="0" w:noVBand="0"/>
       </w:tblPr>
       <w:tblGrid>
         <w:gridCol w:w="10080"/>
@@ -260,7 +260,7 @@
           <w:left w:w="10" w:type="dxa"/>
           <w:right w:w="10" w:type="dxa"/>
         </w:tblCellMar>
-        <w:tblLook w:val="04A0" w:firstRow="1" w:lastRow="0" w:firstColumn="1" w:lastColumn="0" w:noHBand="0" w:noVBand="1"/>
+        <w:tblLook w:val="0000" w:firstRow="0" w:lastRow="0" w:firstColumn="0" w:lastColumn="0" w:noHBand="0" w:noVBand="0"/>
       </w:tblPr>
       <w:tblGrid>
         <w:gridCol w:w="5040"/>
@@ -388,7 +388,7 @@
                 <w:sz w:val="22"/>
                 <w:szCs w:val="22"/>
               </w:rPr>
-              <w:t>1.2  ·</w:t>
+              <w:t>1.4  ·</w:t>
             </w:r>
             <w:proofErr w:type="gramEnd"/>
             <w:r>
@@ -587,6 +587,23 @@
           <w:color w:val="4A4A4A"/>
         </w:rPr>
         <w:t xml:space="preserve">  In memory of Roger Barker G4IDE</w:t>
+      </w:r>
+    </w:p>
+    <w:p>
+      <w:pPr>
+        <w:spacing w:before="40" w:after="80"/>
+        <w:jc w:val="center"/>
+      </w:pPr>
+      <w:r>
+        <w:rPr>
+          <w:rFonts w:ascii="Calibri" w:eastAsia="Calibri" w:hAnsi="Calibri" w:cs="Calibri"/>
+          <w:i/>
+          <w:iCs/>
+          <w:color w:val="4A4A4A"/>
+          <w:sz w:val="18"/>
+          <w:szCs w:val="18"/>
+        </w:rPr>
+        <w:t>Technical review by John Langner WB2OSZ, APRS Foundation</w:t>
       </w:r>
     </w:p>
     <w:p>
@@ -1497,19 +1514,8 @@
           <w:sz w:val="21"/>
           <w:szCs w:val="21"/>
         </w:rPr>
-        <w:t xml:space="preserve">5.3  </w:t>
-      </w:r>
-      <w:proofErr w:type="spellStart"/>
-      <w:r>
-        <w:rPr>
-          <w:rFonts w:ascii="Calibri" w:eastAsia="Calibri" w:hAnsi="Calibri" w:cs="Calibri"/>
-          <w:color w:val="4A4A4A"/>
-          <w:sz w:val="21"/>
-          <w:szCs w:val="21"/>
-        </w:rPr>
-        <w:t>iGates</w:t>
-      </w:r>
-      <w:proofErr w:type="spellEnd"/>
+        <w:t>5.3  iGates</w:t>
+      </w:r>
       <w:proofErr w:type="gramEnd"/>
       <w:r>
         <w:rPr>
@@ -1720,27 +1726,7 @@
           <w:sz w:val="21"/>
           <w:szCs w:val="21"/>
         </w:rPr>
-        <w:t xml:space="preserve"> Packet Radio (</w:t>
-      </w:r>
-      <w:proofErr w:type="spellStart"/>
-      <w:r>
-        <w:rPr>
-          <w:rFonts w:ascii="Calibri" w:eastAsia="Calibri" w:hAnsi="Calibri" w:cs="Calibri"/>
-          <w:color w:val="4A4A4A"/>
-          <w:sz w:val="21"/>
-          <w:szCs w:val="21"/>
-        </w:rPr>
-        <w:t>Winlink</w:t>
-      </w:r>
-      <w:proofErr w:type="spellEnd"/>
-      <w:r>
-        <w:rPr>
-          <w:rFonts w:ascii="Calibri" w:eastAsia="Calibri" w:hAnsi="Calibri" w:cs="Calibri"/>
-          <w:color w:val="4A4A4A"/>
-          <w:sz w:val="21"/>
-          <w:szCs w:val="21"/>
-        </w:rPr>
-        <w:t xml:space="preserve"> Context)</w:t>
+        <w:t xml:space="preserve"> Packet Radio (Winlink Context)</w:t>
       </w:r>
     </w:p>
     <w:p>
@@ -2249,7 +2235,7 @@
           <w:left w:w="10" w:type="dxa"/>
           <w:right w:w="10" w:type="dxa"/>
         </w:tblCellMar>
-        <w:tblLook w:val="04A0" w:firstRow="1" w:lastRow="0" w:firstColumn="1" w:lastColumn="0" w:noHBand="0" w:noVBand="1"/>
+        <w:tblLook w:val="0000" w:firstRow="0" w:lastRow="0" w:firstColumn="0" w:lastColumn="0" w:noHBand="0" w:noVBand="0"/>
       </w:tblPr>
       <w:tblGrid>
         <w:gridCol w:w="10080"/>
@@ -2368,17 +2354,90 @@
           <w:sz w:val="22"/>
           <w:szCs w:val="22"/>
         </w:rPr>
-        <w:t xml:space="preserve">The first use of APRS was in 1984, when </w:t>
+        <w:t>The first use of APRS was in 1984, when Bruninga developed a more advanced version on a VIC-20 for reporting the position and status of horses in a 100-mile (160 km) endurance run.</w:t>
+      </w:r>
+    </w:p>
+    <w:p>
+      <w:pPr>
+        <w:spacing w:before="80" w:after="80" w:line="276" w:lineRule="auto"/>
+      </w:pPr>
+      <w:r>
+        <w:rPr>
+          <w:rFonts w:ascii="Calibri" w:eastAsia="Calibri" w:hAnsi="Calibri" w:cs="Calibri"/>
+          <w:color w:val="1A1A1A"/>
+          <w:sz w:val="22"/>
+          <w:szCs w:val="22"/>
+        </w:rPr>
+        <w:t>Over the next two years, Bruninga continued to develop the system, which he called the Connectionless Emergency Traffic System (CETS). Following a series of Federal Emergency Management Agency (FEMA) exercises using CETS, the system was ported to the IBM Personal Computer. During the early 1990s, CETS — then known as the Automatic Position Reporting System — continued to evolve into its current form.</w:t>
+      </w:r>
+    </w:p>
+    <w:p>
+      <w:pPr>
+        <w:spacing w:before="80" w:after="80" w:line="276" w:lineRule="auto"/>
+      </w:pPr>
+      <w:r>
+        <w:rPr>
+          <w:rFonts w:ascii="Calibri" w:eastAsia="Calibri" w:hAnsi="Calibri" w:cs="Calibri"/>
+          <w:color w:val="1A1A1A"/>
+          <w:sz w:val="22"/>
+          <w:szCs w:val="22"/>
+        </w:rPr>
+        <w:t xml:space="preserve">As GPS technology became more widely available, “Position” was replaced with “Packet” to better describe the more generic capabilities of the system and to emphasize its uses beyond mere position reporting. Bruninga also noted that APRS was not meant to be a vehicle position tracking </w:t>
+      </w:r>
+      <w:proofErr w:type="gramStart"/>
+      <w:r>
+        <w:rPr>
+          <w:rFonts w:ascii="Calibri" w:eastAsia="Calibri" w:hAnsi="Calibri" w:cs="Calibri"/>
+          <w:color w:val="1A1A1A"/>
+          <w:sz w:val="22"/>
+          <w:szCs w:val="22"/>
+        </w:rPr>
+        <w:t>system, and</w:t>
+      </w:r>
+      <w:proofErr w:type="gramEnd"/>
+      <w:r>
+        <w:rPr>
+          <w:rFonts w:ascii="Calibri" w:eastAsia="Calibri" w:hAnsi="Calibri" w:cs="Calibri"/>
+          <w:color w:val="1A1A1A"/>
+          <w:sz w:val="22"/>
+          <w:szCs w:val="22"/>
+        </w:rPr>
+        <w:t xml:space="preserve"> can be interpreted as “Automatic Presence Reporting System.”</w:t>
+      </w:r>
+    </w:p>
+    <w:p>
+      <w:pPr>
+        <w:spacing w:before="80" w:after="80" w:line="276" w:lineRule="auto"/>
+      </w:pPr>
+      <w:r>
+        <w:rPr>
+          <w:rFonts w:ascii="Calibri" w:eastAsia="Calibri" w:hAnsi="Calibri" w:cs="Calibri"/>
+          <w:color w:val="1A1A1A"/>
+          <w:sz w:val="22"/>
+          <w:szCs w:val="22"/>
+        </w:rPr>
+        <w:t xml:space="preserve">Bob continued developing and advocating for APRS until his passing in February 2022. His website at aprs.org is no longer actively maintained and is preserved for historical reference; </w:t>
       </w:r>
       <w:proofErr w:type="spellStart"/>
-      <w:r>
-        <w:rPr>
-          <w:rFonts w:ascii="Calibri" w:eastAsia="Calibri" w:hAnsi="Calibri" w:cs="Calibri"/>
-          <w:color w:val="1A1A1A"/>
-          <w:sz w:val="22"/>
-          <w:szCs w:val="22"/>
-        </w:rPr>
-        <w:t>Bruninga</w:t>
+      <w:proofErr w:type="gramStart"/>
+      <w:r>
+        <w:rPr>
+          <w:rFonts w:ascii="Calibri" w:eastAsia="Calibri" w:hAnsi="Calibri" w:cs="Calibri"/>
+          <w:color w:val="1A1A1A"/>
+          <w:sz w:val="22"/>
+          <w:szCs w:val="22"/>
+        </w:rPr>
+        <w:t>how.aprs</w:t>
+      </w:r>
+      <w:proofErr w:type="gramEnd"/>
+      <w:r>
+        <w:rPr>
+          <w:rFonts w:ascii="Calibri" w:eastAsia="Calibri" w:hAnsi="Calibri" w:cs="Calibri"/>
+          <w:color w:val="1A1A1A"/>
+          <w:sz w:val="22"/>
+          <w:szCs w:val="22"/>
+        </w:rPr>
+        <w:t>.works</w:t>
       </w:r>
       <w:proofErr w:type="spellEnd"/>
       <w:r>
@@ -2388,109 +2447,7 @@
           <w:sz w:val="22"/>
           <w:szCs w:val="22"/>
         </w:rPr>
-        <w:t xml:space="preserve"> developed a more advanced version on a VIC-20 for reporting the position and status of horses in a 100-mile (160 km) endurance run.</w:t>
-      </w:r>
-    </w:p>
-    <w:p>
-      <w:pPr>
-        <w:spacing w:before="80" w:after="80" w:line="276" w:lineRule="auto"/>
-      </w:pPr>
-      <w:r>
-        <w:rPr>
-          <w:rFonts w:ascii="Calibri" w:eastAsia="Calibri" w:hAnsi="Calibri" w:cs="Calibri"/>
-          <w:color w:val="1A1A1A"/>
-          <w:sz w:val="22"/>
-          <w:szCs w:val="22"/>
-        </w:rPr>
-        <w:t xml:space="preserve">Over the next two years, </w:t>
-      </w:r>
-      <w:proofErr w:type="spellStart"/>
-      <w:r>
-        <w:rPr>
-          <w:rFonts w:ascii="Calibri" w:eastAsia="Calibri" w:hAnsi="Calibri" w:cs="Calibri"/>
-          <w:color w:val="1A1A1A"/>
-          <w:sz w:val="22"/>
-          <w:szCs w:val="22"/>
-        </w:rPr>
-        <w:t>Bruninga</w:t>
-      </w:r>
-      <w:proofErr w:type="spellEnd"/>
-      <w:r>
-        <w:rPr>
-          <w:rFonts w:ascii="Calibri" w:eastAsia="Calibri" w:hAnsi="Calibri" w:cs="Calibri"/>
-          <w:color w:val="1A1A1A"/>
-          <w:sz w:val="22"/>
-          <w:szCs w:val="22"/>
-        </w:rPr>
-        <w:t xml:space="preserve"> continued to develop the system, which he called the Connectionless Emergency Traffic System (CETS). Following a series of Federal Emergency Management Agency (FEMA) exercises using CETS, the system was ported to the IBM Personal Computer. During the early 1990s, CETS — then known as the Automatic Position Reporting System — continued to evolve into its current form.</w:t>
-      </w:r>
-    </w:p>
-    <w:p>
-      <w:pPr>
-        <w:spacing w:before="80" w:after="80" w:line="276" w:lineRule="auto"/>
-      </w:pPr>
-      <w:r>
-        <w:rPr>
-          <w:rFonts w:ascii="Calibri" w:eastAsia="Calibri" w:hAnsi="Calibri" w:cs="Calibri"/>
-          <w:color w:val="1A1A1A"/>
-          <w:sz w:val="22"/>
-          <w:szCs w:val="22"/>
-        </w:rPr>
-        <w:t xml:space="preserve">As GPS technology became more widely available, “Position” was replaced with “Packet” to better describe the more generic capabilities of the system and to emphasize its uses beyond mere position reporting. </w:t>
-      </w:r>
-      <w:proofErr w:type="spellStart"/>
-      <w:r>
-        <w:rPr>
-          <w:rFonts w:ascii="Calibri" w:eastAsia="Calibri" w:hAnsi="Calibri" w:cs="Calibri"/>
-          <w:color w:val="1A1A1A"/>
-          <w:sz w:val="22"/>
-          <w:szCs w:val="22"/>
-        </w:rPr>
-        <w:t>Bruninga</w:t>
-      </w:r>
-      <w:proofErr w:type="spellEnd"/>
-      <w:r>
-        <w:rPr>
-          <w:rFonts w:ascii="Calibri" w:eastAsia="Calibri" w:hAnsi="Calibri" w:cs="Calibri"/>
-          <w:color w:val="1A1A1A"/>
-          <w:sz w:val="22"/>
-          <w:szCs w:val="22"/>
-        </w:rPr>
-        <w:t xml:space="preserve"> also noted that APRS was not meant to be a vehicle position tracking </w:t>
-      </w:r>
-      <w:proofErr w:type="gramStart"/>
-      <w:r>
-        <w:rPr>
-          <w:rFonts w:ascii="Calibri" w:eastAsia="Calibri" w:hAnsi="Calibri" w:cs="Calibri"/>
-          <w:color w:val="1A1A1A"/>
-          <w:sz w:val="22"/>
-          <w:szCs w:val="22"/>
-        </w:rPr>
-        <w:t>system, and</w:t>
-      </w:r>
-      <w:proofErr w:type="gramEnd"/>
-      <w:r>
-        <w:rPr>
-          <w:rFonts w:ascii="Calibri" w:eastAsia="Calibri" w:hAnsi="Calibri" w:cs="Calibri"/>
-          <w:color w:val="1A1A1A"/>
-          <w:sz w:val="22"/>
-          <w:szCs w:val="22"/>
-        </w:rPr>
-        <w:t xml:space="preserve"> can be interpreted as “Automatic Presence Reporting System.”</w:t>
-      </w:r>
-    </w:p>
-    <w:p>
-      <w:pPr>
-        <w:spacing w:before="80" w:after="80" w:line="276" w:lineRule="auto"/>
-      </w:pPr>
-      <w:r>
-        <w:rPr>
-          <w:rFonts w:ascii="Calibri" w:eastAsia="Calibri" w:hAnsi="Calibri" w:cs="Calibri"/>
-          <w:color w:val="1A1A1A"/>
-          <w:sz w:val="22"/>
-          <w:szCs w:val="22"/>
-        </w:rPr>
-        <w:t>Bob continued developing and advocating for APRS until his passing in February 2022. His website at aprs.org remains the canonical reference for APRS theory and protocol. This primer draws heavily on his work and philosophy.</w:t>
+        <w:t xml:space="preserve"> has since become the current, actively maintained reference for APRS theory and protocol. This primer draws heavily on Bob's work and philosophy.</w:t>
       </w:r>
     </w:p>
     <w:p>
@@ -2678,7 +2635,7 @@
           <w:left w:w="10" w:type="dxa"/>
           <w:right w:w="10" w:type="dxa"/>
         </w:tblCellMar>
-        <w:tblLook w:val="04A0" w:firstRow="1" w:lastRow="0" w:firstColumn="1" w:lastColumn="0" w:noHBand="0" w:noVBand="1"/>
+        <w:tblLook w:val="0000" w:firstRow="0" w:lastRow="0" w:firstColumn="0" w:lastColumn="0" w:noHBand="0" w:noVBand="0"/>
       </w:tblPr>
       <w:tblGrid>
         <w:gridCol w:w="140"/>
@@ -2820,27 +2777,7 @@
           <w:sz w:val="22"/>
           <w:szCs w:val="22"/>
         </w:rPr>
-        <w:t xml:space="preserve">APRS sits within the broader world of amateur radio digital modes — communications that use computers or digital encoders to send structured data over radio. Unlike modes such as FT8 (optimized for weak-signal contacts) or </w:t>
-      </w:r>
-      <w:proofErr w:type="spellStart"/>
-      <w:r>
-        <w:rPr>
-          <w:rFonts w:ascii="Calibri" w:eastAsia="Calibri" w:hAnsi="Calibri" w:cs="Calibri"/>
-          <w:color w:val="1A1A1A"/>
-          <w:sz w:val="22"/>
-          <w:szCs w:val="22"/>
-        </w:rPr>
-        <w:t>Winlink</w:t>
-      </w:r>
-      <w:proofErr w:type="spellEnd"/>
-      <w:r>
-        <w:rPr>
-          <w:rFonts w:ascii="Calibri" w:eastAsia="Calibri" w:hAnsi="Calibri" w:cs="Calibri"/>
-          <w:color w:val="1A1A1A"/>
-          <w:sz w:val="22"/>
-          <w:szCs w:val="22"/>
-        </w:rPr>
-        <w:t xml:space="preserve"> (email over radio), APRS is designed for real-time tactical information sharing on a shared channel.</w:t>
+        <w:t>APRS sits within the broader world of amateur radio digital modes — communications that use computers or digital encoders to send structured data over radio. Unlike modes such as FT8 (optimized for weak-signal contacts) or Winlink (email over radio), APRS is designed for real-time tactical information sharing on a shared channel.</w:t>
       </w:r>
     </w:p>
     <w:p>
@@ -2906,7 +2843,7 @@
           <w:left w:w="10" w:type="dxa"/>
           <w:right w:w="10" w:type="dxa"/>
         </w:tblCellMar>
-        <w:tblLook w:val="04A0" w:firstRow="1" w:lastRow="0" w:firstColumn="1" w:lastColumn="0" w:noHBand="0" w:noVBand="1"/>
+        <w:tblLook w:val="0000" w:firstRow="0" w:lastRow="0" w:firstColumn="0" w:lastColumn="0" w:noHBand="0" w:noVBand="0"/>
       </w:tblPr>
       <w:tblGrid>
         <w:gridCol w:w="140"/>
@@ -3008,19 +2945,8 @@
                 <w:sz w:val="21"/>
                 <w:szCs w:val="21"/>
               </w:rPr>
-              <w:t xml:space="preserve"> 144.390 </w:t>
-            </w:r>
-            <w:proofErr w:type="spellStart"/>
-            <w:r>
-              <w:rPr>
-                <w:rFonts w:ascii="Calibri" w:eastAsia="Calibri" w:hAnsi="Calibri" w:cs="Calibri"/>
-                <w:color w:val="1A1A1A"/>
-                <w:sz w:val="21"/>
-                <w:szCs w:val="21"/>
-              </w:rPr>
-              <w:t>MHz.</w:t>
-            </w:r>
-            <w:proofErr w:type="spellEnd"/>
+              <w:t xml:space="preserve"> 144.390 MHz.</w:t>
+            </w:r>
           </w:p>
         </w:tc>
       </w:tr>
@@ -3092,7 +3018,7 @@
           <w:left w:w="10" w:type="dxa"/>
           <w:right w:w="10" w:type="dxa"/>
         </w:tblCellMar>
-        <w:tblLook w:val="04A0" w:firstRow="1" w:lastRow="0" w:firstColumn="1" w:lastColumn="0" w:noHBand="0" w:noVBand="1"/>
+        <w:tblLook w:val="0000" w:firstRow="0" w:lastRow="0" w:firstColumn="0" w:lastColumn="0" w:noHBand="0" w:noVBand="0"/>
       </w:tblPr>
       <w:tblGrid>
         <w:gridCol w:w="5040"/>
@@ -3675,7 +3601,7 @@
           <w:left w:w="10" w:type="dxa"/>
           <w:right w:w="10" w:type="dxa"/>
         </w:tblCellMar>
-        <w:tblLook w:val="04A0" w:firstRow="1" w:lastRow="0" w:firstColumn="1" w:lastColumn="0" w:noHBand="0" w:noVBand="1"/>
+        <w:tblLook w:val="0000" w:firstRow="0" w:lastRow="0" w:firstColumn="0" w:lastColumn="0" w:noHBand="0" w:noVBand="0"/>
       </w:tblPr>
       <w:tblGrid>
         <w:gridCol w:w="10080"/>
@@ -3780,27 +3706,7 @@
           <w:sz w:val="22"/>
           <w:szCs w:val="22"/>
         </w:rPr>
-        <w:t xml:space="preserve">In North America, VHF APRS operates on a single shared frequency: 144.390 </w:t>
-      </w:r>
-      <w:proofErr w:type="spellStart"/>
-      <w:r>
-        <w:rPr>
-          <w:rFonts w:ascii="Calibri" w:eastAsia="Calibri" w:hAnsi="Calibri" w:cs="Calibri"/>
-          <w:color w:val="1A1A1A"/>
-          <w:sz w:val="22"/>
-          <w:szCs w:val="22"/>
-        </w:rPr>
-        <w:t>MHz.</w:t>
-      </w:r>
-      <w:proofErr w:type="spellEnd"/>
-      <w:r>
-        <w:rPr>
-          <w:rFonts w:ascii="Calibri" w:eastAsia="Calibri" w:hAnsi="Calibri" w:cs="Calibri"/>
-          <w:color w:val="1A1A1A"/>
-          <w:sz w:val="22"/>
-          <w:szCs w:val="22"/>
-        </w:rPr>
-        <w:t xml:space="preserve"> Every station in range — your handheld, mobile radio, home station, nearby digipeater, and every other APRS station within line of sight — all transmit on this same channel without coordinating with each other. This is the APRS channel. When your radio is on 144.390 MHz, you are on the APRS channel.</w:t>
+        <w:t>In North America, VHF APRS operates on a single shared frequency: 144.390 MHz. Every station in range — your handheld, mobile radio, home station, nearby digipeater, and every other APRS station within line of sight — all transmit on this same channel without coordinating with each other. This is the APRS channel. When your radio is on 144.390 MHz, you are on the APRS channel.</w:t>
       </w:r>
     </w:p>
     <w:p>
@@ -3872,7 +3778,7 @@
           <w:left w:w="10" w:type="dxa"/>
           <w:right w:w="10" w:type="dxa"/>
         </w:tblCellMar>
-        <w:tblLook w:val="04A0" w:firstRow="1" w:lastRow="0" w:firstColumn="1" w:lastColumn="0" w:noHBand="0" w:noVBand="1"/>
+        <w:tblLook w:val="0000" w:firstRow="0" w:lastRow="0" w:firstColumn="0" w:lastColumn="0" w:noHBand="0" w:noVBand="0"/>
       </w:tblPr>
       <w:tblGrid>
         <w:gridCol w:w="140"/>
@@ -4019,19 +3925,8 @@
           <w:sz w:val="22"/>
           <w:szCs w:val="22"/>
         </w:rPr>
-        <w:t xml:space="preserve">•  These tones are fed into your radio's audio input. The radio transmits them as an FM signal on 144.390 </w:t>
-      </w:r>
-      <w:proofErr w:type="spellStart"/>
-      <w:r>
-        <w:rPr>
-          <w:rFonts w:ascii="Calibri" w:eastAsia="Calibri" w:hAnsi="Calibri" w:cs="Calibri"/>
-          <w:color w:val="1A1A1A"/>
-          <w:sz w:val="22"/>
-          <w:szCs w:val="22"/>
-        </w:rPr>
-        <w:t>MHz.</w:t>
-      </w:r>
-      <w:proofErr w:type="spellEnd"/>
+        <w:t>•  These tones are fed into your radio's audio input. The radio transmits them as an FM signal on 144.390 MHz.</w:t>
+      </w:r>
     </w:p>
     <w:p>
       <w:pPr>
@@ -4080,7 +3975,7 @@
           <w:sz w:val="22"/>
           <w:szCs w:val="22"/>
         </w:rPr>
-        <w:t>2-1), nearby digipeaters that receive it will re-transmit it, extending the range.</w:t>
+        <w:t>2-1 — note there is no space anywhere in this string, neither within an element like WIDE1-1 nor after the comma), nearby digipeaters that receive it will re-transmit it, extending the range. Chapter 8 covers what goes wrong when a space sneaks in here, which is a common and easy mistake to make.</w:t>
       </w:r>
     </w:p>
     <w:p>
@@ -4095,27 +3990,7 @@
           <w:sz w:val="22"/>
           <w:szCs w:val="22"/>
         </w:rPr>
-        <w:t>•  Stations with internet connections (</w:t>
-      </w:r>
-      <w:proofErr w:type="spellStart"/>
-      <w:r>
-        <w:rPr>
-          <w:rFonts w:ascii="Calibri" w:eastAsia="Calibri" w:hAnsi="Calibri" w:cs="Calibri"/>
-          <w:color w:val="1A1A1A"/>
-          <w:sz w:val="22"/>
-          <w:szCs w:val="22"/>
-        </w:rPr>
-        <w:t>iGates</w:t>
-      </w:r>
-      <w:proofErr w:type="spellEnd"/>
-      <w:r>
-        <w:rPr>
-          <w:rFonts w:ascii="Calibri" w:eastAsia="Calibri" w:hAnsi="Calibri" w:cs="Calibri"/>
-          <w:color w:val="1A1A1A"/>
-          <w:sz w:val="22"/>
-          <w:szCs w:val="22"/>
-        </w:rPr>
-        <w:t>) forward received packets to the global APRS-IS network.</w:t>
+        <w:t>•  Stations with internet connections (iGates) forward received packets to the global APRS-IS network.</w:t>
       </w:r>
     </w:p>
     <w:p>
@@ -4176,27 +4051,7 @@
           <w:sz w:val="22"/>
           <w:szCs w:val="22"/>
         </w:rPr>
-        <w:t>VHF APRS uses Bell 202 AFSK (Audio Frequency Shift Keying) modulation. The two tones — 1200 Hz (mark) and 2200 Hz (</w:t>
-      </w:r>
-      <w:proofErr w:type="gramStart"/>
-      <w:r>
-        <w:rPr>
-          <w:rFonts w:ascii="Calibri" w:eastAsia="Calibri" w:hAnsi="Calibri" w:cs="Calibri"/>
-          <w:color w:val="1A1A1A"/>
-          <w:sz w:val="22"/>
-          <w:szCs w:val="22"/>
-        </w:rPr>
-        <w:t>space) —</w:t>
-      </w:r>
-      <w:proofErr w:type="gramEnd"/>
-      <w:r>
-        <w:rPr>
-          <w:rFonts w:ascii="Calibri" w:eastAsia="Calibri" w:hAnsi="Calibri" w:cs="Calibri"/>
-          <w:color w:val="1A1A1A"/>
-          <w:sz w:val="22"/>
-          <w:szCs w:val="22"/>
-        </w:rPr>
-        <w:t xml:space="preserve"> are transmitted at 1200 baud. This is a relatively slow data rate by modern standards, but it is well-matched to the characteristics of FM radio and the available bandwidth.</w:t>
+        <w:t>VHF APRS uses Bell 202 AFSK (Audio Frequency Shift Keying) modulation. The two tones — 1200 Hz (mark) and 2200 Hz (space), a 1000 Hz shift between them — are transmitted at 1200 baud. This is a relatively slow data rate by modern standards, but it is well-matched to the characteristics of FM radio and the available bandwidth.</w:t>
       </w:r>
     </w:p>
     <w:p>
@@ -4225,6 +4080,7 @@
           <w:sz w:val="22"/>
           <w:szCs w:val="22"/>
         </w:rPr>
+        <w:lastRenderedPageBreak/>
         <w:t>•  Flag bytes — synchronization markers at the start and end of the frame</w:t>
       </w:r>
     </w:p>
@@ -4240,8 +4096,7 @@
           <w:sz w:val="22"/>
           <w:szCs w:val="22"/>
         </w:rPr>
-        <w:lastRenderedPageBreak/>
-        <w:t>•  Destination field — the APRS software identifier (e.g., APRS, APNU, etc.)</w:t>
+        <w:t>•  Destination field — the APRS software identifier (e.g., APRS, APNU, etc.). In the MIC-E position format used by many Kenwood and Yaesu radios, this field does unusual double duty: part of the destination address is also used to encode the station's position, a legacy design choice from MIC-E's origins as a compact binary format.</w:t>
       </w:r>
     </w:p>
     <w:p>
@@ -4334,7 +4189,7 @@
           <w:left w:w="10" w:type="dxa"/>
           <w:right w:w="10" w:type="dxa"/>
         </w:tblCellMar>
-        <w:tblLook w:val="04A0" w:firstRow="1" w:lastRow="0" w:firstColumn="1" w:lastColumn="0" w:noHBand="0" w:noVBand="1"/>
+        <w:tblLook w:val="0000" w:firstRow="0" w:lastRow="0" w:firstColumn="0" w:lastColumn="0" w:noHBand="0" w:noVBand="0"/>
       </w:tblPr>
       <w:tblGrid>
         <w:gridCol w:w="140"/>
@@ -4396,7 +4251,7 @@
                 <w:sz w:val="21"/>
                 <w:szCs w:val="21"/>
               </w:rPr>
-              <w:t xml:space="preserve">The 1200 baud rate of VHF APRS dates to the early days of the protocol and the limitations of 1990s hardware. Various proposals for higher-speed APRS alternatives have been made over the years, but 1200 baud </w:t>
+              <w:t xml:space="preserve">The 1200 baud rate of VHF APRS dates to the early days of the protocol and the limitations of 1990s hardware. Various proposals for higher-speed APRS alternatives have been made over the years, but 1200 baud AFSK remains the standard for interoperability, since the entire network depends on all stations being able to receive each other. A few alternative modulation schemes do see real-world use in specific contexts: 9600 bps has been available since the 1980s and is built into Kenwood's APRS-capable mobile radios; a 2400 bps phase-shift mode was offered by several TNC hardware manufacturers in the 1990s using dedicated modem chips, and the same mode is now available in some software TNCs; and APRS over LoRa is a more recent development that has been gaining popularity. None of these are interoperable with standard 1200 </w:t>
             </w:r>
             <w:proofErr w:type="gramStart"/>
             <w:r>
@@ -4406,7 +4261,7 @@
                 <w:sz w:val="21"/>
                 <w:szCs w:val="21"/>
               </w:rPr>
-              <w:t>remains</w:t>
+              <w:t>baud</w:t>
             </w:r>
             <w:proofErr w:type="gramEnd"/>
             <w:r>
@@ -4416,7 +4271,7 @@
                 <w:sz w:val="21"/>
                 <w:szCs w:val="21"/>
               </w:rPr>
-              <w:t xml:space="preserve"> the standard for interoperability. The entire network depends on all stations being able to receive each other.</w:t>
+              <w:t xml:space="preserve"> AFSK stations without a compatible radio or modem on both ends.</w:t>
             </w:r>
           </w:p>
         </w:tc>
@@ -4509,7 +4364,7 @@
           <w:left w:w="10" w:type="dxa"/>
           <w:right w:w="10" w:type="dxa"/>
         </w:tblCellMar>
-        <w:tblLook w:val="04A0" w:firstRow="1" w:lastRow="0" w:firstColumn="1" w:lastColumn="0" w:noHBand="0" w:noVBand="1"/>
+        <w:tblLook w:val="0000" w:firstRow="0" w:lastRow="0" w:firstColumn="0" w:lastColumn="0" w:noHBand="0" w:noVBand="0"/>
       </w:tblPr>
       <w:tblGrid>
         <w:gridCol w:w="2217"/>
@@ -4663,57 +4518,15 @@
             <w:pPr>
               <w:spacing w:line="276" w:lineRule="auto"/>
             </w:pPr>
-            <w:proofErr w:type="spellStart"/>
-            <w:r>
-              <w:rPr>
-                <w:rFonts w:ascii="Calibri" w:eastAsia="Calibri" w:hAnsi="Calibri" w:cs="Calibri"/>
-                <w:color w:val="1A1A1A"/>
-                <w:sz w:val="21"/>
-                <w:szCs w:val="21"/>
-              </w:rPr>
-              <w:t>Kantronics</w:t>
-            </w:r>
-            <w:proofErr w:type="spellEnd"/>
-            <w:r>
-              <w:rPr>
-                <w:rFonts w:ascii="Calibri" w:eastAsia="Calibri" w:hAnsi="Calibri" w:cs="Calibri"/>
-                <w:color w:val="1A1A1A"/>
-                <w:sz w:val="21"/>
-                <w:szCs w:val="21"/>
-              </w:rPr>
-              <w:t xml:space="preserve"> KPC-3+, TNC-Pi, </w:t>
-            </w:r>
-            <w:proofErr w:type="spellStart"/>
-            <w:r>
-              <w:rPr>
-                <w:rFonts w:ascii="Calibri" w:eastAsia="Calibri" w:hAnsi="Calibri" w:cs="Calibri"/>
-                <w:color w:val="1A1A1A"/>
-                <w:sz w:val="21"/>
-                <w:szCs w:val="21"/>
-              </w:rPr>
-              <w:t>Mobilinkd</w:t>
-            </w:r>
-            <w:proofErr w:type="spellEnd"/>
-            <w:r>
-              <w:rPr>
-                <w:rFonts w:ascii="Calibri" w:eastAsia="Calibri" w:hAnsi="Calibri" w:cs="Calibri"/>
-                <w:color w:val="1A1A1A"/>
-                <w:sz w:val="21"/>
-                <w:szCs w:val="21"/>
-              </w:rPr>
-              <w:t xml:space="preserve"> TNC4, </w:t>
-            </w:r>
-            <w:proofErr w:type="spellStart"/>
-            <w:r>
-              <w:rPr>
-                <w:rFonts w:ascii="Calibri" w:eastAsia="Calibri" w:hAnsi="Calibri" w:cs="Calibri"/>
-                <w:color w:val="1A1A1A"/>
-                <w:sz w:val="21"/>
-                <w:szCs w:val="21"/>
-              </w:rPr>
-              <w:t>DigiRig</w:t>
-            </w:r>
-            <w:proofErr w:type="spellEnd"/>
+            <w:r>
+              <w:rPr>
+                <w:rFonts w:ascii="Calibri" w:eastAsia="Calibri" w:hAnsi="Calibri" w:cs="Calibri"/>
+                <w:color w:val="1A1A1A"/>
+                <w:sz w:val="21"/>
+                <w:szCs w:val="21"/>
+              </w:rPr>
+              <w:t>Kantronics KPC-3+, TNC-Pi, Mobilinkd TNC4</w:t>
+            </w:r>
           </w:p>
         </w:tc>
         <w:tc>
@@ -4799,37 +4612,15 @@
             <w:pPr>
               <w:spacing w:line="276" w:lineRule="auto"/>
             </w:pPr>
-            <w:proofErr w:type="spellStart"/>
-            <w:r>
-              <w:rPr>
-                <w:rFonts w:ascii="Calibri" w:eastAsia="Calibri" w:hAnsi="Calibri" w:cs="Calibri"/>
-                <w:color w:val="1A1A1A"/>
-                <w:sz w:val="21"/>
-                <w:szCs w:val="21"/>
-              </w:rPr>
-              <w:t>Direwolf</w:t>
-            </w:r>
-            <w:proofErr w:type="spellEnd"/>
-            <w:r>
-              <w:rPr>
-                <w:rFonts w:ascii="Calibri" w:eastAsia="Calibri" w:hAnsi="Calibri" w:cs="Calibri"/>
-                <w:color w:val="1A1A1A"/>
-                <w:sz w:val="21"/>
-                <w:szCs w:val="21"/>
-              </w:rPr>
-              <w:t xml:space="preserve">, UZ7HO </w:t>
-            </w:r>
-            <w:proofErr w:type="spellStart"/>
-            <w:r>
-              <w:rPr>
-                <w:rFonts w:ascii="Calibri" w:eastAsia="Calibri" w:hAnsi="Calibri" w:cs="Calibri"/>
-                <w:color w:val="1A1A1A"/>
-                <w:sz w:val="21"/>
-                <w:szCs w:val="21"/>
-              </w:rPr>
-              <w:t>Soundmodem</w:t>
-            </w:r>
-            <w:proofErr w:type="spellEnd"/>
+            <w:r>
+              <w:rPr>
+                <w:rFonts w:ascii="Calibri" w:eastAsia="Calibri" w:hAnsi="Calibri" w:cs="Calibri"/>
+                <w:color w:val="1A1A1A"/>
+                <w:sz w:val="21"/>
+                <w:szCs w:val="21"/>
+              </w:rPr>
+              <w:t>Direwolf, UZ7HO Soundmodem</w:t>
+            </w:r>
           </w:p>
         </w:tc>
         <w:tc>
@@ -4857,27 +4648,7 @@
                 <w:sz w:val="21"/>
                 <w:szCs w:val="21"/>
               </w:rPr>
-              <w:t xml:space="preserve">Flexibility; modern computers; </w:t>
-            </w:r>
-            <w:proofErr w:type="spellStart"/>
-            <w:r>
-              <w:rPr>
-                <w:rFonts w:ascii="Calibri" w:eastAsia="Calibri" w:hAnsi="Calibri" w:cs="Calibri"/>
-                <w:color w:val="1A1A1A"/>
-                <w:sz w:val="21"/>
-                <w:szCs w:val="21"/>
-              </w:rPr>
-              <w:t>iGate</w:t>
-            </w:r>
-            <w:proofErr w:type="spellEnd"/>
-            <w:r>
-              <w:rPr>
-                <w:rFonts w:ascii="Calibri" w:eastAsia="Calibri" w:hAnsi="Calibri" w:cs="Calibri"/>
-                <w:color w:val="1A1A1A"/>
-                <w:sz w:val="21"/>
-                <w:szCs w:val="21"/>
-              </w:rPr>
-              <w:t xml:space="preserve"> builds</w:t>
+              <w:t>Flexibility; modern computers; iGate builds</w:t>
             </w:r>
           </w:p>
         </w:tc>
@@ -5028,57 +4799,15 @@
             <w:pPr>
               <w:spacing w:line="276" w:lineRule="auto"/>
             </w:pPr>
-            <w:proofErr w:type="spellStart"/>
-            <w:r>
-              <w:rPr>
-                <w:rFonts w:ascii="Calibri" w:eastAsia="Calibri" w:hAnsi="Calibri" w:cs="Calibri"/>
-                <w:color w:val="1A1A1A"/>
-                <w:sz w:val="21"/>
-                <w:szCs w:val="21"/>
-              </w:rPr>
-              <w:t>SignaLink</w:t>
-            </w:r>
-            <w:proofErr w:type="spellEnd"/>
-            <w:r>
-              <w:rPr>
-                <w:rFonts w:ascii="Calibri" w:eastAsia="Calibri" w:hAnsi="Calibri" w:cs="Calibri"/>
-                <w:color w:val="1A1A1A"/>
-                <w:sz w:val="21"/>
-                <w:szCs w:val="21"/>
-              </w:rPr>
-              <w:t xml:space="preserve"> USB, </w:t>
-            </w:r>
-            <w:proofErr w:type="spellStart"/>
-            <w:r>
-              <w:rPr>
-                <w:rFonts w:ascii="Calibri" w:eastAsia="Calibri" w:hAnsi="Calibri" w:cs="Calibri"/>
-                <w:color w:val="1A1A1A"/>
-                <w:sz w:val="21"/>
-                <w:szCs w:val="21"/>
-              </w:rPr>
-              <w:t>DigiRig</w:t>
-            </w:r>
-            <w:proofErr w:type="spellEnd"/>
-            <w:r>
-              <w:rPr>
-                <w:rFonts w:ascii="Calibri" w:eastAsia="Calibri" w:hAnsi="Calibri" w:cs="Calibri"/>
-                <w:color w:val="1A1A1A"/>
-                <w:sz w:val="21"/>
-                <w:szCs w:val="21"/>
-              </w:rPr>
-              <w:t xml:space="preserve">, </w:t>
-            </w:r>
-            <w:proofErr w:type="spellStart"/>
-            <w:r>
-              <w:rPr>
-                <w:rFonts w:ascii="Calibri" w:eastAsia="Calibri" w:hAnsi="Calibri" w:cs="Calibri"/>
-                <w:color w:val="1A1A1A"/>
-                <w:sz w:val="21"/>
-                <w:szCs w:val="21"/>
-              </w:rPr>
-              <w:t>RigBlaster</w:t>
-            </w:r>
-            <w:proofErr w:type="spellEnd"/>
+            <w:r>
+              <w:rPr>
+                <w:rFonts w:ascii="Calibri" w:eastAsia="Calibri" w:hAnsi="Calibri" w:cs="Calibri"/>
+                <w:color w:val="1A1A1A"/>
+                <w:sz w:val="21"/>
+                <w:szCs w:val="21"/>
+              </w:rPr>
+              <w:t>SignaLink USB, DigiRig, RigBlaster</w:t>
+            </w:r>
           </w:p>
         </w:tc>
         <w:tc>
@@ -5166,7 +4895,7 @@
           <w:left w:w="10" w:type="dxa"/>
           <w:right w:w="10" w:type="dxa"/>
         </w:tblCellMar>
-        <w:tblLook w:val="04A0" w:firstRow="1" w:lastRow="0" w:firstColumn="1" w:lastColumn="0" w:noHBand="0" w:noVBand="1"/>
+        <w:tblLook w:val="0000" w:firstRow="0" w:lastRow="0" w:firstColumn="0" w:lastColumn="0" w:noHBand="0" w:noVBand="0"/>
       </w:tblPr>
       <w:tblGrid>
         <w:gridCol w:w="140"/>
@@ -5228,47 +4957,7 @@
                 <w:sz w:val="21"/>
                 <w:szCs w:val="21"/>
               </w:rPr>
-              <w:t xml:space="preserve">For a home </w:t>
-            </w:r>
-            <w:proofErr w:type="spellStart"/>
-            <w:r>
-              <w:rPr>
-                <w:rFonts w:ascii="Calibri" w:eastAsia="Calibri" w:hAnsi="Calibri" w:cs="Calibri"/>
-                <w:color w:val="1A1A1A"/>
-                <w:sz w:val="21"/>
-                <w:szCs w:val="21"/>
-              </w:rPr>
-              <w:t>iGate</w:t>
-            </w:r>
-            <w:proofErr w:type="spellEnd"/>
-            <w:r>
-              <w:rPr>
-                <w:rFonts w:ascii="Calibri" w:eastAsia="Calibri" w:hAnsi="Calibri" w:cs="Calibri"/>
-                <w:color w:val="1A1A1A"/>
-                <w:sz w:val="21"/>
-                <w:szCs w:val="21"/>
-              </w:rPr>
-              <w:t xml:space="preserve"> or digipeater, </w:t>
-            </w:r>
-            <w:proofErr w:type="spellStart"/>
-            <w:r>
-              <w:rPr>
-                <w:rFonts w:ascii="Calibri" w:eastAsia="Calibri" w:hAnsi="Calibri" w:cs="Calibri"/>
-                <w:color w:val="1A1A1A"/>
-                <w:sz w:val="21"/>
-                <w:szCs w:val="21"/>
-              </w:rPr>
-              <w:t>Direwolf</w:t>
-            </w:r>
-            <w:proofErr w:type="spellEnd"/>
-            <w:r>
-              <w:rPr>
-                <w:rFonts w:ascii="Calibri" w:eastAsia="Calibri" w:hAnsi="Calibri" w:cs="Calibri"/>
-                <w:color w:val="1A1A1A"/>
-                <w:sz w:val="21"/>
-                <w:szCs w:val="21"/>
-              </w:rPr>
-              <w:t xml:space="preserve"> running on a Raspberry Pi with a sound card interface is one of the most popular and capable options. For mobile operation, a radio with a built-in TNC (such as the Kenwood TM-D710) eliminates the need for any external hardware.</w:t>
+              <w:t>For a home iGate or digipeater, Direwolf running on a Raspberry Pi with a sound card interface is one of the most popular and capable options. For mobile operation, a radio with a built-in TNC (such as the Kenwood TM-D710) eliminates the need for any external hardware.</w:t>
             </w:r>
           </w:p>
         </w:tc>
@@ -5341,7 +5030,7 @@
           <w:left w:w="10" w:type="dxa"/>
           <w:right w:w="10" w:type="dxa"/>
         </w:tblCellMar>
-        <w:tblLook w:val="04A0" w:firstRow="1" w:lastRow="0" w:firstColumn="1" w:lastColumn="0" w:noHBand="0" w:noVBand="1"/>
+        <w:tblLook w:val="0000" w:firstRow="0" w:lastRow="0" w:firstColumn="0" w:lastColumn="0" w:noHBand="0" w:noVBand="0"/>
       </w:tblPr>
       <w:tblGrid>
         <w:gridCol w:w="3528"/>
@@ -5380,7 +5069,6 @@
                 <w:bCs/>
                 <w:color w:val="FFFFFF"/>
               </w:rPr>
-              <w:lastRenderedPageBreak/>
               <w:t>Region</w:t>
             </w:r>
           </w:p>
@@ -5999,7 +5687,7 @@
           <w:left w:w="10" w:type="dxa"/>
           <w:right w:w="10" w:type="dxa"/>
         </w:tblCellMar>
-        <w:tblLook w:val="04A0" w:firstRow="1" w:lastRow="0" w:firstColumn="1" w:lastColumn="0" w:noHBand="0" w:noVBand="1"/>
+        <w:tblLook w:val="0000" w:firstRow="0" w:lastRow="0" w:firstColumn="0" w:lastColumn="0" w:noHBand="0" w:noVBand="0"/>
       </w:tblPr>
       <w:tblGrid>
         <w:gridCol w:w="140"/>
@@ -6093,7 +5781,7 @@
           <w:left w:w="10" w:type="dxa"/>
           <w:right w:w="10" w:type="dxa"/>
         </w:tblCellMar>
-        <w:tblLook w:val="04A0" w:firstRow="1" w:lastRow="0" w:firstColumn="1" w:lastColumn="0" w:noHBand="0" w:noVBand="1"/>
+        <w:tblLook w:val="0000" w:firstRow="0" w:lastRow="0" w:firstColumn="0" w:lastColumn="0" w:noHBand="0" w:noVBand="0"/>
       </w:tblPr>
       <w:tblGrid>
         <w:gridCol w:w="10080"/>
@@ -6274,7 +5962,7 @@
           <w:rFonts w:ascii="Calibri" w:eastAsia="Calibri" w:hAnsi="Calibri" w:cs="Calibri"/>
           <w:color w:val="1A1A1A"/>
         </w:rPr>
-        <w:t>4158.63N/08815.78W&gt;146.520 Home</w:t>
+        <w:t>4158.63N/08815.78W&gt;146.520MHz Home</w:t>
       </w:r>
     </w:p>
     <w:p>
@@ -6306,12 +5994,12 @@
           <w:left w:w="10" w:type="dxa"/>
           <w:right w:w="10" w:type="dxa"/>
         </w:tblCellMar>
-        <w:tblLook w:val="04A0" w:firstRow="1" w:lastRow="0" w:firstColumn="1" w:lastColumn="0" w:noHBand="0" w:noVBand="1"/>
+        <w:tblLook w:val="0000" w:firstRow="0" w:lastRow="0" w:firstColumn="0" w:lastColumn="0" w:noHBand="0" w:noVBand="0"/>
       </w:tblPr>
       <w:tblGrid>
-        <w:gridCol w:w="2096"/>
-        <w:gridCol w:w="3078"/>
-        <w:gridCol w:w="4905"/>
+        <w:gridCol w:w="2024"/>
+        <w:gridCol w:w="3472"/>
+        <w:gridCol w:w="4583"/>
       </w:tblGrid>
       <w:tr>
         <w:tblPrEx>
@@ -6861,7 +6549,7 @@
                 <w:sz w:val="21"/>
                 <w:szCs w:val="21"/>
               </w:rPr>
-              <w:t>!4158.63N/08815.78W&gt;146.520 Home</w:t>
+              <w:t>!4158.63N/08815.78W&gt;146.520MHz Home</w:t>
             </w:r>
           </w:p>
         </w:tc>
@@ -6895,6 +6583,40 @@
         </w:tc>
       </w:tr>
     </w:tbl>
+    <w:p>
+      <w:pPr>
+        <w:spacing w:before="80" w:after="120" w:line="276" w:lineRule="auto"/>
+      </w:pPr>
+      <w:r>
+        <w:rPr>
+          <w:rFonts w:ascii="Calibri" w:eastAsia="Calibri" w:hAnsi="Calibri" w:cs="Calibri"/>
+          <w:i/>
+          <w:iCs/>
+          <w:color w:val="4A4A4A"/>
+        </w:rPr>
+        <w:t xml:space="preserve">Note the exact frequency format in the comment: 146.520MHz — no space before "MHz." This </w:t>
+      </w:r>
+      <w:proofErr w:type="spellStart"/>
+      <w:r>
+        <w:rPr>
+          <w:rFonts w:ascii="Calibri" w:eastAsia="Calibri" w:hAnsi="Calibri" w:cs="Calibri"/>
+          <w:i/>
+          <w:iCs/>
+          <w:color w:val="4A4A4A"/>
+        </w:rPr>
+        <w:t>FFF.FFFMHz</w:t>
+      </w:r>
+      <w:proofErr w:type="spellEnd"/>
+      <w:r>
+        <w:rPr>
+          <w:rFonts w:ascii="Calibri" w:eastAsia="Calibri" w:hAnsi="Calibri" w:cs="Calibri"/>
+          <w:i/>
+          <w:iCs/>
+          <w:color w:val="4A4A4A"/>
+        </w:rPr>
+        <w:t xml:space="preserve"> format is a defined convention, not just a helpful habit: many radios (including the Kenwood D700/D710 and similar mobile units) automatically parse a correctly formatted frequency from the first part of a station's comment and offer to tune to it directly. A comment like "146.520 Home" (with a space and no unit) will not be recognized by that auto-tune feature.</w:t>
+      </w:r>
+    </w:p>
     <w:p>
       <w:pPr>
         <w:spacing w:line="276" w:lineRule="auto"/>
@@ -6962,7 +6684,7 @@
           <w:left w:w="10" w:type="dxa"/>
           <w:right w:w="10" w:type="dxa"/>
         </w:tblCellMar>
-        <w:tblLook w:val="04A0" w:firstRow="1" w:lastRow="0" w:firstColumn="1" w:lastColumn="0" w:noHBand="0" w:noVBand="1"/>
+        <w:tblLook w:val="0000" w:firstRow="0" w:lastRow="0" w:firstColumn="0" w:lastColumn="0" w:noHBand="0" w:noVBand="0"/>
       </w:tblPr>
       <w:tblGrid>
         <w:gridCol w:w="1814"/>
@@ -7208,6 +6930,7 @@
                 <w:sz w:val="21"/>
                 <w:szCs w:val="21"/>
               </w:rPr>
+              <w:lastRenderedPageBreak/>
               <w:t>/ or @</w:t>
             </w:r>
           </w:p>
@@ -7415,7 +7138,6 @@
                 <w:sz w:val="21"/>
                 <w:szCs w:val="21"/>
               </w:rPr>
-              <w:lastRenderedPageBreak/>
               <w:t>;</w:t>
             </w:r>
           </w:p>
@@ -8191,6 +7913,7 @@
           <w:rFonts w:ascii="Calibri" w:eastAsia="Calibri" w:hAnsi="Calibri" w:cs="Calibri"/>
           <w:color w:val="1A1A1A"/>
         </w:rPr>
+        <w:lastRenderedPageBreak/>
         <w:t>KE4CON-1&gt;</w:t>
       </w:r>
       <w:proofErr w:type="gramStart"/>
@@ -8283,7 +8006,6 @@
           <w:sz w:val="22"/>
           <w:szCs w:val="22"/>
         </w:rPr>
-        <w:lastRenderedPageBreak/>
         <w:t>APRS messages have a 67-character limit for the message text. This is a protocol constraint from the original AX.25 information field limits.</w:t>
       </w:r>
     </w:p>
@@ -8302,7 +8024,7 @@
           <w:left w:w="10" w:type="dxa"/>
           <w:right w:w="10" w:type="dxa"/>
         </w:tblCellMar>
-        <w:tblLook w:val="04A0" w:firstRow="1" w:lastRow="0" w:firstColumn="1" w:lastColumn="0" w:noHBand="0" w:noVBand="1"/>
+        <w:tblLook w:val="0000" w:firstRow="0" w:lastRow="0" w:firstColumn="0" w:lastColumn="0" w:noHBand="0" w:noVBand="0"/>
       </w:tblPr>
       <w:tblGrid>
         <w:gridCol w:w="140"/>
@@ -8364,27 +8086,7 @@
                 <w:sz w:val="21"/>
                 <w:szCs w:val="21"/>
               </w:rPr>
-              <w:t xml:space="preserve">APRS messages are NOT private. They are transmitted over the shared APRS channel and forwarded by </w:t>
-            </w:r>
-            <w:proofErr w:type="spellStart"/>
-            <w:r>
-              <w:rPr>
-                <w:rFonts w:ascii="Calibri" w:eastAsia="Calibri" w:hAnsi="Calibri" w:cs="Calibri"/>
-                <w:color w:val="1A1A1A"/>
-                <w:sz w:val="21"/>
-                <w:szCs w:val="21"/>
-              </w:rPr>
-              <w:t>iGates</w:t>
-            </w:r>
-            <w:proofErr w:type="spellEnd"/>
-            <w:r>
-              <w:rPr>
-                <w:rFonts w:ascii="Calibri" w:eastAsia="Calibri" w:hAnsi="Calibri" w:cs="Calibri"/>
-                <w:color w:val="1A1A1A"/>
-                <w:sz w:val="21"/>
-                <w:szCs w:val="21"/>
-              </w:rPr>
-              <w:t xml:space="preserve"> to the global APRS-IS network, where they are visible to anyone monitoring. Never send sensitive information via APRS messages.</w:t>
+              <w:t>APRS messages are NOT private. They are transmitted over the shared APRS channel and forwarded by iGates to the global APRS-IS network, where they are visible to anyone monitoring. Never send sensitive information via APRS messages.</w:t>
             </w:r>
           </w:p>
         </w:tc>
@@ -8541,7 +8243,7 @@
           <w:left w:w="10" w:type="dxa"/>
           <w:right w:w="10" w:type="dxa"/>
         </w:tblCellMar>
-        <w:tblLook w:val="04A0" w:firstRow="1" w:lastRow="0" w:firstColumn="1" w:lastColumn="0" w:noHBand="0" w:noVBand="1"/>
+        <w:tblLook w:val="0000" w:firstRow="0" w:lastRow="0" w:firstColumn="0" w:lastColumn="0" w:noHBand="0" w:noVBand="0"/>
       </w:tblPr>
       <w:tblGrid>
         <w:gridCol w:w="2016"/>
@@ -9624,6 +9326,7 @@
           <w:sz w:val="22"/>
           <w:szCs w:val="22"/>
         </w:rPr>
+        <w:lastRenderedPageBreak/>
         <w:t>•  Incident command post locations</w:t>
       </w:r>
     </w:p>
@@ -9699,7 +9402,6 @@
           <w:sz w:val="22"/>
           <w:szCs w:val="22"/>
         </w:rPr>
-        <w:lastRenderedPageBreak/>
         <w:t>•  Points of interest for event participants</w:t>
       </w:r>
     </w:p>
@@ -10111,7 +9813,7 @@
           <w:left w:w="10" w:type="dxa"/>
           <w:right w:w="10" w:type="dxa"/>
         </w:tblCellMar>
-        <w:tblLook w:val="04A0" w:firstRow="1" w:lastRow="0" w:firstColumn="1" w:lastColumn="0" w:noHBand="0" w:noVBand="1"/>
+        <w:tblLook w:val="0000" w:firstRow="0" w:lastRow="0" w:firstColumn="0" w:lastColumn="0" w:noHBand="0" w:noVBand="0"/>
       </w:tblPr>
       <w:tblGrid>
         <w:gridCol w:w="10080"/>
@@ -10282,7 +9984,7 @@
           <w:left w:w="10" w:type="dxa"/>
           <w:right w:w="10" w:type="dxa"/>
         </w:tblCellMar>
-        <w:tblLook w:val="04A0" w:firstRow="1" w:lastRow="0" w:firstColumn="1" w:lastColumn="0" w:noHBand="0" w:noVBand="1"/>
+        <w:tblLook w:val="0000" w:firstRow="0" w:lastRow="0" w:firstColumn="0" w:lastColumn="0" w:noHBand="0" w:noVBand="0"/>
       </w:tblPr>
       <w:tblGrid>
         <w:gridCol w:w="140"/>
@@ -10437,7 +10139,7 @@
           <w:left w:w="10" w:type="dxa"/>
           <w:right w:w="10" w:type="dxa"/>
         </w:tblCellMar>
-        <w:tblLook w:val="04A0" w:firstRow="1" w:lastRow="0" w:firstColumn="1" w:lastColumn="0" w:noHBand="0" w:noVBand="1"/>
+        <w:tblLook w:val="0000" w:firstRow="0" w:lastRow="0" w:firstColumn="0" w:lastColumn="0" w:noHBand="0" w:noVBand="0"/>
       </w:tblPr>
       <w:tblGrid>
         <w:gridCol w:w="2520"/>
@@ -11193,7 +10895,7 @@
           <w:left w:w="10" w:type="dxa"/>
           <w:right w:w="10" w:type="dxa"/>
         </w:tblCellMar>
-        <w:tblLook w:val="04A0" w:firstRow="1" w:lastRow="0" w:firstColumn="1" w:lastColumn="0" w:noHBand="0" w:noVBand="1"/>
+        <w:tblLook w:val="0000" w:firstRow="0" w:lastRow="0" w:firstColumn="0" w:lastColumn="0" w:noHBand="0" w:noVBand="0"/>
       </w:tblPr>
       <w:tblGrid>
         <w:gridCol w:w="3225"/>
@@ -12034,27 +11736,7 @@
           <w:sz w:val="22"/>
           <w:szCs w:val="22"/>
         </w:rPr>
-        <w:t xml:space="preserve">Many home stations run as fill-in digipeaters. If you have a well-located home antenna and </w:t>
-      </w:r>
-      <w:proofErr w:type="spellStart"/>
-      <w:r>
-        <w:rPr>
-          <w:rFonts w:ascii="Calibri" w:eastAsia="Calibri" w:hAnsi="Calibri" w:cs="Calibri"/>
-          <w:color w:val="1A1A1A"/>
-          <w:sz w:val="22"/>
-          <w:szCs w:val="22"/>
-        </w:rPr>
-        <w:t>iGate</w:t>
-      </w:r>
-      <w:proofErr w:type="spellEnd"/>
-      <w:r>
-        <w:rPr>
-          <w:rFonts w:ascii="Calibri" w:eastAsia="Calibri" w:hAnsi="Calibri" w:cs="Calibri"/>
-          <w:color w:val="1A1A1A"/>
-          <w:sz w:val="22"/>
-          <w:szCs w:val="22"/>
-        </w:rPr>
-        <w:t>, adding fill-in digipeater capability to your station is a valuable contribution to the local APRS network.</w:t>
+        <w:t>Many home stations run as fill-in digipeaters. If you have a well-located home antenna and iGate, adding fill-in digipeater capability to your station is a valuable contribution to the local APRS network.</w:t>
       </w:r>
     </w:p>
     <w:p>
@@ -12321,7 +12003,7 @@
           <w:left w:w="10" w:type="dxa"/>
           <w:right w:w="10" w:type="dxa"/>
         </w:tblCellMar>
-        <w:tblLook w:val="04A0" w:firstRow="1" w:lastRow="0" w:firstColumn="1" w:lastColumn="0" w:noHBand="0" w:noVBand="1"/>
+        <w:tblLook w:val="0000" w:firstRow="0" w:lastRow="0" w:firstColumn="0" w:lastColumn="0" w:noHBand="0" w:noVBand="0"/>
       </w:tblPr>
       <w:tblGrid>
         <w:gridCol w:w="140"/>
@@ -12518,7 +12200,7 @@
           <w:left w:w="10" w:type="dxa"/>
           <w:right w:w="10" w:type="dxa"/>
         </w:tblCellMar>
-        <w:tblLook w:val="04A0" w:firstRow="1" w:lastRow="0" w:firstColumn="1" w:lastColumn="0" w:noHBand="0" w:noVBand="1"/>
+        <w:tblLook w:val="0000" w:firstRow="0" w:lastRow="0" w:firstColumn="0" w:lastColumn="0" w:noHBand="0" w:noVBand="0"/>
       </w:tblPr>
       <w:tblGrid>
         <w:gridCol w:w="140"/>
@@ -12632,7 +12314,7 @@
           <w:left w:w="10" w:type="dxa"/>
           <w:right w:w="10" w:type="dxa"/>
         </w:tblCellMar>
-        <w:tblLook w:val="04A0" w:firstRow="1" w:lastRow="0" w:firstColumn="1" w:lastColumn="0" w:noHBand="0" w:noVBand="1"/>
+        <w:tblLook w:val="0000" w:firstRow="0" w:lastRow="0" w:firstColumn="0" w:lastColumn="0" w:noHBand="0" w:noVBand="0"/>
       </w:tblPr>
       <w:tblGrid>
         <w:gridCol w:w="10080"/>
@@ -12751,27 +12433,7 @@
           <w:sz w:val="22"/>
           <w:szCs w:val="22"/>
         </w:rPr>
-        <w:t xml:space="preserve">When you connect APRS Command to APRS-IS, you receive a live stream of every APRS packet heard by </w:t>
-      </w:r>
-      <w:proofErr w:type="spellStart"/>
-      <w:r>
-        <w:rPr>
-          <w:rFonts w:ascii="Calibri" w:eastAsia="Calibri" w:hAnsi="Calibri" w:cs="Calibri"/>
-          <w:color w:val="1A1A1A"/>
-          <w:sz w:val="22"/>
-          <w:szCs w:val="22"/>
-        </w:rPr>
-        <w:t>iGate</w:t>
-      </w:r>
-      <w:proofErr w:type="spellEnd"/>
-      <w:r>
-        <w:rPr>
-          <w:rFonts w:ascii="Calibri" w:eastAsia="Calibri" w:hAnsi="Calibri" w:cs="Calibri"/>
-          <w:color w:val="1A1A1A"/>
-          <w:sz w:val="22"/>
-          <w:szCs w:val="22"/>
-        </w:rPr>
-        <w:t xml:space="preserve"> stations worldwide within your configured filter area. You can see stations from across your region, across the country, or anywhere in the world depending on your filter settings.</w:t>
+        <w:t>When you connect APRS Command to APRS-IS, you receive a live stream of every APRS packet heard by iGate stations worldwide within your configured filter area. You can see stations from across your region, across the country, or anywhere in the world depending on your filter settings.</w:t>
       </w:r>
     </w:p>
     <w:p>
@@ -12867,27 +12529,7 @@
           <w:sz w:val="22"/>
           <w:szCs w:val="22"/>
         </w:rPr>
-        <w:t xml:space="preserve">•  From </w:t>
-      </w:r>
-      <w:proofErr w:type="spellStart"/>
-      <w:r>
-        <w:rPr>
-          <w:rFonts w:ascii="Calibri" w:eastAsia="Calibri" w:hAnsi="Calibri" w:cs="Calibri"/>
-          <w:color w:val="1A1A1A"/>
-          <w:sz w:val="22"/>
-          <w:szCs w:val="22"/>
-        </w:rPr>
-        <w:t>iGate</w:t>
-      </w:r>
-      <w:proofErr w:type="spellEnd"/>
-      <w:r>
-        <w:rPr>
-          <w:rFonts w:ascii="Calibri" w:eastAsia="Calibri" w:hAnsi="Calibri" w:cs="Calibri"/>
-          <w:color w:val="1A1A1A"/>
-          <w:sz w:val="22"/>
-          <w:szCs w:val="22"/>
-        </w:rPr>
-        <w:t xml:space="preserve"> stations that receive RF packets and forward them to the internet</w:t>
+        <w:t>•  From iGate stations that receive RF packets and forward them to the internet</w:t>
       </w:r>
     </w:p>
     <w:p>
@@ -12966,47 +12608,7 @@
           <w:sz w:val="22"/>
           <w:szCs w:val="22"/>
         </w:rPr>
-        <w:t xml:space="preserve">•  To </w:t>
-      </w:r>
-      <w:proofErr w:type="spellStart"/>
-      <w:r>
-        <w:rPr>
-          <w:rFonts w:ascii="Calibri" w:eastAsia="Calibri" w:hAnsi="Calibri" w:cs="Calibri"/>
-          <w:color w:val="1A1A1A"/>
-          <w:sz w:val="22"/>
-          <w:szCs w:val="22"/>
-        </w:rPr>
-        <w:t>iGates</w:t>
-      </w:r>
-      <w:proofErr w:type="spellEnd"/>
-      <w:r>
-        <w:rPr>
-          <w:rFonts w:ascii="Calibri" w:eastAsia="Calibri" w:hAnsi="Calibri" w:cs="Calibri"/>
-          <w:color w:val="1A1A1A"/>
-          <w:sz w:val="22"/>
-          <w:szCs w:val="22"/>
-        </w:rPr>
-        <w:t xml:space="preserve"> that inject internet packets back onto the local RF network (bidirectional </w:t>
-      </w:r>
-      <w:proofErr w:type="spellStart"/>
-      <w:r>
-        <w:rPr>
-          <w:rFonts w:ascii="Calibri" w:eastAsia="Calibri" w:hAnsi="Calibri" w:cs="Calibri"/>
-          <w:color w:val="1A1A1A"/>
-          <w:sz w:val="22"/>
-          <w:szCs w:val="22"/>
-        </w:rPr>
-        <w:t>iGates</w:t>
-      </w:r>
-      <w:proofErr w:type="spellEnd"/>
-      <w:r>
-        <w:rPr>
-          <w:rFonts w:ascii="Calibri" w:eastAsia="Calibri" w:hAnsi="Calibri" w:cs="Calibri"/>
-          <w:color w:val="1A1A1A"/>
-          <w:sz w:val="22"/>
-          <w:szCs w:val="22"/>
-        </w:rPr>
-        <w:t>)</w:t>
+        <w:t>•  To iGates that inject internet packets back onto the local RF network (bidirectional iGates)</w:t>
       </w:r>
     </w:p>
     <w:p>
@@ -13027,9 +12629,9 @@
           <w:sz w:val="24"/>
           <w:szCs w:val="24"/>
         </w:rPr>
-        <w:t xml:space="preserve">5.3  </w:t>
-      </w:r>
-      <w:proofErr w:type="spellStart"/>
+        <w:t>5.3  iGates</w:t>
+      </w:r>
+      <w:proofErr w:type="gramEnd"/>
       <w:r>
         <w:rPr>
           <w:rFonts w:ascii="Calibri" w:eastAsia="Calibri" w:hAnsi="Calibri" w:cs="Calibri"/>
@@ -13039,19 +12641,6 @@
           <w:sz w:val="24"/>
           <w:szCs w:val="24"/>
         </w:rPr>
-        <w:t>iGates</w:t>
-      </w:r>
-      <w:proofErr w:type="spellEnd"/>
-      <w:proofErr w:type="gramEnd"/>
-      <w:r>
-        <w:rPr>
-          <w:rFonts w:ascii="Calibri" w:eastAsia="Calibri" w:hAnsi="Calibri" w:cs="Calibri"/>
-          <w:b/>
-          <w:bCs/>
-          <w:color w:val="1A56A0"/>
-          <w:sz w:val="24"/>
-          <w:szCs w:val="24"/>
-        </w:rPr>
         <w:t>: Bridging RF and Internet</w:t>
       </w:r>
     </w:p>
@@ -13066,47 +12655,7 @@
           <w:sz w:val="22"/>
           <w:szCs w:val="22"/>
         </w:rPr>
-        <w:t xml:space="preserve">An </w:t>
-      </w:r>
-      <w:proofErr w:type="spellStart"/>
-      <w:r>
-        <w:rPr>
-          <w:rFonts w:ascii="Calibri" w:eastAsia="Calibri" w:hAnsi="Calibri" w:cs="Calibri"/>
-          <w:color w:val="1A1A1A"/>
-          <w:sz w:val="22"/>
-          <w:szCs w:val="22"/>
-        </w:rPr>
-        <w:t>iGate</w:t>
-      </w:r>
-      <w:proofErr w:type="spellEnd"/>
-      <w:r>
-        <w:rPr>
-          <w:rFonts w:ascii="Calibri" w:eastAsia="Calibri" w:hAnsi="Calibri" w:cs="Calibri"/>
-          <w:color w:val="1A1A1A"/>
-          <w:sz w:val="22"/>
-          <w:szCs w:val="22"/>
-        </w:rPr>
-        <w:t xml:space="preserve"> (internet gateway) is an APRS station that bridges the local RF network and APRS-IS. </w:t>
-      </w:r>
-      <w:proofErr w:type="spellStart"/>
-      <w:r>
-        <w:rPr>
-          <w:rFonts w:ascii="Calibri" w:eastAsia="Calibri" w:hAnsi="Calibri" w:cs="Calibri"/>
-          <w:color w:val="1A1A1A"/>
-          <w:sz w:val="22"/>
-          <w:szCs w:val="22"/>
-        </w:rPr>
-        <w:t>iGates</w:t>
-      </w:r>
-      <w:proofErr w:type="spellEnd"/>
-      <w:r>
-        <w:rPr>
-          <w:rFonts w:ascii="Calibri" w:eastAsia="Calibri" w:hAnsi="Calibri" w:cs="Calibri"/>
-          <w:color w:val="1A1A1A"/>
-          <w:sz w:val="22"/>
-          <w:szCs w:val="22"/>
-        </w:rPr>
-        <w:t xml:space="preserve"> are the critical infrastructure that make APRS-IS useful.</w:t>
+        <w:t>An iGate (internet gateway) is an APRS station that bridges the local RF network and APRS-IS. iGates are the critical infrastructure that make APRS-IS useful.</w:t>
       </w:r>
     </w:p>
     <w:tbl>
@@ -13124,7 +12673,7 @@
           <w:left w:w="10" w:type="dxa"/>
           <w:right w:w="10" w:type="dxa"/>
         </w:tblCellMar>
-        <w:tblLook w:val="04A0" w:firstRow="1" w:lastRow="0" w:firstColumn="1" w:lastColumn="0" w:noHBand="0" w:noVBand="1"/>
+        <w:tblLook w:val="0000" w:firstRow="0" w:lastRow="0" w:firstColumn="0" w:lastColumn="0" w:noHBand="0" w:noVBand="0"/>
       </w:tblPr>
       <w:tblGrid>
         <w:gridCol w:w="2822"/>
@@ -13155,7 +12704,6 @@
             <w:pPr>
               <w:spacing w:line="276" w:lineRule="auto"/>
             </w:pPr>
-            <w:proofErr w:type="spellStart"/>
             <w:r>
               <w:rPr>
                 <w:rFonts w:ascii="Calibri" w:eastAsia="Calibri" w:hAnsi="Calibri" w:cs="Calibri"/>
@@ -13163,17 +12711,7 @@
                 <w:bCs/>
                 <w:color w:val="FFFFFF"/>
               </w:rPr>
-              <w:t>iGate</w:t>
-            </w:r>
-            <w:proofErr w:type="spellEnd"/>
-            <w:r>
-              <w:rPr>
-                <w:rFonts w:ascii="Calibri" w:eastAsia="Calibri" w:hAnsi="Calibri" w:cs="Calibri"/>
-                <w:b/>
-                <w:bCs/>
-                <w:color w:val="FFFFFF"/>
-              </w:rPr>
-              <w:t xml:space="preserve"> Type</w:t>
+              <w:t>iGate Type</w:t>
             </w:r>
           </w:p>
         </w:tc>
@@ -13238,19 +12776,8 @@
                 <w:sz w:val="21"/>
                 <w:szCs w:val="21"/>
               </w:rPr>
-              <w:t xml:space="preserve">Receive-only (Rx) </w:t>
-            </w:r>
-            <w:proofErr w:type="spellStart"/>
-            <w:r>
-              <w:rPr>
-                <w:rFonts w:ascii="Calibri" w:eastAsia="Calibri" w:hAnsi="Calibri" w:cs="Calibri"/>
-                <w:color w:val="1A1A1A"/>
-                <w:sz w:val="21"/>
-                <w:szCs w:val="21"/>
-              </w:rPr>
-              <w:t>iGate</w:t>
-            </w:r>
-            <w:proofErr w:type="spellEnd"/>
+              <w:t>Receive-only (Rx) iGate</w:t>
+            </w:r>
           </w:p>
         </w:tc>
         <w:tc>
@@ -13314,7 +12841,36 @@
                 <w:sz w:val="21"/>
                 <w:szCs w:val="21"/>
               </w:rPr>
-              <w:t xml:space="preserve">Transmit-capable (Tx) </w:t>
+              <w:t>Transmit-capable (Tx) iGate (bidirectional)</w:t>
+            </w:r>
+          </w:p>
+        </w:tc>
+        <w:tc>
+          <w:tcPr>
+            <w:tcW w:w="7257" w:type="dxa"/>
+            <w:tcBorders>
+              <w:bottom w:val="single" w:sz="2" w:space="0" w:color="D0D8E0"/>
+            </w:tcBorders>
+            <w:shd w:val="clear" w:color="auto" w:fill="F4F6F8"/>
+            <w:tcMar>
+              <w:top w:w="100" w:type="dxa"/>
+              <w:left w:w="160" w:type="dxa"/>
+              <w:bottom w:w="100" w:type="dxa"/>
+              <w:right w:w="160" w:type="dxa"/>
+            </w:tcMar>
+          </w:tcPr>
+          <w:p>
+            <w:pPr>
+              <w:spacing w:line="276" w:lineRule="auto"/>
+            </w:pPr>
+            <w:r>
+              <w:rPr>
+                <w:rFonts w:ascii="Calibri" w:eastAsia="Calibri" w:hAnsi="Calibri" w:cs="Calibri"/>
+                <w:color w:val="1A1A1A"/>
+                <w:sz w:val="21"/>
+                <w:szCs w:val="21"/>
+              </w:rPr>
+              <w:t xml:space="preserve">Both receives and forwards </w:t>
             </w:r>
             <w:proofErr w:type="spellStart"/>
             <w:r>
@@ -13324,7 +12880,7 @@
                 <w:sz w:val="21"/>
                 <w:szCs w:val="21"/>
               </w:rPr>
-              <w:t>iGate</w:t>
+              <w:t>RF→internet</w:t>
             </w:r>
             <w:proofErr w:type="spellEnd"/>
             <w:r>
@@ -13334,56 +12890,7 @@
                 <w:sz w:val="21"/>
                 <w:szCs w:val="21"/>
               </w:rPr>
-              <w:t xml:space="preserve"> (bidirectional)</w:t>
-            </w:r>
-          </w:p>
-        </w:tc>
-        <w:tc>
-          <w:tcPr>
-            <w:tcW w:w="7257" w:type="dxa"/>
-            <w:tcBorders>
-              <w:bottom w:val="single" w:sz="2" w:space="0" w:color="D0D8E0"/>
-            </w:tcBorders>
-            <w:shd w:val="clear" w:color="auto" w:fill="F4F6F8"/>
-            <w:tcMar>
-              <w:top w:w="100" w:type="dxa"/>
-              <w:left w:w="160" w:type="dxa"/>
-              <w:bottom w:w="100" w:type="dxa"/>
-              <w:right w:w="160" w:type="dxa"/>
-            </w:tcMar>
-          </w:tcPr>
-          <w:p>
-            <w:pPr>
-              <w:spacing w:line="276" w:lineRule="auto"/>
-            </w:pPr>
-            <w:r>
-              <w:rPr>
-                <w:rFonts w:ascii="Calibri" w:eastAsia="Calibri" w:hAnsi="Calibri" w:cs="Calibri"/>
-                <w:color w:val="1A1A1A"/>
-                <w:sz w:val="21"/>
-                <w:szCs w:val="21"/>
-              </w:rPr>
-              <w:t xml:space="preserve">Both receives and forwards </w:t>
-            </w:r>
-            <w:proofErr w:type="spellStart"/>
-            <w:r>
-              <w:rPr>
-                <w:rFonts w:ascii="Calibri" w:eastAsia="Calibri" w:hAnsi="Calibri" w:cs="Calibri"/>
-                <w:color w:val="1A1A1A"/>
-                <w:sz w:val="21"/>
-                <w:szCs w:val="21"/>
-              </w:rPr>
-              <w:t>RF→internet</w:t>
-            </w:r>
-            <w:proofErr w:type="spellEnd"/>
-            <w:r>
-              <w:rPr>
-                <w:rFonts w:ascii="Calibri" w:eastAsia="Calibri" w:hAnsi="Calibri" w:cs="Calibri"/>
-                <w:color w:val="1A1A1A"/>
-                <w:sz w:val="21"/>
-                <w:szCs w:val="21"/>
-              </w:rPr>
-              <w:t xml:space="preserve"> AND injects APRS-IS packets onto the local RF network. Allows APRS messages from internet-only stations to reach RF stations.</w:t>
+              <w:t xml:space="preserve"> AND injects APRS-IS packets onto the local RF network. This makes end-to-end message delivery possible regardless of where either party is: a message can originate on RF, cross APRS-IS to anywhere in the world, and then get forwarded back onto RF in whichever area last heard the addressee — not just messages that started out on the internet side. Bidirectional iGates are encouraged to support messaging for exactly this reason.</w:t>
             </w:r>
           </w:p>
         </w:tc>
@@ -13405,47 +12912,8 @@
           <w:sz w:val="22"/>
           <w:szCs w:val="22"/>
         </w:rPr>
-        <w:t xml:space="preserve">Running an </w:t>
-      </w:r>
-      <w:proofErr w:type="spellStart"/>
-      <w:r>
-        <w:rPr>
-          <w:rFonts w:ascii="Calibri" w:eastAsia="Calibri" w:hAnsi="Calibri" w:cs="Calibri"/>
-          <w:color w:val="1A1A1A"/>
-          <w:sz w:val="22"/>
-          <w:szCs w:val="22"/>
-        </w:rPr>
-        <w:t>iGate</w:t>
-      </w:r>
-      <w:proofErr w:type="spellEnd"/>
-      <w:r>
-        <w:rPr>
-          <w:rFonts w:ascii="Calibri" w:eastAsia="Calibri" w:hAnsi="Calibri" w:cs="Calibri"/>
-          <w:color w:val="1A1A1A"/>
-          <w:sz w:val="22"/>
-          <w:szCs w:val="22"/>
-        </w:rPr>
-        <w:t xml:space="preserve"> with a good antenna is one of the most valuable contributions an amateur radio operator can make to the local APRS network. Every </w:t>
-      </w:r>
-      <w:proofErr w:type="spellStart"/>
-      <w:r>
-        <w:rPr>
-          <w:rFonts w:ascii="Calibri" w:eastAsia="Calibri" w:hAnsi="Calibri" w:cs="Calibri"/>
-          <w:color w:val="1A1A1A"/>
-          <w:sz w:val="22"/>
-          <w:szCs w:val="22"/>
-        </w:rPr>
-        <w:t>iGate</w:t>
-      </w:r>
-      <w:proofErr w:type="spellEnd"/>
-      <w:r>
-        <w:rPr>
-          <w:rFonts w:ascii="Calibri" w:eastAsia="Calibri" w:hAnsi="Calibri" w:cs="Calibri"/>
-          <w:color w:val="1A1A1A"/>
-          <w:sz w:val="22"/>
-          <w:szCs w:val="22"/>
-        </w:rPr>
-        <w:t xml:space="preserve"> extends the reach of the network and improves coverage for mobile and portable stations in the area.</w:t>
+        <w:lastRenderedPageBreak/>
+        <w:t>Running an iGate with a good antenna is one of the most valuable contributions an amateur radio operator can make to the local APRS network. Every iGate extends the reach of the network and improves coverage for mobile and portable stations in the area.</w:t>
       </w:r>
     </w:p>
     <w:tbl>
@@ -13463,7 +12931,7 @@
           <w:left w:w="10" w:type="dxa"/>
           <w:right w:w="10" w:type="dxa"/>
         </w:tblCellMar>
-        <w:tblLook w:val="04A0" w:firstRow="1" w:lastRow="0" w:firstColumn="1" w:lastColumn="0" w:noHBand="0" w:noVBand="1"/>
+        <w:tblLook w:val="0000" w:firstRow="0" w:lastRow="0" w:firstColumn="0" w:lastColumn="0" w:noHBand="0" w:noVBand="0"/>
       </w:tblPr>
       <w:tblGrid>
         <w:gridCol w:w="140"/>
@@ -13525,47 +12993,7 @@
                 <w:sz w:val="21"/>
                 <w:szCs w:val="21"/>
               </w:rPr>
-              <w:t xml:space="preserve">A receive-only </w:t>
-            </w:r>
-            <w:proofErr w:type="spellStart"/>
-            <w:r>
-              <w:rPr>
-                <w:rFonts w:ascii="Calibri" w:eastAsia="Calibri" w:hAnsi="Calibri" w:cs="Calibri"/>
-                <w:color w:val="1A1A1A"/>
-                <w:sz w:val="21"/>
-                <w:szCs w:val="21"/>
-              </w:rPr>
-              <w:t>iGate</w:t>
-            </w:r>
-            <w:proofErr w:type="spellEnd"/>
-            <w:r>
-              <w:rPr>
-                <w:rFonts w:ascii="Calibri" w:eastAsia="Calibri" w:hAnsi="Calibri" w:cs="Calibri"/>
-                <w:color w:val="1A1A1A"/>
-                <w:sz w:val="21"/>
-                <w:szCs w:val="21"/>
-              </w:rPr>
-              <w:t xml:space="preserve"> can be built with a Raspberry Pi, a $20 RTL-SDR receiver, </w:t>
-            </w:r>
-            <w:proofErr w:type="spellStart"/>
-            <w:r>
-              <w:rPr>
-                <w:rFonts w:ascii="Calibri" w:eastAsia="Calibri" w:hAnsi="Calibri" w:cs="Calibri"/>
-                <w:color w:val="1A1A1A"/>
-                <w:sz w:val="21"/>
-                <w:szCs w:val="21"/>
-              </w:rPr>
-              <w:t>Direwolf</w:t>
-            </w:r>
-            <w:proofErr w:type="spellEnd"/>
-            <w:r>
-              <w:rPr>
-                <w:rFonts w:ascii="Calibri" w:eastAsia="Calibri" w:hAnsi="Calibri" w:cs="Calibri"/>
-                <w:color w:val="1A1A1A"/>
-                <w:sz w:val="21"/>
-                <w:szCs w:val="21"/>
-              </w:rPr>
-              <w:t xml:space="preserve"> software, and a simple antenna. The startup cost is very low and the contribution to the local network is significant.</w:t>
+              <w:t>A receive-only iGate can be built with a Raspberry Pi, a $20 RTL-SDR receiver, Direwolf software, and a simple antenna. The startup cost is very low and the contribution to the local network is significant.</w:t>
             </w:r>
           </w:p>
         </w:tc>
@@ -13620,7 +13048,27 @@
           <w:sz w:val="22"/>
           <w:szCs w:val="22"/>
         </w:rPr>
-        <w:t>When you connect to APRS-IS, the server can send you all packets globally — which would be an enormous data stream — or a filtered subset based on your requirements. Filter strings tell the server what to send you.</w:t>
+        <w:t xml:space="preserve">When you connect to APRS-IS, the server can send you all packets globally — which would be an enormous data stream — or a filtered subset based on your requirements. Filter strings tell the server what to send you. In most cases the default filter your software applies is fine as-is; requesting anything beyond it is </w:t>
+      </w:r>
+      <w:proofErr w:type="gramStart"/>
+      <w:r>
+        <w:rPr>
+          <w:rFonts w:ascii="Calibri" w:eastAsia="Calibri" w:hAnsi="Calibri" w:cs="Calibri"/>
+          <w:color w:val="1A1A1A"/>
+          <w:sz w:val="22"/>
+          <w:szCs w:val="22"/>
+        </w:rPr>
+        <w:t>really only</w:t>
+      </w:r>
+      <w:proofErr w:type="gramEnd"/>
+      <w:r>
+        <w:rPr>
+          <w:rFonts w:ascii="Calibri" w:eastAsia="Calibri" w:hAnsi="Calibri" w:cs="Calibri"/>
+          <w:color w:val="1A1A1A"/>
+          <w:sz w:val="22"/>
+          <w:szCs w:val="22"/>
+        </w:rPr>
+        <w:t xml:space="preserve"> needed in special cases, such as a non-RF station wanting visibility into a specific local area.</w:t>
       </w:r>
     </w:p>
     <w:p>
@@ -13662,7 +13110,7 @@
           <w:sz w:val="22"/>
           <w:szCs w:val="22"/>
         </w:rPr>
-        <w:t>This filter requests all packets within 150 kilometers of the coordinates 41.9756°N, 88.4553°W. The distance in the APRS-IS filter string is always in kilometers, regardless of the unit preference in your software.</w:t>
+        <w:t>This filter requests all packets within 150 kilometers of the coordinates 41.9756°N, 88.4553°W. The distance in the APRS-IS filter string is always in kilometers, regardless of the unit preference in your software. A range filter like this is particularly useful for a station with no RF presence at all — someone monitoring purely over the internet who wants to see what's happening in a specific area, such as before traveling somewhere or supporting a remote net.</w:t>
       </w:r>
     </w:p>
     <w:tbl>
@@ -13680,7 +13128,7 @@
           <w:left w:w="10" w:type="dxa"/>
           <w:right w:w="10" w:type="dxa"/>
         </w:tblCellMar>
-        <w:tblLook w:val="04A0" w:firstRow="1" w:lastRow="0" w:firstColumn="1" w:lastColumn="0" w:noHBand="0" w:noVBand="1"/>
+        <w:tblLook w:val="0000" w:firstRow="0" w:lastRow="0" w:firstColumn="0" w:lastColumn="0" w:noHBand="0" w:noVBand="0"/>
       </w:tblPr>
       <w:tblGrid>
         <w:gridCol w:w="2520"/>
@@ -14420,32 +13868,49 @@
                 <w:sz w:val="21"/>
                 <w:szCs w:val="21"/>
               </w:rPr>
-              <w:t xml:space="preserve">Packets that entered APRS-IS through </w:t>
-            </w:r>
-            <w:proofErr w:type="spellStart"/>
-            <w:r>
-              <w:rPr>
-                <w:rFonts w:ascii="Calibri" w:eastAsia="Calibri" w:hAnsi="Calibri" w:cs="Calibri"/>
-                <w:color w:val="1A1A1A"/>
-                <w:sz w:val="21"/>
-                <w:szCs w:val="21"/>
-              </w:rPr>
-              <w:t>iGate</w:t>
-            </w:r>
-            <w:proofErr w:type="spellEnd"/>
-            <w:r>
-              <w:rPr>
-                <w:rFonts w:ascii="Calibri" w:eastAsia="Calibri" w:hAnsi="Calibri" w:cs="Calibri"/>
-                <w:color w:val="1A1A1A"/>
-                <w:sz w:val="21"/>
-                <w:szCs w:val="21"/>
-              </w:rPr>
-              <w:t xml:space="preserve"> W9XYZ-10</w:t>
+              <w:t>Packets that entered APRS-IS through iGate W9XYZ-10</w:t>
             </w:r>
           </w:p>
         </w:tc>
       </w:tr>
     </w:tbl>
+    <w:p>
+      <w:pPr>
+        <w:spacing w:before="80" w:after="120" w:line="276" w:lineRule="auto"/>
+      </w:pPr>
+      <w:r>
+        <w:rPr>
+          <w:rFonts w:ascii="Calibri" w:eastAsia="Calibri" w:hAnsi="Calibri" w:cs="Calibri"/>
+          <w:b/>
+          <w:bCs/>
+          <w:color w:val="B00020"/>
+        </w:rPr>
+        <w:t xml:space="preserve">Important: </w:t>
+      </w:r>
+      <w:r>
+        <w:rPr>
+          <w:rFonts w:ascii="Calibri" w:eastAsia="Calibri" w:hAnsi="Calibri" w:cs="Calibri"/>
+          <w:color w:val="1A1A1A"/>
+        </w:rPr>
+        <w:t xml:space="preserve">A bidirectional iGate should never re-transmit onto RF any activity that originated on RF and was picked up from APRS-IS — including RF traffic gated in by other nearby iGates. Doing so creates a feedback loop: stations end up hearing their own (or their neighbors') traffic </w:t>
+      </w:r>
+      <w:proofErr w:type="gramStart"/>
+      <w:r>
+        <w:rPr>
+          <w:rFonts w:ascii="Calibri" w:eastAsia="Calibri" w:hAnsi="Calibri" w:cs="Calibri"/>
+          <w:color w:val="1A1A1A"/>
+        </w:rPr>
+        <w:t>echoed</w:t>
+      </w:r>
+      <w:proofErr w:type="gramEnd"/>
+      <w:r>
+        <w:rPr>
+          <w:rFonts w:ascii="Calibri" w:eastAsia="Calibri" w:hAnsi="Calibri" w:cs="Calibri"/>
+          <w:color w:val="1A1A1A"/>
+        </w:rPr>
+        <w:t xml:space="preserve"> back at them a second time after a round trip through the internet, wasting channel capacity for no benefit. This is a real, observed misconfiguration in the field, not just a theoretical concern — double-check your iGate software's RF gating rules if you run a bidirectional iGate.</w:t>
+      </w:r>
+    </w:p>
     <w:p>
       <w:pPr>
         <w:spacing w:line="276" w:lineRule="auto"/>
@@ -14469,6 +13934,7 @@
           <w:sz w:val="24"/>
           <w:szCs w:val="24"/>
         </w:rPr>
+        <w:lastRenderedPageBreak/>
         <w:t>5.5  Passcodes</w:t>
       </w:r>
       <w:proofErr w:type="gramEnd"/>
@@ -14527,7 +13993,7 @@
           <w:left w:w="10" w:type="dxa"/>
           <w:right w:w="10" w:type="dxa"/>
         </w:tblCellMar>
-        <w:tblLook w:val="04A0" w:firstRow="1" w:lastRow="0" w:firstColumn="1" w:lastColumn="0" w:noHBand="0" w:noVBand="1"/>
+        <w:tblLook w:val="0000" w:firstRow="0" w:lastRow="0" w:firstColumn="0" w:lastColumn="0" w:noHBand="0" w:noVBand="0"/>
       </w:tblPr>
       <w:tblGrid>
         <w:gridCol w:w="140"/>
@@ -14611,7 +14077,6 @@
           <w:sz w:val="22"/>
           <w:szCs w:val="22"/>
         </w:rPr>
-        <w:lastRenderedPageBreak/>
         <w:t>To receive APRS-IS data without transmitting, use -1 as your passcode. The server allows connections with -1 but marks them as read-only. All modern APRS clients support this mode.</w:t>
       </w:r>
     </w:p>
@@ -14659,27 +14124,7 @@
           <w:sz w:val="22"/>
           <w:szCs w:val="22"/>
         </w:rPr>
-        <w:t xml:space="preserve">APRS-IS carries traffic from hundreds of thousands of </w:t>
-      </w:r>
-      <w:proofErr w:type="spellStart"/>
-      <w:r>
-        <w:rPr>
-          <w:rFonts w:ascii="Calibri" w:eastAsia="Calibri" w:hAnsi="Calibri" w:cs="Calibri"/>
-          <w:color w:val="1A1A1A"/>
-          <w:sz w:val="22"/>
-          <w:szCs w:val="22"/>
-        </w:rPr>
-        <w:t>iGate</w:t>
-      </w:r>
-      <w:proofErr w:type="spellEnd"/>
-      <w:r>
-        <w:rPr>
-          <w:rFonts w:ascii="Calibri" w:eastAsia="Calibri" w:hAnsi="Calibri" w:cs="Calibri"/>
-          <w:color w:val="1A1A1A"/>
-          <w:sz w:val="22"/>
-          <w:szCs w:val="22"/>
-        </w:rPr>
-        <w:t xml:space="preserve"> stations worldwide. The data is publicly accessible — tools like aprs.fi allow anyone to track any APRS station globally in real time through a web browser.</w:t>
+        <w:t>APRS-IS carries traffic from hundreds of thousands of iGate stations worldwide. The data is publicly accessible — tools like aprs.fi allow anyone to track any APRS station globally in real time through a web browser.</w:t>
       </w:r>
     </w:p>
     <w:p>
@@ -14693,7 +14138,27 @@
           <w:sz w:val="22"/>
           <w:szCs w:val="22"/>
         </w:rPr>
-        <w:t>Key APRS-IS servers for client connections:</w:t>
+        <w:t xml:space="preserve">Key APRS-IS </w:t>
+      </w:r>
+      <w:proofErr w:type="gramStart"/>
+      <w:r>
+        <w:rPr>
+          <w:rFonts w:ascii="Calibri" w:eastAsia="Calibri" w:hAnsi="Calibri" w:cs="Calibri"/>
+          <w:color w:val="1A1A1A"/>
+          <w:sz w:val="22"/>
+          <w:szCs w:val="22"/>
+        </w:rPr>
+        <w:t>servers for</w:t>
+      </w:r>
+      <w:proofErr w:type="gramEnd"/>
+      <w:r>
+        <w:rPr>
+          <w:rFonts w:ascii="Calibri" w:eastAsia="Calibri" w:hAnsi="Calibri" w:cs="Calibri"/>
+          <w:color w:val="1A1A1A"/>
+          <w:sz w:val="22"/>
+          <w:szCs w:val="22"/>
+        </w:rPr>
+        <w:t xml:space="preserve"> client connections. A regional server should normally be your default choice:</w:t>
       </w:r>
     </w:p>
     <w:tbl>
@@ -14711,7 +14176,7 @@
           <w:left w:w="10" w:type="dxa"/>
           <w:right w:w="10" w:type="dxa"/>
         </w:tblCellMar>
-        <w:tblLook w:val="04A0" w:firstRow="1" w:lastRow="0" w:firstColumn="1" w:lastColumn="0" w:noHBand="0" w:noVBand="1"/>
+        <w:tblLook w:val="0000" w:firstRow="0" w:lastRow="0" w:firstColumn="0" w:lastColumn="0" w:noHBand="0" w:noVBand="0"/>
       </w:tblPr>
       <w:tblGrid>
         <w:gridCol w:w="3528"/>
@@ -14900,7 +14365,27 @@
                 <w:sz w:val="21"/>
                 <w:szCs w:val="21"/>
               </w:rPr>
-              <w:t>Automatically selects the best available server. Use this for most clients.</w:t>
+              <w:t xml:space="preserve">Round-robin DNS across the whole pool, not a proximity-based selection — despite the name, it does not try to find you the nearest </w:t>
+            </w:r>
+            <w:proofErr w:type="gramStart"/>
+            <w:r>
+              <w:rPr>
+                <w:rFonts w:ascii="Calibri" w:eastAsia="Calibri" w:hAnsi="Calibri" w:cs="Calibri"/>
+                <w:color w:val="1A1A1A"/>
+                <w:sz w:val="21"/>
+                <w:szCs w:val="21"/>
+              </w:rPr>
+              <w:t>server, and</w:t>
+            </w:r>
+            <w:proofErr w:type="gramEnd"/>
+            <w:r>
+              <w:rPr>
+                <w:rFonts w:ascii="Calibri" w:eastAsia="Calibri" w:hAnsi="Calibri" w:cs="Calibri"/>
+                <w:color w:val="1A1A1A"/>
+                <w:sz w:val="21"/>
+                <w:szCs w:val="21"/>
+              </w:rPr>
+              <w:t xml:space="preserve"> can just as easily hand you one on the other side of the world. Prefer a regional server below for normal use.</w:t>
             </w:r>
           </w:p>
         </w:tc>
@@ -15306,7 +14791,7 @@
           <w:left w:w="10" w:type="dxa"/>
           <w:right w:w="10" w:type="dxa"/>
         </w:tblCellMar>
-        <w:tblLook w:val="04A0" w:firstRow="1" w:lastRow="0" w:firstColumn="1" w:lastColumn="0" w:noHBand="0" w:noVBand="1"/>
+        <w:tblLook w:val="0000" w:firstRow="0" w:lastRow="0" w:firstColumn="0" w:lastColumn="0" w:noHBand="0" w:noVBand="0"/>
       </w:tblPr>
       <w:tblGrid>
         <w:gridCol w:w="10080"/>
@@ -15499,7 +14984,27 @@
           <w:sz w:val="22"/>
           <w:szCs w:val="22"/>
         </w:rPr>
-        <w:t>The tradeoff is significant: HF propagation is complex and variable, HF data rates are lower, and HF antennas are much larger than VHF antennas. HF APRS is a specialized tool for specific situations, not a replacement for VHF.</w:t>
+        <w:t>The tradeoff is significant: HF propagation is complex and variable, HF data rates are lower, and HF antennas are much larger than VHF antennas. HF APRS is a specialized tool for specific situations, not a replacement for VHF. This primer covers the basics; for a deeper, actively maintained treatment of HF APRS specifics, wa8lmf.net/</w:t>
+      </w:r>
+      <w:proofErr w:type="spellStart"/>
+      <w:r>
+        <w:rPr>
+          <w:rFonts w:ascii="Calibri" w:eastAsia="Calibri" w:hAnsi="Calibri" w:cs="Calibri"/>
+          <w:color w:val="1A1A1A"/>
+          <w:sz w:val="22"/>
+          <w:szCs w:val="22"/>
+        </w:rPr>
+        <w:t>aprs</w:t>
+      </w:r>
+      <w:proofErr w:type="spellEnd"/>
+      <w:r>
+        <w:rPr>
+          <w:rFonts w:ascii="Calibri" w:eastAsia="Calibri" w:hAnsi="Calibri" w:cs="Calibri"/>
+          <w:color w:val="1A1A1A"/>
+          <w:sz w:val="22"/>
+          <w:szCs w:val="22"/>
+        </w:rPr>
+        <w:t>/HF_APRS_Notes.htm is a well-regarded reference within the APRS community.</w:t>
       </w:r>
     </w:p>
     <w:p>
@@ -15550,7 +15055,7 @@
           <w:left w:w="10" w:type="dxa"/>
           <w:right w:w="10" w:type="dxa"/>
         </w:tblCellMar>
-        <w:tblLook w:val="04A0" w:firstRow="1" w:lastRow="0" w:firstColumn="1" w:lastColumn="0" w:noHBand="0" w:noVBand="1"/>
+        <w:tblLook w:val="0000" w:firstRow="0" w:lastRow="0" w:firstColumn="0" w:lastColumn="0" w:noHBand="0" w:noVBand="0"/>
       </w:tblPr>
       <w:tblGrid>
         <w:gridCol w:w="1814"/>
@@ -16020,7 +15525,7 @@
           <w:left w:w="10" w:type="dxa"/>
           <w:right w:w="10" w:type="dxa"/>
         </w:tblCellMar>
-        <w:tblLook w:val="04A0" w:firstRow="1" w:lastRow="0" w:firstColumn="1" w:lastColumn="0" w:noHBand="0" w:noVBand="1"/>
+        <w:tblLook w:val="0000" w:firstRow="0" w:lastRow="0" w:firstColumn="0" w:lastColumn="0" w:noHBand="0" w:noVBand="0"/>
       </w:tblPr>
       <w:tblGrid>
         <w:gridCol w:w="140"/>
@@ -16155,7 +15660,7 @@
           <w:left w:w="10" w:type="dxa"/>
           <w:right w:w="10" w:type="dxa"/>
         </w:tblCellMar>
-        <w:tblLook w:val="04A0" w:firstRow="1" w:lastRow="0" w:firstColumn="1" w:lastColumn="0" w:noHBand="0" w:noVBand="1"/>
+        <w:tblLook w:val="0000" w:firstRow="0" w:lastRow="0" w:firstColumn="0" w:lastColumn="0" w:noHBand="0" w:noVBand="0"/>
       </w:tblPr>
       <w:tblGrid>
         <w:gridCol w:w="2520"/>
@@ -16194,6 +15699,7 @@
                 <w:bCs/>
                 <w:color w:val="FFFFFF"/>
               </w:rPr>
+              <w:lastRenderedPageBreak/>
               <w:t>Aspect</w:t>
             </w:r>
           </w:p>
@@ -16381,7 +15887,6 @@
                 <w:sz w:val="21"/>
                 <w:szCs w:val="21"/>
               </w:rPr>
-              <w:lastRenderedPageBreak/>
               <w:t>Data rate</w:t>
             </w:r>
           </w:p>
@@ -16440,7 +15945,7 @@
                 <w:sz w:val="21"/>
                 <w:szCs w:val="21"/>
               </w:rPr>
-              <w:t>300 baud (most common) or 1200 baud</w:t>
+              <w:t>300 baud (the standard for HF APRS; the audio tone shift is 200 Hz, much narrower than VHF's 1000 Hz)</w:t>
             </w:r>
           </w:p>
         </w:tc>
@@ -16981,31 +16486,7 @@
           <w:sz w:val="24"/>
           <w:szCs w:val="24"/>
         </w:rPr>
-        <w:t xml:space="preserve"> Packet Radio (</w:t>
-      </w:r>
-      <w:proofErr w:type="spellStart"/>
-      <w:r>
-        <w:rPr>
-          <w:rFonts w:ascii="Calibri" w:eastAsia="Calibri" w:hAnsi="Calibri" w:cs="Calibri"/>
-          <w:b/>
-          <w:bCs/>
-          <w:color w:val="1A56A0"/>
-          <w:sz w:val="24"/>
-          <w:szCs w:val="24"/>
-        </w:rPr>
-        <w:t>Winlink</w:t>
-      </w:r>
-      <w:proofErr w:type="spellEnd"/>
-      <w:r>
-        <w:rPr>
-          <w:rFonts w:ascii="Calibri" w:eastAsia="Calibri" w:hAnsi="Calibri" w:cs="Calibri"/>
-          <w:b/>
-          <w:bCs/>
-          <w:color w:val="1A56A0"/>
-          <w:sz w:val="24"/>
-          <w:szCs w:val="24"/>
-        </w:rPr>
-        <w:t xml:space="preserve"> Context)</w:t>
+        <w:t xml:space="preserve"> Packet Radio (Winlink Context)</w:t>
       </w:r>
     </w:p>
     <w:p>
@@ -17019,47 +16500,7 @@
           <w:sz w:val="22"/>
           <w:szCs w:val="22"/>
         </w:rPr>
-        <w:t xml:space="preserve">While not strictly part of the APRS protocol, </w:t>
-      </w:r>
-      <w:proofErr w:type="spellStart"/>
-      <w:r>
-        <w:rPr>
-          <w:rFonts w:ascii="Calibri" w:eastAsia="Calibri" w:hAnsi="Calibri" w:cs="Calibri"/>
-          <w:color w:val="1A1A1A"/>
-          <w:sz w:val="22"/>
-          <w:szCs w:val="22"/>
-        </w:rPr>
-        <w:t>Winlink</w:t>
-      </w:r>
-      <w:proofErr w:type="spellEnd"/>
-      <w:r>
-        <w:rPr>
-          <w:rFonts w:ascii="Calibri" w:eastAsia="Calibri" w:hAnsi="Calibri" w:cs="Calibri"/>
-          <w:color w:val="1A1A1A"/>
-          <w:sz w:val="22"/>
-          <w:szCs w:val="22"/>
-        </w:rPr>
-        <w:t xml:space="preserve"> (a radio email system) operates on HF using Robust Packet Radio (RPR) and other modes on similar frequencies. Many operators who deploy HF APRS are also familiar with </w:t>
-      </w:r>
-      <w:proofErr w:type="spellStart"/>
-      <w:r>
-        <w:rPr>
-          <w:rFonts w:ascii="Calibri" w:eastAsia="Calibri" w:hAnsi="Calibri" w:cs="Calibri"/>
-          <w:color w:val="1A1A1A"/>
-          <w:sz w:val="22"/>
-          <w:szCs w:val="22"/>
-        </w:rPr>
-        <w:t>Winlink</w:t>
-      </w:r>
-      <w:proofErr w:type="spellEnd"/>
-      <w:r>
-        <w:rPr>
-          <w:rFonts w:ascii="Calibri" w:eastAsia="Calibri" w:hAnsi="Calibri" w:cs="Calibri"/>
-          <w:color w:val="1A1A1A"/>
-          <w:sz w:val="22"/>
-          <w:szCs w:val="22"/>
-        </w:rPr>
-        <w:t>. The key difference:</w:t>
+        <w:t>While not strictly part of the APRS protocol, Winlink (a radio email system) operates on HF using Robust Packet Radio (RPR) and other modes on similar frequencies. Many operators who deploy HF APRS are also familiar with Winlink. The key difference:</w:t>
       </w:r>
     </w:p>
     <w:p>
@@ -17109,27 +16550,7 @@
           <w:sz w:val="22"/>
           <w:szCs w:val="22"/>
         </w:rPr>
-        <w:t xml:space="preserve">•  </w:t>
-      </w:r>
-      <w:proofErr w:type="spellStart"/>
-      <w:r>
-        <w:rPr>
-          <w:rFonts w:ascii="Calibri" w:eastAsia="Calibri" w:hAnsi="Calibri" w:cs="Calibri"/>
-          <w:color w:val="1A1A1A"/>
-          <w:sz w:val="22"/>
-          <w:szCs w:val="22"/>
-        </w:rPr>
-        <w:t>Winlink</w:t>
-      </w:r>
-      <w:proofErr w:type="spellEnd"/>
-      <w:r>
-        <w:rPr>
-          <w:rFonts w:ascii="Calibri" w:eastAsia="Calibri" w:hAnsi="Calibri" w:cs="Calibri"/>
-          <w:color w:val="1A1A1A"/>
-          <w:sz w:val="22"/>
-          <w:szCs w:val="22"/>
-        </w:rPr>
-        <w:t xml:space="preserve"> is a store-and-forward email system using node-to-node connections</w:t>
+        <w:t>•  Winlink is a store-and-forward email system using node-to-node connections</w:t>
       </w:r>
     </w:p>
     <w:p>
@@ -17143,47 +16564,7 @@
           <w:sz w:val="22"/>
           <w:szCs w:val="22"/>
         </w:rPr>
-        <w:t xml:space="preserve">Both use HF packet radio technology but for fundamentally different purposes. APRS Command includes a </w:t>
-      </w:r>
-      <w:proofErr w:type="spellStart"/>
-      <w:r>
-        <w:rPr>
-          <w:rFonts w:ascii="Calibri" w:eastAsia="Calibri" w:hAnsi="Calibri" w:cs="Calibri"/>
-          <w:color w:val="1A1A1A"/>
-          <w:sz w:val="22"/>
-          <w:szCs w:val="22"/>
-        </w:rPr>
-        <w:t>Winlink</w:t>
-      </w:r>
-      <w:proofErr w:type="spellEnd"/>
-      <w:r>
-        <w:rPr>
-          <w:rFonts w:ascii="Calibri" w:eastAsia="Calibri" w:hAnsi="Calibri" w:cs="Calibri"/>
-          <w:color w:val="1A1A1A"/>
-          <w:sz w:val="22"/>
-          <w:szCs w:val="22"/>
-        </w:rPr>
-        <w:t xml:space="preserve"> RMS gateway locator to help operators find nearby </w:t>
-      </w:r>
-      <w:proofErr w:type="spellStart"/>
-      <w:r>
-        <w:rPr>
-          <w:rFonts w:ascii="Calibri" w:eastAsia="Calibri" w:hAnsi="Calibri" w:cs="Calibri"/>
-          <w:color w:val="1A1A1A"/>
-          <w:sz w:val="22"/>
-          <w:szCs w:val="22"/>
-        </w:rPr>
-        <w:t>Winlink</w:t>
-      </w:r>
-      <w:proofErr w:type="spellEnd"/>
-      <w:r>
-        <w:rPr>
-          <w:rFonts w:ascii="Calibri" w:eastAsia="Calibri" w:hAnsi="Calibri" w:cs="Calibri"/>
-          <w:color w:val="1A1A1A"/>
-          <w:sz w:val="22"/>
-          <w:szCs w:val="22"/>
-        </w:rPr>
-        <w:t xml:space="preserve"> stations.</w:t>
+        <w:t>Both use HF packet radio technology but for fundamentally different purposes. APRS Command includes a Winlink RMS gateway locator to help operators find nearby Winlink stations.</w:t>
       </w:r>
     </w:p>
     <w:p>
@@ -17248,7 +16629,7 @@
           <w:left w:w="10" w:type="dxa"/>
           <w:right w:w="10" w:type="dxa"/>
         </w:tblCellMar>
-        <w:tblLook w:val="04A0" w:firstRow="1" w:lastRow="0" w:firstColumn="1" w:lastColumn="0" w:noHBand="0" w:noVBand="1"/>
+        <w:tblLook w:val="0000" w:firstRow="0" w:lastRow="0" w:firstColumn="0" w:lastColumn="0" w:noHBand="0" w:noVBand="0"/>
       </w:tblPr>
       <w:tblGrid>
         <w:gridCol w:w="2520"/>
@@ -17501,6 +16882,7 @@
                 <w:sz w:val="21"/>
                 <w:szCs w:val="21"/>
               </w:rPr>
+              <w:lastRenderedPageBreak/>
               <w:t>GATE</w:t>
             </w:r>
           </w:p>
@@ -17529,27 +16911,7 @@
                 <w:sz w:val="21"/>
                 <w:szCs w:val="21"/>
               </w:rPr>
-              <w:t xml:space="preserve">Requests that an </w:t>
-            </w:r>
-            <w:proofErr w:type="spellStart"/>
-            <w:r>
-              <w:rPr>
-                <w:rFonts w:ascii="Calibri" w:eastAsia="Calibri" w:hAnsi="Calibri" w:cs="Calibri"/>
-                <w:color w:val="1A1A1A"/>
-                <w:sz w:val="21"/>
-                <w:szCs w:val="21"/>
-              </w:rPr>
-              <w:t>iGate</w:t>
-            </w:r>
-            <w:proofErr w:type="spellEnd"/>
-            <w:r>
-              <w:rPr>
-                <w:rFonts w:ascii="Calibri" w:eastAsia="Calibri" w:hAnsi="Calibri" w:cs="Calibri"/>
-                <w:color w:val="1A1A1A"/>
-                <w:sz w:val="21"/>
-                <w:szCs w:val="21"/>
-              </w:rPr>
-              <w:t xml:space="preserve"> forward the packet to APRS-IS. Used by mobile HF stations to get their position onto the internet-based map.</w:t>
+              <w:t>Requests that an iGate forward the packet to APRS-IS. Used by mobile HF stations to get their position onto the internet-based map.</w:t>
             </w:r>
           </w:p>
         </w:tc>
@@ -17644,7 +17006,6 @@
           <w:sz w:val="24"/>
           <w:szCs w:val="24"/>
         </w:rPr>
-        <w:lastRenderedPageBreak/>
         <w:t>6.6  Practical</w:t>
       </w:r>
       <w:proofErr w:type="gramEnd"/>
@@ -17701,27 +17062,7 @@
           <w:sz w:val="22"/>
           <w:szCs w:val="22"/>
         </w:rPr>
-        <w:t>•  A TNC or software modem capable of 300 baud operation (</w:t>
-      </w:r>
-      <w:proofErr w:type="spellStart"/>
-      <w:r>
-        <w:rPr>
-          <w:rFonts w:ascii="Calibri" w:eastAsia="Calibri" w:hAnsi="Calibri" w:cs="Calibri"/>
-          <w:color w:val="1A1A1A"/>
-          <w:sz w:val="22"/>
-          <w:szCs w:val="22"/>
-        </w:rPr>
-        <w:t>Direwolf</w:t>
-      </w:r>
-      <w:proofErr w:type="spellEnd"/>
-      <w:r>
-        <w:rPr>
-          <w:rFonts w:ascii="Calibri" w:eastAsia="Calibri" w:hAnsi="Calibri" w:cs="Calibri"/>
-          <w:color w:val="1A1A1A"/>
-          <w:sz w:val="22"/>
-          <w:szCs w:val="22"/>
-        </w:rPr>
-        <w:t xml:space="preserve"> supports this; </w:t>
+        <w:t xml:space="preserve">•  A TNC or software modem capable of 300 baud operation (Direwolf supports this; </w:t>
       </w:r>
       <w:proofErr w:type="gramStart"/>
       <w:r>
@@ -17803,7 +17144,7 @@
           <w:left w:w="10" w:type="dxa"/>
           <w:right w:w="10" w:type="dxa"/>
         </w:tblCellMar>
-        <w:tblLook w:val="04A0" w:firstRow="1" w:lastRow="0" w:firstColumn="1" w:lastColumn="0" w:noHBand="0" w:noVBand="1"/>
+        <w:tblLook w:val="0000" w:firstRow="0" w:lastRow="0" w:firstColumn="0" w:lastColumn="0" w:noHBand="0" w:noVBand="0"/>
       </w:tblPr>
       <w:tblGrid>
         <w:gridCol w:w="140"/>
@@ -17906,7 +17247,7 @@
           <w:left w:w="10" w:type="dxa"/>
           <w:right w:w="10" w:type="dxa"/>
         </w:tblCellMar>
-        <w:tblLook w:val="04A0" w:firstRow="1" w:lastRow="0" w:firstColumn="1" w:lastColumn="0" w:noHBand="0" w:noVBand="1"/>
+        <w:tblLook w:val="0000" w:firstRow="0" w:lastRow="0" w:firstColumn="0" w:lastColumn="0" w:noHBand="0" w:noVBand="0"/>
       </w:tblPr>
       <w:tblGrid>
         <w:gridCol w:w="10080"/>
@@ -18045,7 +17386,58 @@
           <w:sz w:val="22"/>
           <w:szCs w:val="22"/>
         </w:rPr>
-        <w:t xml:space="preserve">The symbols are defined in the APRS Symbol Reference, available at aprs.org/symbols.html. Common symbols include a house (home station), a car or truck (mobile), an antenna (fixed radio station), a </w:t>
+        <w:t xml:space="preserve">The symbols are defined in the APRS Symbol Reference at </w:t>
+      </w:r>
+      <w:proofErr w:type="spellStart"/>
+      <w:proofErr w:type="gramStart"/>
+      <w:r>
+        <w:rPr>
+          <w:rFonts w:ascii="Calibri" w:eastAsia="Calibri" w:hAnsi="Calibri" w:cs="Calibri"/>
+          <w:color w:val="1A1A1A"/>
+          <w:sz w:val="22"/>
+          <w:szCs w:val="22"/>
+        </w:rPr>
+        <w:t>how.aprs</w:t>
+      </w:r>
+      <w:proofErr w:type="gramEnd"/>
+      <w:r>
+        <w:rPr>
+          <w:rFonts w:ascii="Calibri" w:eastAsia="Calibri" w:hAnsi="Calibri" w:cs="Calibri"/>
+          <w:color w:val="1A1A1A"/>
+          <w:sz w:val="22"/>
+          <w:szCs w:val="22"/>
+        </w:rPr>
+        <w:t>.works</w:t>
+      </w:r>
+      <w:proofErr w:type="spellEnd"/>
+      <w:r>
+        <w:rPr>
+          <w:rFonts w:ascii="Calibri" w:eastAsia="Calibri" w:hAnsi="Calibri" w:cs="Calibri"/>
+          <w:color w:val="1A1A1A"/>
+          <w:sz w:val="22"/>
+          <w:szCs w:val="22"/>
+        </w:rPr>
+        <w:t>/</w:t>
+      </w:r>
+      <w:proofErr w:type="spellStart"/>
+      <w:r>
+        <w:rPr>
+          <w:rFonts w:ascii="Calibri" w:eastAsia="Calibri" w:hAnsi="Calibri" w:cs="Calibri"/>
+          <w:color w:val="1A1A1A"/>
+          <w:sz w:val="22"/>
+          <w:szCs w:val="22"/>
+        </w:rPr>
+        <w:t>aprs</w:t>
+      </w:r>
+      <w:proofErr w:type="spellEnd"/>
+      <w:r>
+        <w:rPr>
+          <w:rFonts w:ascii="Calibri" w:eastAsia="Calibri" w:hAnsi="Calibri" w:cs="Calibri"/>
+          <w:color w:val="1A1A1A"/>
+          <w:sz w:val="22"/>
+          <w:szCs w:val="22"/>
+        </w:rPr>
+        <w:t xml:space="preserve">-symbols/, a clearer and more current organization of the symbol set than the legacy aprs.org symbols page. Common symbols include a house (home station), a car or truck (mobile), an antenna (fixed radio station), a </w:t>
       </w:r>
       <w:proofErr w:type="gramStart"/>
       <w:r>
@@ -18214,7 +17606,7 @@
           <w:left w:w="10" w:type="dxa"/>
           <w:right w:w="10" w:type="dxa"/>
         </w:tblCellMar>
-        <w:tblLook w:val="04A0" w:firstRow="1" w:lastRow="0" w:firstColumn="1" w:lastColumn="0" w:noHBand="0" w:noVBand="1"/>
+        <w:tblLook w:val="0000" w:firstRow="0" w:lastRow="0" w:firstColumn="0" w:lastColumn="0" w:noHBand="0" w:noVBand="0"/>
       </w:tblPr>
       <w:tblGrid>
         <w:gridCol w:w="1512"/>
@@ -18403,27 +17795,7 @@
                 <w:sz w:val="21"/>
                 <w:szCs w:val="21"/>
               </w:rPr>
-              <w:t>- (house), &gt; (car), _ (weather station), r (antenna), D (digipeater), I (</w:t>
-            </w:r>
-            <w:proofErr w:type="spellStart"/>
-            <w:r>
-              <w:rPr>
-                <w:rFonts w:ascii="Calibri" w:eastAsia="Calibri" w:hAnsi="Calibri" w:cs="Calibri"/>
-                <w:color w:val="1A1A1A"/>
-                <w:sz w:val="21"/>
-                <w:szCs w:val="21"/>
-              </w:rPr>
-              <w:t>iGate</w:t>
-            </w:r>
-            <w:proofErr w:type="spellEnd"/>
-            <w:r>
-              <w:rPr>
-                <w:rFonts w:ascii="Calibri" w:eastAsia="Calibri" w:hAnsi="Calibri" w:cs="Calibri"/>
-                <w:color w:val="1A1A1A"/>
-                <w:sz w:val="21"/>
-                <w:szCs w:val="21"/>
-              </w:rPr>
-              <w:t>)</w:t>
+              <w:t>- (house), &gt; (car), _ (weather station), r (antenna), D (digipeater), I (iGate)</w:t>
             </w:r>
           </w:p>
         </w:tc>
@@ -18544,7 +17916,7 @@
           <w:left w:w="10" w:type="dxa"/>
           <w:right w:w="10" w:type="dxa"/>
         </w:tblCellMar>
-        <w:tblLook w:val="04A0" w:firstRow="1" w:lastRow="0" w:firstColumn="1" w:lastColumn="0" w:noHBand="0" w:noVBand="1"/>
+        <w:tblLook w:val="0000" w:firstRow="0" w:lastRow="0" w:firstColumn="0" w:lastColumn="0" w:noHBand="0" w:noVBand="0"/>
       </w:tblPr>
       <w:tblGrid>
         <w:gridCol w:w="140"/>
@@ -18748,7 +18120,7 @@
           <w:left w:w="10" w:type="dxa"/>
           <w:right w:w="10" w:type="dxa"/>
         </w:tblCellMar>
-        <w:tblLook w:val="04A0" w:firstRow="1" w:lastRow="0" w:firstColumn="1" w:lastColumn="0" w:noHBand="0" w:noVBand="1"/>
+        <w:tblLook w:val="0000" w:firstRow="0" w:lastRow="0" w:firstColumn="0" w:lastColumn="0" w:noHBand="0" w:noVBand="0"/>
       </w:tblPr>
       <w:tblGrid>
         <w:gridCol w:w="140"/>
@@ -19085,7 +18457,7 @@
           <w:left w:w="10" w:type="dxa"/>
           <w:right w:w="10" w:type="dxa"/>
         </w:tblCellMar>
-        <w:tblLook w:val="04A0" w:firstRow="1" w:lastRow="0" w:firstColumn="1" w:lastColumn="0" w:noHBand="0" w:noVBand="1"/>
+        <w:tblLook w:val="0000" w:firstRow="0" w:lastRow="0" w:firstColumn="0" w:lastColumn="0" w:noHBand="0" w:noVBand="0"/>
       </w:tblPr>
       <w:tblGrid>
         <w:gridCol w:w="140"/>
@@ -19261,8 +18633,9 @@
           <w:sz w:val="22"/>
           <w:szCs w:val="22"/>
         </w:rPr>
-        <w:t xml:space="preserve">These are advanced topics beyond the scope of this primer. The APRS Protocol Reference (available at aprs.org) is the authoritative source for </w:t>
-      </w:r>
+        <w:t xml:space="preserve">These are advanced topics beyond the scope of this primer. The original APRS101.pdf reference is now outdated; </w:t>
+      </w:r>
+      <w:proofErr w:type="spellStart"/>
       <w:proofErr w:type="gramStart"/>
       <w:r>
         <w:rPr>
@@ -19271,7 +18644,7 @@
           <w:sz w:val="22"/>
           <w:szCs w:val="22"/>
         </w:rPr>
-        <w:t>the complete</w:t>
+        <w:t>how.aprs</w:t>
       </w:r>
       <w:proofErr w:type="gramEnd"/>
       <w:r>
@@ -19281,7 +18654,17 @@
           <w:sz w:val="22"/>
           <w:szCs w:val="22"/>
         </w:rPr>
-        <w:t xml:space="preserve"> specification.</w:t>
+        <w:t>.works</w:t>
+      </w:r>
+      <w:proofErr w:type="spellEnd"/>
+      <w:r>
+        <w:rPr>
+          <w:rFonts w:ascii="Calibri" w:eastAsia="Calibri" w:hAnsi="Calibri" w:cs="Calibri"/>
+          <w:color w:val="1A1A1A"/>
+          <w:sz w:val="22"/>
+          <w:szCs w:val="22"/>
+        </w:rPr>
+        <w:t>/aprs101-pdf-is-obsolete/ maintains a current compilation of the original protocol reference together with the aprs11 corrections, the aprs12 proposals that were actually implemented, and other accumulated operational knowledge, and is the authoritative source for the complete, current specification.</w:t>
       </w:r>
     </w:p>
     <w:p>
@@ -19305,7 +18688,7 @@
           <w:left w:w="10" w:type="dxa"/>
           <w:right w:w="10" w:type="dxa"/>
         </w:tblCellMar>
-        <w:tblLook w:val="04A0" w:firstRow="1" w:lastRow="0" w:firstColumn="1" w:lastColumn="0" w:noHBand="0" w:noVBand="1"/>
+        <w:tblLook w:val="0000" w:firstRow="0" w:lastRow="0" w:firstColumn="0" w:lastColumn="0" w:noHBand="0" w:noVBand="0"/>
       </w:tblPr>
       <w:tblGrid>
         <w:gridCol w:w="10080"/>
@@ -19516,7 +18899,7 @@
           <w:left w:w="10" w:type="dxa"/>
           <w:right w:w="10" w:type="dxa"/>
         </w:tblCellMar>
-        <w:tblLook w:val="04A0" w:firstRow="1" w:lastRow="0" w:firstColumn="1" w:lastColumn="0" w:noHBand="0" w:noVBand="1"/>
+        <w:tblLook w:val="0000" w:firstRow="0" w:lastRow="0" w:firstColumn="0" w:lastColumn="0" w:noHBand="0" w:noVBand="0"/>
       </w:tblPr>
       <w:tblGrid>
         <w:gridCol w:w="140"/>
@@ -19651,7 +19034,7 @@
           <w:left w:w="10" w:type="dxa"/>
           <w:right w:w="10" w:type="dxa"/>
         </w:tblCellMar>
-        <w:tblLook w:val="04A0" w:firstRow="1" w:lastRow="0" w:firstColumn="1" w:lastColumn="0" w:noHBand="0" w:noVBand="1"/>
+        <w:tblLook w:val="0000" w:firstRow="0" w:lastRow="0" w:firstColumn="0" w:lastColumn="0" w:noHBand="0" w:noVBand="0"/>
       </w:tblPr>
       <w:tblGrid>
         <w:gridCol w:w="2721"/>
@@ -20535,7 +19918,7 @@
           <w:left w:w="10" w:type="dxa"/>
           <w:right w:w="10" w:type="dxa"/>
         </w:tblCellMar>
-        <w:tblLook w:val="04A0" w:firstRow="1" w:lastRow="0" w:firstColumn="1" w:lastColumn="0" w:noHBand="0" w:noVBand="1"/>
+        <w:tblLook w:val="0000" w:firstRow="0" w:lastRow="0" w:firstColumn="0" w:lastColumn="0" w:noHBand="0" w:noVBand="0"/>
       </w:tblPr>
       <w:tblGrid>
         <w:gridCol w:w="140"/>
@@ -20851,27 +20234,7 @@
           <w:sz w:val="22"/>
           <w:szCs w:val="22"/>
         </w:rPr>
-        <w:t xml:space="preserve">•  If running RF only, ensure your team has a plan for </w:t>
-      </w:r>
-      <w:proofErr w:type="spellStart"/>
-      <w:r>
-        <w:rPr>
-          <w:rFonts w:ascii="Calibri" w:eastAsia="Calibri" w:hAnsi="Calibri" w:cs="Calibri"/>
-          <w:color w:val="1A1A1A"/>
-          <w:sz w:val="22"/>
-          <w:szCs w:val="22"/>
-        </w:rPr>
-        <w:t>iGate</w:t>
-      </w:r>
-      <w:proofErr w:type="spellEnd"/>
-      <w:r>
-        <w:rPr>
-          <w:rFonts w:ascii="Calibri" w:eastAsia="Calibri" w:hAnsi="Calibri" w:cs="Calibri"/>
-          <w:color w:val="1A1A1A"/>
-          <w:sz w:val="22"/>
-          <w:szCs w:val="22"/>
-        </w:rPr>
-        <w:t xml:space="preserve"> coverage or understands that positions will not appear on internet-accessible maps</w:t>
+        <w:t>•  If running RF only, ensure your team has a plan for iGate coverage or understands that positions will not appear on internet-accessible maps</w:t>
       </w:r>
     </w:p>
     <w:tbl>
@@ -20889,7 +20252,7 @@
           <w:left w:w="10" w:type="dxa"/>
           <w:right w:w="10" w:type="dxa"/>
         </w:tblCellMar>
-        <w:tblLook w:val="04A0" w:firstRow="1" w:lastRow="0" w:firstColumn="1" w:lastColumn="0" w:noHBand="0" w:noVBand="1"/>
+        <w:tblLook w:val="0000" w:firstRow="0" w:lastRow="0" w:firstColumn="0" w:lastColumn="0" w:noHBand="0" w:noVBand="0"/>
       </w:tblPr>
       <w:tblGrid>
         <w:gridCol w:w="140"/>
@@ -21609,7 +20972,7 @@
           <w:left w:w="10" w:type="dxa"/>
           <w:right w:w="10" w:type="dxa"/>
         </w:tblCellMar>
-        <w:tblLook w:val="04A0" w:firstRow="1" w:lastRow="0" w:firstColumn="1" w:lastColumn="0" w:noHBand="0" w:noVBand="1"/>
+        <w:tblLook w:val="0000" w:firstRow="0" w:lastRow="0" w:firstColumn="0" w:lastColumn="0" w:noHBand="0" w:noVBand="0"/>
       </w:tblPr>
       <w:tblGrid>
         <w:gridCol w:w="2721"/>
@@ -22442,7 +21805,7 @@
           <w:left w:w="10" w:type="dxa"/>
           <w:right w:w="10" w:type="dxa"/>
         </w:tblCellMar>
-        <w:tblLook w:val="04A0" w:firstRow="1" w:lastRow="0" w:firstColumn="1" w:lastColumn="0" w:noHBand="0" w:noVBand="1"/>
+        <w:tblLook w:val="0000" w:firstRow="0" w:lastRow="0" w:firstColumn="0" w:lastColumn="0" w:noHBand="0" w:noVBand="0"/>
       </w:tblPr>
       <w:tblGrid>
         <w:gridCol w:w="2822"/>
@@ -23707,7 +23070,7 @@
           <w:left w:w="10" w:type="dxa"/>
           <w:right w:w="10" w:type="dxa"/>
         </w:tblCellMar>
-        <w:tblLook w:val="04A0" w:firstRow="1" w:lastRow="0" w:firstColumn="1" w:lastColumn="0" w:noHBand="0" w:noVBand="1"/>
+        <w:tblLook w:val="0000" w:firstRow="0" w:lastRow="0" w:firstColumn="0" w:lastColumn="0" w:noHBand="0" w:noVBand="0"/>
       </w:tblPr>
       <w:tblGrid>
         <w:gridCol w:w="2822"/>
@@ -24305,27 +23668,7 @@
                 <w:sz w:val="21"/>
                 <w:szCs w:val="21"/>
               </w:rPr>
-              <w:t xml:space="preserve">Request </w:t>
-            </w:r>
-            <w:proofErr w:type="spellStart"/>
-            <w:r>
-              <w:rPr>
-                <w:rFonts w:ascii="Calibri" w:eastAsia="Calibri" w:hAnsi="Calibri" w:cs="Calibri"/>
-                <w:color w:val="1A1A1A"/>
-                <w:sz w:val="21"/>
-                <w:szCs w:val="21"/>
-              </w:rPr>
-              <w:t>iGate</w:t>
-            </w:r>
-            <w:proofErr w:type="spellEnd"/>
-            <w:r>
-              <w:rPr>
-                <w:rFonts w:ascii="Calibri" w:eastAsia="Calibri" w:hAnsi="Calibri" w:cs="Calibri"/>
-                <w:color w:val="1A1A1A"/>
-                <w:sz w:val="21"/>
-                <w:szCs w:val="21"/>
-              </w:rPr>
-              <w:t xml:space="preserve"> forwarding to APRS-IS. Useful for HF mobile stations.</w:t>
+              <w:t>Request iGate forwarding to APRS-IS. Useful for HF mobile stations.</w:t>
             </w:r>
           </w:p>
         </w:tc>
@@ -24512,27 +23855,7 @@
                 <w:sz w:val="21"/>
                 <w:szCs w:val="21"/>
               </w:rPr>
-              <w:t xml:space="preserve">Same as NOGATE — prevents </w:t>
-            </w:r>
-            <w:proofErr w:type="spellStart"/>
-            <w:r>
-              <w:rPr>
-                <w:rFonts w:ascii="Calibri" w:eastAsia="Calibri" w:hAnsi="Calibri" w:cs="Calibri"/>
-                <w:color w:val="1A1A1A"/>
-                <w:sz w:val="21"/>
-                <w:szCs w:val="21"/>
-              </w:rPr>
-              <w:t>iGate</w:t>
-            </w:r>
-            <w:proofErr w:type="spellEnd"/>
-            <w:r>
-              <w:rPr>
-                <w:rFonts w:ascii="Calibri" w:eastAsia="Calibri" w:hAnsi="Calibri" w:cs="Calibri"/>
-                <w:color w:val="1A1A1A"/>
-                <w:sz w:val="21"/>
-                <w:szCs w:val="21"/>
-              </w:rPr>
-              <w:t xml:space="preserve"> forwarding.</w:t>
+              <w:t>Same as NOGATE — prevents iGate forwarding.</w:t>
             </w:r>
           </w:p>
         </w:tc>
@@ -24681,7 +24004,7 @@
           <w:left w:w="10" w:type="dxa"/>
           <w:right w:w="10" w:type="dxa"/>
         </w:tblCellMar>
-        <w:tblLook w:val="04A0" w:firstRow="1" w:lastRow="0" w:firstColumn="1" w:lastColumn="0" w:noHBand="0" w:noVBand="1"/>
+        <w:tblLook w:val="0000" w:firstRow="0" w:lastRow="0" w:firstColumn="0" w:lastColumn="0" w:noHBand="0" w:noVBand="0"/>
       </w:tblPr>
       <w:tblGrid>
         <w:gridCol w:w="140"/>
@@ -25238,34 +24561,13 @@
           <w:sz w:val="21"/>
           <w:szCs w:val="21"/>
         </w:rPr>
-        <w:t xml:space="preserve">An APRS path element requesting that an </w:t>
-      </w:r>
-      <w:proofErr w:type="spellStart"/>
-      <w:r>
-        <w:rPr>
-          <w:rFonts w:ascii="Calibri" w:eastAsia="Calibri" w:hAnsi="Calibri" w:cs="Calibri"/>
-          <w:color w:val="1A1A1A"/>
-          <w:sz w:val="21"/>
-          <w:szCs w:val="21"/>
-        </w:rPr>
-        <w:t>iGate</w:t>
-      </w:r>
-      <w:proofErr w:type="spellEnd"/>
-      <w:r>
-        <w:rPr>
-          <w:rFonts w:ascii="Calibri" w:eastAsia="Calibri" w:hAnsi="Calibri" w:cs="Calibri"/>
-          <w:color w:val="1A1A1A"/>
-          <w:sz w:val="21"/>
-          <w:szCs w:val="21"/>
-        </w:rPr>
-        <w:t xml:space="preserve"> forward the packet to APRS-IS.</w:t>
+        <w:t>An APRS path element requesting that an iGate forward the packet to APRS-IS.</w:t>
       </w:r>
     </w:p>
     <w:p>
       <w:pPr>
         <w:spacing w:before="120" w:after="20"/>
       </w:pPr>
-      <w:proofErr w:type="spellStart"/>
       <w:r>
         <w:rPr>
           <w:rFonts w:ascii="Calibri" w:eastAsia="Calibri" w:hAnsi="Calibri" w:cs="Calibri"/>
@@ -25277,7 +24579,6 @@
         </w:rPr>
         <w:t>iGate</w:t>
       </w:r>
-      <w:proofErr w:type="spellEnd"/>
     </w:p>
     <w:p>
       <w:pPr>
@@ -25639,27 +24940,7 @@
           <w:sz w:val="21"/>
           <w:szCs w:val="21"/>
         </w:rPr>
-        <w:t xml:space="preserve"> preventing </w:t>
-      </w:r>
-      <w:proofErr w:type="spellStart"/>
-      <w:r>
-        <w:rPr>
-          <w:rFonts w:ascii="Calibri" w:eastAsia="Calibri" w:hAnsi="Calibri" w:cs="Calibri"/>
-          <w:color w:val="1A1A1A"/>
-          <w:sz w:val="21"/>
-          <w:szCs w:val="21"/>
-        </w:rPr>
-        <w:t>iGates</w:t>
-      </w:r>
-      <w:proofErr w:type="spellEnd"/>
-      <w:r>
-        <w:rPr>
-          <w:rFonts w:ascii="Calibri" w:eastAsia="Calibri" w:hAnsi="Calibri" w:cs="Calibri"/>
-          <w:color w:val="1A1A1A"/>
-          <w:sz w:val="21"/>
-          <w:szCs w:val="21"/>
-        </w:rPr>
-        <w:t xml:space="preserve"> from forwarding the packet to APRS-IS.</w:t>
+        <w:t xml:space="preserve"> preventing iGates from forwarding the packet to APRS-IS.</w:t>
       </w:r>
     </w:p>
     <w:p>
@@ -25934,7 +25215,7 @@
 </file>
 
 <file path=word/endnotes.xml><?xml version="1.0" encoding="utf-8"?>
-<w:endnotes xmlns:wpc="http://schemas.microsoft.com/office/word/2010/wordprocessingCanvas" xmlns:cx="http://schemas.microsoft.com/office/drawing/2014/chartex" xmlns:cx1="http://schemas.microsoft.com/office/drawing/2015/9/8/chartex" xmlns:cx2="http://schemas.microsoft.com/office/drawing/2015/10/21/chartex" xmlns:cx3="http://schemas.microsoft.com/office/drawing/2016/5/9/chartex" xmlns:cx4="http://schemas.microsoft.com/office/drawing/2016/5/10/chartex" xmlns:cx5="http://schemas.microsoft.com/office/drawing/2016/5/11/chartex" xmlns:cx6="http://schemas.microsoft.com/office/drawing/2016/5/12/chartex" xmlns:cx7="http://schemas.microsoft.com/office/drawing/2016/5/13/chartex" xmlns:cx8="http://schemas.microsoft.com/office/drawing/2016/5/14/chartex" xmlns:mc="http://schemas.openxmlformats.org/markup-compatibility/2006" xmlns:aink="http://schemas.microsoft.com/office/drawing/2016/ink" xmlns:am3d="http://schemas.microsoft.com/office/drawing/2017/model3d" xmlns:o="urn:schemas-microsoft-com:office:office" xmlns:oel="http://schemas.microsoft.com/office/2019/extlst" xmlns:r="http://schemas.openxmlformats.org/officeDocument/2006/relationships" xmlns:m="http://schemas.openxmlformats.org/officeDocument/2006/math" xmlns:v="urn:schemas-microsoft-com:vml" xmlns:wp14="http://schemas.microsoft.com/office/word/2010/wordprocessingDrawing" xmlns:wp="http://schemas.openxmlformats.org/drawingml/2006/wordprocessingDrawing" xmlns:w10="urn:schemas-microsoft-com:office:word" xmlns:w="http://schemas.openxmlformats.org/wordprocessingml/2006/main" xmlns:w14="http://schemas.microsoft.com/office/word/2010/wordml" xmlns:w15="http://schemas.microsoft.com/office/word/2012/wordml" xmlns:w16cex="http://schemas.microsoft.com/office/word/2018/wordml/cex" xmlns:w16cid="http://schemas.microsoft.com/office/word/2016/wordml/cid" xmlns:w16="http://schemas.microsoft.com/office/word/2018/wordml" xmlns:w16du="http://schemas.microsoft.com/office/word/2023/wordml/word16du" xmlns:w16sdtdh="http://schemas.microsoft.com/office/word/2020/wordml/sdtdatahash" xmlns:w16sdtfl="http://schemas.microsoft.com/office/word/2024/wordml/sdtformatlock" xmlns:w16se="http://schemas.microsoft.com/office/word/2015/wordml/symex" xmlns:wpg="http://schemas.microsoft.com/office/word/2010/wordprocessingGroup" xmlns:wpi="http://schemas.microsoft.com/office/word/2010/wordprocessingInk" xmlns:wne="http://schemas.microsoft.com/office/word/2006/wordml" xmlns:wps="http://schemas.microsoft.com/office/word/2010/wordprocessingShape" mc:Ignorable="w14 w15 w16se w16cid w16 w16cex w16sdtdh w16sdtfl w16du wp14">
+<w:endnotes xmlns:wpc="http://schemas.microsoft.com/office/word/2010/wordprocessingCanvas" xmlns:cx="http://schemas.microsoft.com/office/drawing/2014/chartex" xmlns:cx1="http://schemas.microsoft.com/office/drawing/2015/9/8/chartex" xmlns:cx2="http://schemas.microsoft.com/office/drawing/2015/10/21/chartex" xmlns:cx3="http://schemas.microsoft.com/office/drawing/2016/5/9/chartex" xmlns:cx4="http://schemas.microsoft.com/office/drawing/2016/5/10/chartex" xmlns:cx5="http://schemas.microsoft.com/office/drawing/2016/5/11/chartex" xmlns:cx6="http://schemas.microsoft.com/office/drawing/2016/5/12/chartex" xmlns:cx7="http://schemas.microsoft.com/office/drawing/2016/5/13/chartex" xmlns:cx8="http://schemas.microsoft.com/office/drawing/2016/5/14/chartex" xmlns:mc="http://schemas.openxmlformats.org/markup-compatibility/2006" xmlns:aink="http://schemas.microsoft.com/office/drawing/2016/ink" xmlns:am3d="http://schemas.microsoft.com/office/drawing/2017/model3d" xmlns:o="urn:schemas-microsoft-com:office:office" xmlns:oel="http://schemas.microsoft.com/office/2019/extlst" xmlns:r="http://schemas.openxmlformats.org/officeDocument/2006/relationships" xmlns:m="http://schemas.openxmlformats.org/officeDocument/2006/math" xmlns:v="urn:schemas-microsoft-com:vml" xmlns:wp14="http://schemas.microsoft.com/office/word/2010/wordprocessingDrawing" xmlns:wp="http://schemas.openxmlformats.org/drawingml/2006/wordprocessingDrawing" xmlns:w10="urn:schemas-microsoft-com:office:word" xmlns:w="http://schemas.openxmlformats.org/wordprocessingml/2006/main" xmlns:w14="http://schemas.microsoft.com/office/word/2010/wordml" xmlns:w15="http://schemas.microsoft.com/office/word/2012/wordml" xmlns:w16cei="http://schemas.microsoft.com/office/word/2026/wordml/cei" xmlns:w16cex="http://schemas.microsoft.com/office/word/2018/wordml/cex" xmlns:w16cid="http://schemas.microsoft.com/office/word/2016/wordml/cid" xmlns:w16="http://schemas.microsoft.com/office/word/2018/wordml" xmlns:w16du="http://schemas.microsoft.com/office/word/2023/wordml/word16du" xmlns:w16sdtdh="http://schemas.microsoft.com/office/word/2020/wordml/sdtdatahash" xmlns:w16sdtfl="http://schemas.microsoft.com/office/word/2024/wordml/sdtformatlock" xmlns:w16se="http://schemas.microsoft.com/office/word/2015/wordml/symex" xmlns:wpg="http://schemas.microsoft.com/office/word/2010/wordprocessingGroup" xmlns:wpi="http://schemas.microsoft.com/office/word/2010/wordprocessingInk" xmlns:wne="http://schemas.microsoft.com/office/word/2006/wordml" xmlns:wps="http://schemas.microsoft.com/office/word/2010/wordprocessingShape" mc:Ignorable="w14 w15 w16se w16cid w16 w16cex w16sdtdh w16sdtfl w16du wp14">
   <w:endnote w:type="separator" w:id="-1">
     <w:p>
       <w:r>
@@ -25953,7 +25234,7 @@
 </file>
 
 <file path=word/footer1.xml><?xml version="1.0" encoding="utf-8"?>
-<w:ftr xmlns:wpc="http://schemas.microsoft.com/office/word/2010/wordprocessingCanvas" xmlns:cx="http://schemas.microsoft.com/office/drawing/2014/chartex" xmlns:cx1="http://schemas.microsoft.com/office/drawing/2015/9/8/chartex" xmlns:cx2="http://schemas.microsoft.com/office/drawing/2015/10/21/chartex" xmlns:cx3="http://schemas.microsoft.com/office/drawing/2016/5/9/chartex" xmlns:cx4="http://schemas.microsoft.com/office/drawing/2016/5/10/chartex" xmlns:cx5="http://schemas.microsoft.com/office/drawing/2016/5/11/chartex" xmlns:cx6="http://schemas.microsoft.com/office/drawing/2016/5/12/chartex" xmlns:cx7="http://schemas.microsoft.com/office/drawing/2016/5/13/chartex" xmlns:cx8="http://schemas.microsoft.com/office/drawing/2016/5/14/chartex" xmlns:mc="http://schemas.openxmlformats.org/markup-compatibility/2006" xmlns:aink="http://schemas.microsoft.com/office/drawing/2016/ink" xmlns:am3d="http://schemas.microsoft.com/office/drawing/2017/model3d" xmlns:o="urn:schemas-microsoft-com:office:office" xmlns:oel="http://schemas.microsoft.com/office/2019/extlst" xmlns:r="http://schemas.openxmlformats.org/officeDocument/2006/relationships" xmlns:m="http://schemas.openxmlformats.org/officeDocument/2006/math" xmlns:v="urn:schemas-microsoft-com:vml" xmlns:wp14="http://schemas.microsoft.com/office/word/2010/wordprocessingDrawing" xmlns:wp="http://schemas.openxmlformats.org/drawingml/2006/wordprocessingDrawing" xmlns:w10="urn:schemas-microsoft-com:office:word" xmlns:w="http://schemas.openxmlformats.org/wordprocessingml/2006/main" xmlns:w14="http://schemas.microsoft.com/office/word/2010/wordml" xmlns:w15="http://schemas.microsoft.com/office/word/2012/wordml" xmlns:w16cex="http://schemas.microsoft.com/office/word/2018/wordml/cex" xmlns:w16cid="http://schemas.microsoft.com/office/word/2016/wordml/cid" xmlns:w16="http://schemas.microsoft.com/office/word/2018/wordml" xmlns:w16du="http://schemas.microsoft.com/office/word/2023/wordml/word16du" xmlns:w16sdtdh="http://schemas.microsoft.com/office/word/2020/wordml/sdtdatahash" xmlns:w16sdtfl="http://schemas.microsoft.com/office/word/2024/wordml/sdtformatlock" xmlns:w16se="http://schemas.microsoft.com/office/word/2015/wordml/symex" xmlns:wpg="http://schemas.microsoft.com/office/word/2010/wordprocessingGroup" xmlns:wpi="http://schemas.microsoft.com/office/word/2010/wordprocessingInk" xmlns:wne="http://schemas.microsoft.com/office/word/2006/wordml" xmlns:wps="http://schemas.microsoft.com/office/word/2010/wordprocessingShape" mc:Ignorable="w14 w15 w16se w16cid w16 w16cex w16sdtdh w16sdtfl w16du wp14">
+<w:ftr xmlns:wpc="http://schemas.microsoft.com/office/word/2010/wordprocessingCanvas" xmlns:cx="http://schemas.microsoft.com/office/drawing/2014/chartex" xmlns:cx1="http://schemas.microsoft.com/office/drawing/2015/9/8/chartex" xmlns:cx2="http://schemas.microsoft.com/office/drawing/2015/10/21/chartex" xmlns:cx3="http://schemas.microsoft.com/office/drawing/2016/5/9/chartex" xmlns:cx4="http://schemas.microsoft.com/office/drawing/2016/5/10/chartex" xmlns:cx5="http://schemas.microsoft.com/office/drawing/2016/5/11/chartex" xmlns:cx6="http://schemas.microsoft.com/office/drawing/2016/5/12/chartex" xmlns:cx7="http://schemas.microsoft.com/office/drawing/2016/5/13/chartex" xmlns:cx8="http://schemas.microsoft.com/office/drawing/2016/5/14/chartex" xmlns:mc="http://schemas.openxmlformats.org/markup-compatibility/2006" xmlns:aink="http://schemas.microsoft.com/office/drawing/2016/ink" xmlns:am3d="http://schemas.microsoft.com/office/drawing/2017/model3d" xmlns:o="urn:schemas-microsoft-com:office:office" xmlns:oel="http://schemas.microsoft.com/office/2019/extlst" xmlns:r="http://schemas.openxmlformats.org/officeDocument/2006/relationships" xmlns:m="http://schemas.openxmlformats.org/officeDocument/2006/math" xmlns:v="urn:schemas-microsoft-com:vml" xmlns:wp14="http://schemas.microsoft.com/office/word/2010/wordprocessingDrawing" xmlns:wp="http://schemas.openxmlformats.org/drawingml/2006/wordprocessingDrawing" xmlns:w10="urn:schemas-microsoft-com:office:word" xmlns:w="http://schemas.openxmlformats.org/wordprocessingml/2006/main" xmlns:w14="http://schemas.microsoft.com/office/word/2010/wordml" xmlns:w15="http://schemas.microsoft.com/office/word/2012/wordml" xmlns:w16cei="http://schemas.microsoft.com/office/word/2026/wordml/cei" xmlns:w16cex="http://schemas.microsoft.com/office/word/2018/wordml/cex" xmlns:w16cid="http://schemas.microsoft.com/office/word/2016/wordml/cid" xmlns:w16="http://schemas.microsoft.com/office/word/2018/wordml" xmlns:w16du="http://schemas.microsoft.com/office/word/2023/wordml/word16du" xmlns:w16sdtdh="http://schemas.microsoft.com/office/word/2020/wordml/sdtdatahash" xmlns:w16sdtfl="http://schemas.microsoft.com/office/word/2024/wordml/sdtformatlock" xmlns:w16se="http://schemas.microsoft.com/office/word/2015/wordml/symex" xmlns:wpg="http://schemas.microsoft.com/office/word/2010/wordprocessingGroup" xmlns:wpi="http://schemas.microsoft.com/office/word/2010/wordprocessingInk" xmlns:wne="http://schemas.microsoft.com/office/word/2006/wordml" xmlns:wps="http://schemas.microsoft.com/office/word/2010/wordprocessingShape" mc:Ignorable="w14 w15 w16se w16cid w16 w16cex w16sdtdh w16sdtfl w16du wp14">
   <w:tbl>
     <w:tblPr>
       <w:tblW w:w="10080" w:type="dxa"/>
@@ -25969,7 +25250,7 @@
         <w:left w:w="10" w:type="dxa"/>
         <w:right w:w="10" w:type="dxa"/>
       </w:tblCellMar>
-      <w:tblLook w:val="04A0" w:firstRow="1" w:lastRow="0" w:firstColumn="1" w:lastColumn="0" w:noHBand="0" w:noVBand="1"/>
+      <w:tblLook w:val="0000" w:firstRow="0" w:lastRow="0" w:firstColumn="0" w:lastColumn="0" w:noHBand="0" w:noVBand="0"/>
     </w:tblPr>
     <w:tblGrid>
       <w:gridCol w:w="7056"/>
@@ -26071,7 +25352,7 @@
 </file>
 
 <file path=word/footnotes.xml><?xml version="1.0" encoding="utf-8"?>
-<w:footnotes xmlns:wpc="http://schemas.microsoft.com/office/word/2010/wordprocessingCanvas" xmlns:cx="http://schemas.microsoft.com/office/drawing/2014/chartex" xmlns:cx1="http://schemas.microsoft.com/office/drawing/2015/9/8/chartex" xmlns:cx2="http://schemas.microsoft.com/office/drawing/2015/10/21/chartex" xmlns:cx3="http://schemas.microsoft.com/office/drawing/2016/5/9/chartex" xmlns:cx4="http://schemas.microsoft.com/office/drawing/2016/5/10/chartex" xmlns:cx5="http://schemas.microsoft.com/office/drawing/2016/5/11/chartex" xmlns:cx6="http://schemas.microsoft.com/office/drawing/2016/5/12/chartex" xmlns:cx7="http://schemas.microsoft.com/office/drawing/2016/5/13/chartex" xmlns:cx8="http://schemas.microsoft.com/office/drawing/2016/5/14/chartex" xmlns:mc="http://schemas.openxmlformats.org/markup-compatibility/2006" xmlns:aink="http://schemas.microsoft.com/office/drawing/2016/ink" xmlns:am3d="http://schemas.microsoft.com/office/drawing/2017/model3d" xmlns:o="urn:schemas-microsoft-com:office:office" xmlns:oel="http://schemas.microsoft.com/office/2019/extlst" xmlns:r="http://schemas.openxmlformats.org/officeDocument/2006/relationships" xmlns:m="http://schemas.openxmlformats.org/officeDocument/2006/math" xmlns:v="urn:schemas-microsoft-com:vml" xmlns:wp14="http://schemas.microsoft.com/office/word/2010/wordprocessingDrawing" xmlns:wp="http://schemas.openxmlformats.org/drawingml/2006/wordprocessingDrawing" xmlns:w10="urn:schemas-microsoft-com:office:word" xmlns:w="http://schemas.openxmlformats.org/wordprocessingml/2006/main" xmlns:w14="http://schemas.microsoft.com/office/word/2010/wordml" xmlns:w15="http://schemas.microsoft.com/office/word/2012/wordml" xmlns:w16cex="http://schemas.microsoft.com/office/word/2018/wordml/cex" xmlns:w16cid="http://schemas.microsoft.com/office/word/2016/wordml/cid" xmlns:w16="http://schemas.microsoft.com/office/word/2018/wordml" xmlns:w16du="http://schemas.microsoft.com/office/word/2023/wordml/word16du" xmlns:w16sdtdh="http://schemas.microsoft.com/office/word/2020/wordml/sdtdatahash" xmlns:w16sdtfl="http://schemas.microsoft.com/office/word/2024/wordml/sdtformatlock" xmlns:w16se="http://schemas.microsoft.com/office/word/2015/wordml/symex" xmlns:wpg="http://schemas.microsoft.com/office/word/2010/wordprocessingGroup" xmlns:wpi="http://schemas.microsoft.com/office/word/2010/wordprocessingInk" xmlns:wne="http://schemas.microsoft.com/office/word/2006/wordml" xmlns:wps="http://schemas.microsoft.com/office/word/2010/wordprocessingShape" mc:Ignorable="w14 w15 w16se w16cid w16 w16cex w16sdtdh w16sdtfl w16du wp14">
+<w:footnotes xmlns:wpc="http://schemas.microsoft.com/office/word/2010/wordprocessingCanvas" xmlns:cx="http://schemas.microsoft.com/office/drawing/2014/chartex" xmlns:cx1="http://schemas.microsoft.com/office/drawing/2015/9/8/chartex" xmlns:cx2="http://schemas.microsoft.com/office/drawing/2015/10/21/chartex" xmlns:cx3="http://schemas.microsoft.com/office/drawing/2016/5/9/chartex" xmlns:cx4="http://schemas.microsoft.com/office/drawing/2016/5/10/chartex" xmlns:cx5="http://schemas.microsoft.com/office/drawing/2016/5/11/chartex" xmlns:cx6="http://schemas.microsoft.com/office/drawing/2016/5/12/chartex" xmlns:cx7="http://schemas.microsoft.com/office/drawing/2016/5/13/chartex" xmlns:cx8="http://schemas.microsoft.com/office/drawing/2016/5/14/chartex" xmlns:mc="http://schemas.openxmlformats.org/markup-compatibility/2006" xmlns:aink="http://schemas.microsoft.com/office/drawing/2016/ink" xmlns:am3d="http://schemas.microsoft.com/office/drawing/2017/model3d" xmlns:o="urn:schemas-microsoft-com:office:office" xmlns:oel="http://schemas.microsoft.com/office/2019/extlst" xmlns:r="http://schemas.openxmlformats.org/officeDocument/2006/relationships" xmlns:m="http://schemas.openxmlformats.org/officeDocument/2006/math" xmlns:v="urn:schemas-microsoft-com:vml" xmlns:wp14="http://schemas.microsoft.com/office/word/2010/wordprocessingDrawing" xmlns:wp="http://schemas.openxmlformats.org/drawingml/2006/wordprocessingDrawing" xmlns:w10="urn:schemas-microsoft-com:office:word" xmlns:w="http://schemas.openxmlformats.org/wordprocessingml/2006/main" xmlns:w14="http://schemas.microsoft.com/office/word/2010/wordml" xmlns:w15="http://schemas.microsoft.com/office/word/2012/wordml" xmlns:w16cei="http://schemas.microsoft.com/office/word/2026/wordml/cei" xmlns:w16cex="http://schemas.microsoft.com/office/word/2018/wordml/cex" xmlns:w16cid="http://schemas.microsoft.com/office/word/2016/wordml/cid" xmlns:w16="http://schemas.microsoft.com/office/word/2018/wordml" xmlns:w16du="http://schemas.microsoft.com/office/word/2023/wordml/word16du" xmlns:w16sdtdh="http://schemas.microsoft.com/office/word/2020/wordml/sdtdatahash" xmlns:w16sdtfl="http://schemas.microsoft.com/office/word/2024/wordml/sdtformatlock" xmlns:w16se="http://schemas.microsoft.com/office/word/2015/wordml/symex" xmlns:wpg="http://schemas.microsoft.com/office/word/2010/wordprocessingGroup" xmlns:wpi="http://schemas.microsoft.com/office/word/2010/wordprocessingInk" xmlns:wne="http://schemas.microsoft.com/office/word/2006/wordml" xmlns:wps="http://schemas.microsoft.com/office/word/2010/wordprocessingShape" mc:Ignorable="w14 w15 w16se w16cid w16 w16cex w16sdtdh w16sdtfl w16du wp14">
   <w:footnote w:type="separator" w:id="-1">
     <w:p>
       <w:r>
@@ -26090,7 +25371,7 @@
 </file>
 
 <file path=word/header1.xml><?xml version="1.0" encoding="utf-8"?>
-<w:hdr xmlns:wpc="http://schemas.microsoft.com/office/word/2010/wordprocessingCanvas" xmlns:cx="http://schemas.microsoft.com/office/drawing/2014/chartex" xmlns:cx1="http://schemas.microsoft.com/office/drawing/2015/9/8/chartex" xmlns:cx2="http://schemas.microsoft.com/office/drawing/2015/10/21/chartex" xmlns:cx3="http://schemas.microsoft.com/office/drawing/2016/5/9/chartex" xmlns:cx4="http://schemas.microsoft.com/office/drawing/2016/5/10/chartex" xmlns:cx5="http://schemas.microsoft.com/office/drawing/2016/5/11/chartex" xmlns:cx6="http://schemas.microsoft.com/office/drawing/2016/5/12/chartex" xmlns:cx7="http://schemas.microsoft.com/office/drawing/2016/5/13/chartex" xmlns:cx8="http://schemas.microsoft.com/office/drawing/2016/5/14/chartex" xmlns:mc="http://schemas.openxmlformats.org/markup-compatibility/2006" xmlns:aink="http://schemas.microsoft.com/office/drawing/2016/ink" xmlns:am3d="http://schemas.microsoft.com/office/drawing/2017/model3d" xmlns:o="urn:schemas-microsoft-com:office:office" xmlns:oel="http://schemas.microsoft.com/office/2019/extlst" xmlns:r="http://schemas.openxmlformats.org/officeDocument/2006/relationships" xmlns:m="http://schemas.openxmlformats.org/officeDocument/2006/math" xmlns:v="urn:schemas-microsoft-com:vml" xmlns:wp14="http://schemas.microsoft.com/office/word/2010/wordprocessingDrawing" xmlns:wp="http://schemas.openxmlformats.org/drawingml/2006/wordprocessingDrawing" xmlns:w10="urn:schemas-microsoft-com:office:word" xmlns:w="http://schemas.openxmlformats.org/wordprocessingml/2006/main" xmlns:w14="http://schemas.microsoft.com/office/word/2010/wordml" xmlns:w15="http://schemas.microsoft.com/office/word/2012/wordml" xmlns:w16cex="http://schemas.microsoft.com/office/word/2018/wordml/cex" xmlns:w16cid="http://schemas.microsoft.com/office/word/2016/wordml/cid" xmlns:w16="http://schemas.microsoft.com/office/word/2018/wordml" xmlns:w16du="http://schemas.microsoft.com/office/word/2023/wordml/word16du" xmlns:w16sdtdh="http://schemas.microsoft.com/office/word/2020/wordml/sdtdatahash" xmlns:w16sdtfl="http://schemas.microsoft.com/office/word/2024/wordml/sdtformatlock" xmlns:w16se="http://schemas.microsoft.com/office/word/2015/wordml/symex" xmlns:wpg="http://schemas.microsoft.com/office/word/2010/wordprocessingGroup" xmlns:wpi="http://schemas.microsoft.com/office/word/2010/wordprocessingInk" xmlns:wne="http://schemas.microsoft.com/office/word/2006/wordml" xmlns:wps="http://schemas.microsoft.com/office/word/2010/wordprocessingShape" mc:Ignorable="w14 w15 w16se w16cid w16 w16cex w16sdtdh w16sdtfl w16du wp14">
+<w:hdr xmlns:wpc="http://schemas.microsoft.com/office/word/2010/wordprocessingCanvas" xmlns:cx="http://schemas.microsoft.com/office/drawing/2014/chartex" xmlns:cx1="http://schemas.microsoft.com/office/drawing/2015/9/8/chartex" xmlns:cx2="http://schemas.microsoft.com/office/drawing/2015/10/21/chartex" xmlns:cx3="http://schemas.microsoft.com/office/drawing/2016/5/9/chartex" xmlns:cx4="http://schemas.microsoft.com/office/drawing/2016/5/10/chartex" xmlns:cx5="http://schemas.microsoft.com/office/drawing/2016/5/11/chartex" xmlns:cx6="http://schemas.microsoft.com/office/drawing/2016/5/12/chartex" xmlns:cx7="http://schemas.microsoft.com/office/drawing/2016/5/13/chartex" xmlns:cx8="http://schemas.microsoft.com/office/drawing/2016/5/14/chartex" xmlns:mc="http://schemas.openxmlformats.org/markup-compatibility/2006" xmlns:aink="http://schemas.microsoft.com/office/drawing/2016/ink" xmlns:am3d="http://schemas.microsoft.com/office/drawing/2017/model3d" xmlns:o="urn:schemas-microsoft-com:office:office" xmlns:oel="http://schemas.microsoft.com/office/2019/extlst" xmlns:r="http://schemas.openxmlformats.org/officeDocument/2006/relationships" xmlns:m="http://schemas.openxmlformats.org/officeDocument/2006/math" xmlns:v="urn:schemas-microsoft-com:vml" xmlns:wp14="http://schemas.microsoft.com/office/word/2010/wordprocessingDrawing" xmlns:wp="http://schemas.openxmlformats.org/drawingml/2006/wordprocessingDrawing" xmlns:w10="urn:schemas-microsoft-com:office:word" xmlns:w="http://schemas.openxmlformats.org/wordprocessingml/2006/main" xmlns:w14="http://schemas.microsoft.com/office/word/2010/wordml" xmlns:w15="http://schemas.microsoft.com/office/word/2012/wordml" xmlns:w16cei="http://schemas.microsoft.com/office/word/2026/wordml/cei" xmlns:w16cex="http://schemas.microsoft.com/office/word/2018/wordml/cex" xmlns:w16cid="http://schemas.microsoft.com/office/word/2016/wordml/cid" xmlns:w16="http://schemas.microsoft.com/office/word/2018/wordml" xmlns:w16du="http://schemas.microsoft.com/office/word/2023/wordml/word16du" xmlns:w16sdtdh="http://schemas.microsoft.com/office/word/2020/wordml/sdtdatahash" xmlns:w16sdtfl="http://schemas.microsoft.com/office/word/2024/wordml/sdtformatlock" xmlns:w16se="http://schemas.microsoft.com/office/word/2015/wordml/symex" xmlns:wpg="http://schemas.microsoft.com/office/word/2010/wordprocessingGroup" xmlns:wpi="http://schemas.microsoft.com/office/word/2010/wordprocessingInk" xmlns:wne="http://schemas.microsoft.com/office/word/2006/wordml" xmlns:wps="http://schemas.microsoft.com/office/word/2010/wordprocessingShape" mc:Ignorable="w14 w15 w16se w16cid w16 w16cex w16sdtdh w16sdtfl w16du wp14">
   <w:tbl>
     <w:tblPr>
       <w:tblW w:w="10080" w:type="dxa"/>
@@ -26106,7 +25387,7 @@
         <w:left w:w="10" w:type="dxa"/>
         <w:right w:w="10" w:type="dxa"/>
       </w:tblCellMar>
-      <w:tblLook w:val="04A0" w:firstRow="1" w:lastRow="0" w:firstColumn="1" w:lastColumn="0" w:noHBand="0" w:noVBand="1"/>
+      <w:tblLook w:val="0000" w:firstRow="0" w:lastRow="0" w:firstColumn="0" w:lastColumn="0" w:noHBand="0" w:noVBand="0"/>
     </w:tblPr>
     <w:tblGrid>
       <w:gridCol w:w="5040"/>
@@ -26172,12 +25453,12 @@
 </file>
 
 <file path=word/numbering.xml><?xml version="1.0" encoding="utf-8"?>
-<w:numbering xmlns:wpc="http://schemas.microsoft.com/office/word/2010/wordprocessingCanvas" xmlns:cx="http://schemas.microsoft.com/office/drawing/2014/chartex" xmlns:cx1="http://schemas.microsoft.com/office/drawing/2015/9/8/chartex" xmlns:cx2="http://schemas.microsoft.com/office/drawing/2015/10/21/chartex" xmlns:cx3="http://schemas.microsoft.com/office/drawing/2016/5/9/chartex" xmlns:cx4="http://schemas.microsoft.com/office/drawing/2016/5/10/chartex" xmlns:cx5="http://schemas.microsoft.com/office/drawing/2016/5/11/chartex" xmlns:cx6="http://schemas.microsoft.com/office/drawing/2016/5/12/chartex" xmlns:cx7="http://schemas.microsoft.com/office/drawing/2016/5/13/chartex" xmlns:cx8="http://schemas.microsoft.com/office/drawing/2016/5/14/chartex" xmlns:mc="http://schemas.openxmlformats.org/markup-compatibility/2006" xmlns:aink="http://schemas.microsoft.com/office/drawing/2016/ink" xmlns:am3d="http://schemas.microsoft.com/office/drawing/2017/model3d" xmlns:o="urn:schemas-microsoft-com:office:office" xmlns:oel="http://schemas.microsoft.com/office/2019/extlst" xmlns:r="http://schemas.openxmlformats.org/officeDocument/2006/relationships" xmlns:m="http://schemas.openxmlformats.org/officeDocument/2006/math" xmlns:v="urn:schemas-microsoft-com:vml" xmlns:wp14="http://schemas.microsoft.com/office/word/2010/wordprocessingDrawing" xmlns:wp="http://schemas.openxmlformats.org/drawingml/2006/wordprocessingDrawing" xmlns:w10="urn:schemas-microsoft-com:office:word" xmlns:w="http://schemas.openxmlformats.org/wordprocessingml/2006/main" xmlns:w14="http://schemas.microsoft.com/office/word/2010/wordml" xmlns:w15="http://schemas.microsoft.com/office/word/2012/wordml" xmlns:w16cex="http://schemas.microsoft.com/office/word/2018/wordml/cex" xmlns:w16cid="http://schemas.microsoft.com/office/word/2016/wordml/cid" xmlns:w16="http://schemas.microsoft.com/office/word/2018/wordml" xmlns:w16du="http://schemas.microsoft.com/office/word/2023/wordml/word16du" xmlns:w16sdtdh="http://schemas.microsoft.com/office/word/2020/wordml/sdtdatahash" xmlns:w16sdtfl="http://schemas.microsoft.com/office/word/2024/wordml/sdtformatlock" xmlns:w16se="http://schemas.microsoft.com/office/word/2015/wordml/symex" xmlns:wpg="http://schemas.microsoft.com/office/word/2010/wordprocessingGroup" xmlns:wpi="http://schemas.microsoft.com/office/word/2010/wordprocessingInk" xmlns:wne="http://schemas.microsoft.com/office/word/2006/wordml" xmlns:wps="http://schemas.microsoft.com/office/word/2010/wordprocessingShape" mc:Ignorable="w14 w15 w16se w16cid w16 w16cex w16sdtdh w16sdtfl w16du wp14">
+<w:numbering xmlns:wpc="http://schemas.microsoft.com/office/word/2010/wordprocessingCanvas" xmlns:cx="http://schemas.microsoft.com/office/drawing/2014/chartex" xmlns:cx1="http://schemas.microsoft.com/office/drawing/2015/9/8/chartex" xmlns:cx2="http://schemas.microsoft.com/office/drawing/2015/10/21/chartex" xmlns:cx3="http://schemas.microsoft.com/office/drawing/2016/5/9/chartex" xmlns:cx4="http://schemas.microsoft.com/office/drawing/2016/5/10/chartex" xmlns:cx5="http://schemas.microsoft.com/office/drawing/2016/5/11/chartex" xmlns:cx6="http://schemas.microsoft.com/office/drawing/2016/5/12/chartex" xmlns:cx7="http://schemas.microsoft.com/office/drawing/2016/5/13/chartex" xmlns:cx8="http://schemas.microsoft.com/office/drawing/2016/5/14/chartex" xmlns:mc="http://schemas.openxmlformats.org/markup-compatibility/2006" xmlns:aink="http://schemas.microsoft.com/office/drawing/2016/ink" xmlns:am3d="http://schemas.microsoft.com/office/drawing/2017/model3d" xmlns:o="urn:schemas-microsoft-com:office:office" xmlns:oel="http://schemas.microsoft.com/office/2019/extlst" xmlns:r="http://schemas.openxmlformats.org/officeDocument/2006/relationships" xmlns:m="http://schemas.openxmlformats.org/officeDocument/2006/math" xmlns:v="urn:schemas-microsoft-com:vml" xmlns:wp14="http://schemas.microsoft.com/office/word/2010/wordprocessingDrawing" xmlns:wp="http://schemas.openxmlformats.org/drawingml/2006/wordprocessingDrawing" xmlns:w10="urn:schemas-microsoft-com:office:word" xmlns:w="http://schemas.openxmlformats.org/wordprocessingml/2006/main" xmlns:w14="http://schemas.microsoft.com/office/word/2010/wordml" xmlns:w15="http://schemas.microsoft.com/office/word/2012/wordml" xmlns:w16cei="http://schemas.microsoft.com/office/word/2026/wordml/cei" xmlns:w16cex="http://schemas.microsoft.com/office/word/2018/wordml/cex" xmlns:w16cid="http://schemas.microsoft.com/office/word/2016/wordml/cid" xmlns:w16="http://schemas.microsoft.com/office/word/2018/wordml" xmlns:w16du="http://schemas.microsoft.com/office/word/2023/wordml/word16du" xmlns:w16sdtdh="http://schemas.microsoft.com/office/word/2020/wordml/sdtdatahash" xmlns:w16sdtfl="http://schemas.microsoft.com/office/word/2024/wordml/sdtformatlock" xmlns:w16se="http://schemas.microsoft.com/office/word/2015/wordml/symex" xmlns:wpg="http://schemas.microsoft.com/office/word/2010/wordprocessingGroup" xmlns:wpi="http://schemas.microsoft.com/office/word/2010/wordprocessingInk" xmlns:wne="http://schemas.microsoft.com/office/word/2006/wordml" xmlns:wps="http://schemas.microsoft.com/office/word/2010/wordprocessingShape" mc:Ignorable="w14 w15 w16se w16cid w16 w16cex w16sdtdh w16sdtfl w16du wp14">
   <w:abstractNum w:abstractNumId="0" w15:restartNumberingAfterBreak="0">
-    <w:nsid w:val="689B4CD5"/>
+    <w:nsid w:val="76667BF3"/>
     <w:multiLevelType w:val="hybridMultilevel"/>
-    <w:tmpl w:val="7418382E"/>
-    <w:lvl w:ilvl="0" w:tplc="CDB40CBE">
+    <w:tmpl w:val="F4307010"/>
+    <w:lvl w:ilvl="0" w:tplc="780E4630">
       <w:start w:val="1"/>
       <w:numFmt w:val="bullet"/>
       <w:lvlText w:val="●"/>
@@ -26186,7 +25467,7 @@
         <w:ind w:left="720" w:hanging="360"/>
       </w:pPr>
     </w:lvl>
-    <w:lvl w:ilvl="1" w:tplc="282218B0">
+    <w:lvl w:ilvl="1" w:tplc="2A184906">
       <w:start w:val="1"/>
       <w:numFmt w:val="bullet"/>
       <w:lvlText w:val="○"/>
@@ -26195,7 +25476,7 @@
         <w:ind w:left="1440" w:hanging="360"/>
       </w:pPr>
     </w:lvl>
-    <w:lvl w:ilvl="2" w:tplc="74905880">
+    <w:lvl w:ilvl="2" w:tplc="F996A752">
       <w:start w:val="1"/>
       <w:numFmt w:val="bullet"/>
       <w:lvlText w:val="■"/>
@@ -26204,7 +25485,7 @@
         <w:ind w:left="2160" w:hanging="360"/>
       </w:pPr>
     </w:lvl>
-    <w:lvl w:ilvl="3" w:tplc="B07CF950">
+    <w:lvl w:ilvl="3" w:tplc="65EC7F00">
       <w:start w:val="1"/>
       <w:numFmt w:val="bullet"/>
       <w:lvlText w:val="●"/>
@@ -26213,7 +25494,7 @@
         <w:ind w:left="2880" w:hanging="360"/>
       </w:pPr>
     </w:lvl>
-    <w:lvl w:ilvl="4" w:tplc="2AC8C1AC">
+    <w:lvl w:ilvl="4" w:tplc="B3E880BA">
       <w:start w:val="1"/>
       <w:numFmt w:val="bullet"/>
       <w:lvlText w:val="○"/>
@@ -26222,7 +25503,7 @@
         <w:ind w:left="3600" w:hanging="360"/>
       </w:pPr>
     </w:lvl>
-    <w:lvl w:ilvl="5" w:tplc="700E61B4">
+    <w:lvl w:ilvl="5" w:tplc="CF8E20DA">
       <w:start w:val="1"/>
       <w:numFmt w:val="bullet"/>
       <w:lvlText w:val="■"/>
@@ -26231,7 +25512,7 @@
         <w:ind w:left="4320" w:hanging="360"/>
       </w:pPr>
     </w:lvl>
-    <w:lvl w:ilvl="6" w:tplc="8F6E1A20">
+    <w:lvl w:ilvl="6" w:tplc="8FE6DD9C">
       <w:start w:val="1"/>
       <w:numFmt w:val="bullet"/>
       <w:lvlText w:val="●"/>
@@ -26240,7 +25521,7 @@
         <w:ind w:left="5040" w:hanging="360"/>
       </w:pPr>
     </w:lvl>
-    <w:lvl w:ilvl="7" w:tplc="96826A22">
+    <w:lvl w:ilvl="7" w:tplc="34A63C9E">
       <w:start w:val="1"/>
       <w:numFmt w:val="bullet"/>
       <w:lvlText w:val="●"/>
@@ -26249,7 +25530,7 @@
         <w:ind w:left="5760" w:hanging="360"/>
       </w:pPr>
     </w:lvl>
-    <w:lvl w:ilvl="8" w:tplc="1FC4EC64">
+    <w:lvl w:ilvl="8" w:tplc="CEFE704E">
       <w:start w:val="1"/>
       <w:numFmt w:val="bullet"/>
       <w:lvlText w:val="●"/>
@@ -26259,7 +25540,7 @@
       </w:pPr>
     </w:lvl>
   </w:abstractNum>
-  <w:num w:numId="1" w16cid:durableId="996882555">
+  <w:num w:numId="1" w16cid:durableId="2119907598">
     <w:abstractNumId w:val="0"/>
     <w:lvlOverride w:ilvl="0">
       <w:startOverride w:val="1"/>

</xml_diff>

<commit_message>
docs: correct primer §7.3 object kill char (/ -> _); fix stale §7.4 plan note
The APRS Theory & Operations Primer §7.3 was self-contradictory on the object
live/killed indicator: one sentence correctly said "_", two others wrongly said
"/". Corrected both to "_" (verified against the code, Dire Wolf, and APRS101
§11 — a killed object/item uses "_", never "/"). Regenerated the PDF to match.

Also fixed a stale note in APRS_SPEC_CONFORMANCE_PLAN.md that claimed primer §7.4
still had the wrong area-object formula (× 1500) — the primer already reads
× 0.01 (= value²/100), matching AprsAreaObjectEncoder.

Co-Authored-By: Claude Opus 4.8 <noreply@anthropic.com>
</commit_message>
<xml_diff>
--- a/docs/APRS_Theory_and_Operations_Primer.docx
+++ b/docs/APRS_Theory_and_Operations_Primer.docx
@@ -9546,7 +9546,7 @@
           <w:sz w:val="22"/>
           <w:szCs w:val="22"/>
         </w:rPr>
-        <w:t xml:space="preserve"> exactly 9 characters, padded with spaces. The asterisk (*) means the object is "live" — a slash would indicate a killed (removed) object. The remaining fields are identical to a position packet: timestamp, coordinates, symbol, and comment.</w:t>
+        <w:t xml:space="preserve"> exactly 9 characters, padded with spaces. The asterisk (*) means the object is "live" — an underscore (_) would indicate a killed (removed) object. The remaining fields are identical to a position packet: timestamp, coordinates, symbol, and comment.</w:t>
       </w:r>
     </w:p>
     <w:p>
@@ -21650,7 +21650,7 @@
                 <w:sz w:val="21"/>
                 <w:szCs w:val="21"/>
               </w:rPr>
-              <w:t>Kill all objects when the event ends by re-transmitting with / in the live field.</w:t>
+              <w:t>Kill all objects when the event ends by re-transmitting with _ in the live/killed field.</w:t>
             </w:r>
           </w:p>
         </w:tc>

</xml_diff>